<commit_message>
new files and examples
new examples of numbers and cocepts as ZEROES SPACES
</commit_message>
<xml_diff>
--- a/Teoria/03 Variables Constantes Tipos de datos/03 Variables Constantes Tipos de datos.docx
+++ b/Teoria/03 Variables Constantes Tipos de datos/03 Variables Constantes Tipos de datos.docx
@@ -189,27 +189,7 @@
           <w:szCs w:val="20"/>
           <w:lang w:eastAsia="es-CO"/>
         </w:rPr>
-        <w:t xml:space="preserve">01 NOMBRE PIC </w:t>
-      </w:r>
-      <w:proofErr w:type="gramStart"/>
-      <w:r>
-        <w:rPr>
-          <w:rFonts w:ascii="Courier New" w:eastAsia="Times New Roman" w:hAnsi="Courier New" w:cs="Courier New"/>
-          <w:sz w:val="20"/>
-          <w:szCs w:val="20"/>
-          <w:lang w:eastAsia="es-CO"/>
-        </w:rPr>
-        <w:t>A(</w:t>
-      </w:r>
-      <w:proofErr w:type="gramEnd"/>
-      <w:r>
-        <w:rPr>
-          <w:rFonts w:ascii="Courier New" w:eastAsia="Times New Roman" w:hAnsi="Courier New" w:cs="Courier New"/>
-          <w:sz w:val="20"/>
-          <w:szCs w:val="20"/>
-          <w:lang w:eastAsia="es-CO"/>
-        </w:rPr>
-        <w:t>20).</w:t>
+        <w:t>01 NOMBRE PIC A(20).</w:t>
       </w:r>
       <w:r>
         <w:rPr>
@@ -768,27 +748,7 @@
           <w:lang w:eastAsia="es-CO"/>
         </w:rPr>
         <w:lastRenderedPageBreak/>
-        <w:t xml:space="preserve">01 NOMBRE PIC </w:t>
-      </w:r>
-      <w:proofErr w:type="gramStart"/>
-      <w:r>
-        <w:rPr>
-          <w:rFonts w:ascii="Courier New" w:eastAsia="Times New Roman" w:hAnsi="Courier New" w:cs="Courier New"/>
-          <w:sz w:val="20"/>
-          <w:szCs w:val="20"/>
-          <w:lang w:eastAsia="es-CO"/>
-        </w:rPr>
-        <w:t>X(</w:t>
-      </w:r>
-      <w:proofErr w:type="gramEnd"/>
-      <w:r>
-        <w:rPr>
-          <w:rFonts w:ascii="Courier New" w:eastAsia="Times New Roman" w:hAnsi="Courier New" w:cs="Courier New"/>
-          <w:sz w:val="20"/>
-          <w:szCs w:val="20"/>
-          <w:lang w:eastAsia="es-CO"/>
-        </w:rPr>
-        <w:t>20).</w:t>
+        <w:t>01 NOMBRE PIC X(20).</w:t>
       </w:r>
       <w:r>
         <w:rPr>
@@ -992,27 +952,7 @@
           <w:lang w:eastAsia="es-CO"/>
         </w:rPr>
         <w:br/>
-        <w:t xml:space="preserve">01 MENSAJE-SALUDO PIC </w:t>
-      </w:r>
-      <w:proofErr w:type="gramStart"/>
-      <w:r>
-        <w:rPr>
-          <w:rFonts w:ascii="Courier New" w:eastAsia="Times New Roman" w:hAnsi="Courier New" w:cs="Courier New"/>
-          <w:sz w:val="20"/>
-          <w:szCs w:val="20"/>
-          <w:lang w:eastAsia="es-CO"/>
-        </w:rPr>
-        <w:t>X(</w:t>
-      </w:r>
-      <w:proofErr w:type="gramEnd"/>
-      <w:r>
-        <w:rPr>
-          <w:rFonts w:ascii="Courier New" w:eastAsia="Times New Roman" w:hAnsi="Courier New" w:cs="Courier New"/>
-          <w:sz w:val="20"/>
-          <w:szCs w:val="20"/>
-          <w:lang w:eastAsia="es-CO"/>
-        </w:rPr>
-        <w:t>20) VALUE "HOLA".</w:t>
+        <w:t>01 MENSAJE-SALUDO PIC X(20) VALUE "HOLA".</w:t>
       </w:r>
     </w:p>
     <w:p>
@@ -1438,27 +1378,7 @@
           <w:szCs w:val="20"/>
           <w:lang w:eastAsia="es-CO"/>
         </w:rPr>
-        <w:t xml:space="preserve">01 NOMBRE PIC </w:t>
-      </w:r>
-      <w:proofErr w:type="gramStart"/>
-      <w:r>
-        <w:rPr>
-          <w:rFonts w:ascii="Courier New" w:eastAsia="Times New Roman" w:hAnsi="Courier New" w:cs="Courier New"/>
-          <w:sz w:val="20"/>
-          <w:szCs w:val="20"/>
-          <w:lang w:eastAsia="es-CO"/>
-        </w:rPr>
-        <w:t>X(</w:t>
-      </w:r>
-      <w:proofErr w:type="gramEnd"/>
-      <w:r>
-        <w:rPr>
-          <w:rFonts w:ascii="Courier New" w:eastAsia="Times New Roman" w:hAnsi="Courier New" w:cs="Courier New"/>
-          <w:sz w:val="20"/>
-          <w:szCs w:val="20"/>
-          <w:lang w:eastAsia="es-CO"/>
-        </w:rPr>
-        <w:t>20) VALUE "CARLOS".</w:t>
+        <w:t>01 NOMBRE PIC X(20) VALUE "CARLOS".</w:t>
       </w:r>
       <w:r>
         <w:rPr>
@@ -1676,15 +1596,7 @@
       </w:r>
       <w:r>
         <w:br/>
-        <w:t xml:space="preserve">   05 NOMBRE PIC </w:t>
-      </w:r>
-      <w:proofErr w:type="gramStart"/>
-      <w:r>
-        <w:t>X(</w:t>
-      </w:r>
-      <w:proofErr w:type="gramEnd"/>
-      <w:r>
-        <w:t>20).</w:t>
+        <w:t xml:space="preserve">   05 NOMBRE PIC X(20).</w:t>
       </w:r>
       <w:r>
         <w:br/>
@@ -1778,15 +1690,7 @@
       </w:r>
       <w:r>
         <w:br/>
-        <w:t xml:space="preserve">      10 NOMBRE PIC </w:t>
-      </w:r>
-      <w:proofErr w:type="gramStart"/>
-      <w:r>
-        <w:t>X(</w:t>
-      </w:r>
-      <w:proofErr w:type="gramEnd"/>
-      <w:r>
-        <w:t>20).</w:t>
+        <w:t xml:space="preserve">      10 NOMBRE PIC X(20).</w:t>
       </w:r>
       <w:r>
         <w:br/>
@@ -2424,15 +2328,7 @@
         <w:pStyle w:val="Ttulo1"/>
       </w:pPr>
       <w:r>
-        <w:t xml:space="preserve">PIC (Picture </w:t>
-      </w:r>
-      <w:proofErr w:type="spellStart"/>
-      <w:r>
-        <w:t>Clause</w:t>
-      </w:r>
-      <w:proofErr w:type="spellEnd"/>
-      <w:r>
-        <w:t>) en COBOL</w:t>
+        <w:t>PIC (Picture Clause) en COBOL</w:t>
       </w:r>
     </w:p>
     <w:p>
@@ -2596,25 +2492,14 @@
           <w:lang w:eastAsia="es-CO"/>
         </w:rPr>
       </w:pPr>
-      <w:proofErr w:type="gramStart"/>
-      <w:r>
-        <w:rPr>
-          <w:rFonts w:ascii="Courier New" w:eastAsia="Times New Roman" w:hAnsi="Courier New" w:cs="Courier New"/>
-          <w:sz w:val="20"/>
-          <w:szCs w:val="20"/>
-          <w:lang w:eastAsia="es-CO"/>
-        </w:rPr>
-        <w:t>01  NOMBRE</w:t>
-      </w:r>
-      <w:proofErr w:type="gramEnd"/>
-      <w:r>
-        <w:rPr>
-          <w:rFonts w:ascii="Courier New" w:eastAsia="Times New Roman" w:hAnsi="Courier New" w:cs="Courier New"/>
-          <w:sz w:val="20"/>
-          <w:szCs w:val="20"/>
-          <w:lang w:eastAsia="es-CO"/>
-        </w:rPr>
-        <w:t xml:space="preserve">        PIC A(20).</w:t>
+      <w:r>
+        <w:rPr>
+          <w:rFonts w:ascii="Courier New" w:eastAsia="Times New Roman" w:hAnsi="Courier New" w:cs="Courier New"/>
+          <w:sz w:val="20"/>
+          <w:szCs w:val="20"/>
+          <w:lang w:eastAsia="es-CO"/>
+        </w:rPr>
+        <w:t>01  NOMBRE        PIC A(20).</w:t>
       </w:r>
       <w:r>
         <w:rPr>
@@ -2681,27 +2566,7 @@
           <w:szCs w:val="20"/>
           <w:lang w:eastAsia="es-CO"/>
         </w:rPr>
-        <w:t xml:space="preserve">PIC </w:t>
-      </w:r>
-      <w:proofErr w:type="gramStart"/>
-      <w:r>
-        <w:rPr>
-          <w:rFonts w:ascii="Courier New" w:eastAsia="Times New Roman" w:hAnsi="Courier New" w:cs="Courier New"/>
-          <w:sz w:val="20"/>
-          <w:szCs w:val="20"/>
-          <w:lang w:eastAsia="es-CO"/>
-        </w:rPr>
-        <w:t>A(</w:t>
-      </w:r>
-      <w:proofErr w:type="gramEnd"/>
-      <w:r>
-        <w:rPr>
-          <w:rFonts w:ascii="Courier New" w:eastAsia="Times New Roman" w:hAnsi="Courier New" w:cs="Courier New"/>
-          <w:sz w:val="20"/>
-          <w:szCs w:val="20"/>
-          <w:lang w:eastAsia="es-CO"/>
-        </w:rPr>
-        <w:t>20)</w:t>
+        <w:t>PIC A(20)</w:t>
       </w:r>
       <w:r>
         <w:rPr>
@@ -3304,15 +3169,7 @@
         <w:pStyle w:val="HTMLconformatoprevio"/>
       </w:pPr>
       <w:r>
-        <w:t xml:space="preserve">01 NOMBRE PIC </w:t>
-      </w:r>
-      <w:proofErr w:type="gramStart"/>
-      <w:r>
-        <w:t>X(</w:t>
-      </w:r>
-      <w:proofErr w:type="gramEnd"/>
-      <w:r>
-        <w:t>20).</w:t>
+        <w:t>01 NOMBRE PIC X(20).</w:t>
       </w:r>
     </w:p>
     <w:p>
@@ -3365,15 +3222,7 @@
         <w:pStyle w:val="HTMLconformatoprevio"/>
       </w:pPr>
       <w:r>
-        <w:t xml:space="preserve">01 INICIALES PIC </w:t>
-      </w:r>
-      <w:proofErr w:type="gramStart"/>
-      <w:r>
-        <w:t>A(</w:t>
-      </w:r>
-      <w:proofErr w:type="gramEnd"/>
-      <w:r>
-        <w:t>3).</w:t>
+        <w:t>01 INICIALES PIC A(3).</w:t>
       </w:r>
     </w:p>
     <w:p>
@@ -3787,15 +3636,7 @@
         <w:pStyle w:val="HTMLconformatoprevio"/>
       </w:pPr>
       <w:r>
-        <w:t xml:space="preserve">01 NOMBRE PIC </w:t>
-      </w:r>
-      <w:proofErr w:type="gramStart"/>
-      <w:r>
-        <w:t>X(</w:t>
-      </w:r>
-      <w:proofErr w:type="gramEnd"/>
-      <w:r>
-        <w:t>10) VALUE "JUAN".</w:t>
+        <w:t>01 NOMBRE PIC X(10) VALUE "JUAN".</w:t>
       </w:r>
     </w:p>
     <w:p>
@@ -3819,21 +3660,7 @@
         <w:rPr>
           <w:rStyle w:val="CdigoHTML"/>
         </w:rPr>
-        <w:t xml:space="preserve">PIC </w:t>
-      </w:r>
-      <w:proofErr w:type="gramStart"/>
-      <w:r>
-        <w:rPr>
-          <w:rStyle w:val="CdigoHTML"/>
-        </w:rPr>
-        <w:t>X(</w:t>
-      </w:r>
-      <w:proofErr w:type="gramEnd"/>
-      <w:r>
-        <w:rPr>
-          <w:rStyle w:val="CdigoHTML"/>
-        </w:rPr>
-        <w:t>10)</w:t>
+        <w:t>PIC X(10)</w:t>
       </w:r>
       <w:r>
         <w:t xml:space="preserve"> → cadena alfanumérica de 10 caracteres</w:t>
@@ -4568,15 +4395,7 @@
         <w:pStyle w:val="Ttulo1"/>
       </w:pPr>
       <w:r>
-        <w:t>3. COMP-3 (</w:t>
-      </w:r>
-      <w:proofErr w:type="spellStart"/>
-      <w:r>
-        <w:t>Packed</w:t>
-      </w:r>
-      <w:proofErr w:type="spellEnd"/>
-      <w:r>
-        <w:t xml:space="preserve"> Decimal)</w:t>
+        <w:t>3. COMP-3 (Packed Decimal)</w:t>
       </w:r>
     </w:p>
     <w:p>
@@ -4667,15 +4486,7 @@
         <w:pStyle w:val="NormalWeb"/>
       </w:pPr>
       <w:r>
-        <w:t xml:space="preserve">El último </w:t>
-      </w:r>
-      <w:proofErr w:type="spellStart"/>
-      <w:r>
-        <w:t>nibble</w:t>
-      </w:r>
-      <w:proofErr w:type="spellEnd"/>
-      <w:r>
-        <w:t xml:space="preserve"> contiene el </w:t>
+        <w:t xml:space="preserve">El último nibble contiene el </w:t>
       </w:r>
       <w:r>
         <w:rPr>
@@ -5041,49 +4852,27 @@
         <w:pStyle w:val="Ttulo2"/>
       </w:pPr>
       <w:r>
-        <w:t xml:space="preserve">EJEMPLO DE DEFINICION DE CONSTANTES Y USO DE </w:t>
-      </w:r>
-      <w:proofErr w:type="spellStart"/>
-      <w:r>
-        <w:t>DISPLAYFinal</w:t>
-      </w:r>
-      <w:proofErr w:type="spellEnd"/>
-      <w:r>
-        <w:t xml:space="preserve"> del formulario</w:t>
-      </w:r>
-    </w:p>
-    <w:p>
-      <w:pPr>
-        <w:rPr>
-          <w:lang w:eastAsia="es-CO"/>
-        </w:rPr>
-      </w:pPr>
-    </w:p>
-    <w:p>
-      <w:pPr>
-        <w:rPr>
-          <w:lang w:eastAsia="es-CO"/>
-        </w:rPr>
-      </w:pPr>
-      <w:r>
-        <w:rPr>
-          <w:lang w:eastAsia="es-CO"/>
-        </w:rPr>
-        <w:t xml:space="preserve">En el siguiente ejemplo se muestra </w:t>
-      </w:r>
-      <w:proofErr w:type="spellStart"/>
-      <w:r>
-        <w:rPr>
-          <w:lang w:eastAsia="es-CO"/>
-        </w:rPr>
-        <w:t>como</w:t>
-      </w:r>
-      <w:proofErr w:type="spellEnd"/>
-      <w:r>
-        <w:rPr>
-          <w:lang w:eastAsia="es-CO"/>
-        </w:rPr>
-        <w:t xml:space="preserve"> se definen constantes</w:t>
+        <w:t>EJEMPLO DE DEFINICION DE CONSTANTES Y USO DE DISPLAYFinal del formulario</w:t>
+      </w:r>
+    </w:p>
+    <w:p>
+      <w:pPr>
+        <w:rPr>
+          <w:lang w:eastAsia="es-CO"/>
+        </w:rPr>
+      </w:pPr>
+    </w:p>
+    <w:p>
+      <w:pPr>
+        <w:rPr>
+          <w:lang w:eastAsia="es-CO"/>
+        </w:rPr>
+      </w:pPr>
+      <w:r>
+        <w:rPr>
+          <w:lang w:eastAsia="es-CO"/>
+        </w:rPr>
+        <w:t>En el siguiente ejemplo se muestra como se definen constantes</w:t>
       </w:r>
     </w:p>
     <w:p>
@@ -5293,20 +5082,8 @@
           <w:szCs w:val="20"/>
           <w:lang w:val="en-US" w:eastAsia="es-CO"/>
         </w:rPr>
-        <w:t xml:space="preserve">      * Tectonics: </w:t>
-      </w:r>
-      <w:proofErr w:type="spellStart"/>
-      <w:r>
-        <w:rPr>
-          <w:rFonts w:ascii="Courier New" w:eastAsia="Times New Roman" w:hAnsi="Courier New" w:cs="Courier New"/>
-          <w:color w:val="888888"/>
-          <w:sz w:val="20"/>
-          <w:szCs w:val="20"/>
-          <w:lang w:val="en-US" w:eastAsia="es-CO"/>
-        </w:rPr>
-        <w:t>cobc</w:t>
-      </w:r>
-      <w:proofErr w:type="spellEnd"/>
+        <w:t xml:space="preserve">      * Tectonics: cobc</w:t>
+      </w:r>
     </w:p>
     <w:p>
       <w:pPr>
@@ -5524,7 +5301,6 @@
         </w:rPr>
         <w:t xml:space="preserve"> </w:t>
       </w:r>
-      <w:proofErr w:type="spellStart"/>
       <w:r>
         <w:rPr>
           <w:rFonts w:ascii="Courier New" w:eastAsia="Times New Roman" w:hAnsi="Courier New" w:cs="Courier New"/>
@@ -5535,7 +5311,6 @@
         </w:rPr>
         <w:t>Tipos_datos</w:t>
       </w:r>
-      <w:proofErr w:type="spellEnd"/>
       <w:r>
         <w:rPr>
           <w:rFonts w:ascii="Courier New" w:eastAsia="Times New Roman" w:hAnsi="Courier New" w:cs="Courier New"/>
@@ -5878,7 +5653,6 @@
         </w:rPr>
         <w:t xml:space="preserve"> </w:t>
       </w:r>
-      <w:proofErr w:type="gramStart"/>
       <w:r>
         <w:rPr>
           <w:rFonts w:ascii="Courier New" w:eastAsia="Times New Roman" w:hAnsi="Courier New" w:cs="Courier New"/>
@@ -5901,7 +5675,6 @@
         </w:rPr>
         <w:t>SALUDO</w:t>
       </w:r>
-      <w:proofErr w:type="gramEnd"/>
       <w:r>
         <w:rPr>
           <w:rFonts w:ascii="Courier New" w:eastAsia="Times New Roman" w:hAnsi="Courier New" w:cs="Courier New"/>
@@ -6017,7 +5790,6 @@
         </w:rPr>
         <w:t xml:space="preserve"> </w:t>
       </w:r>
-      <w:proofErr w:type="gramStart"/>
       <w:r>
         <w:rPr>
           <w:rFonts w:ascii="Courier New" w:eastAsia="Times New Roman" w:hAnsi="Courier New" w:cs="Courier New"/>
@@ -6040,7 +5812,6 @@
         </w:rPr>
         <w:t>NUMERO</w:t>
       </w:r>
-      <w:proofErr w:type="gramEnd"/>
       <w:r>
         <w:rPr>
           <w:rFonts w:ascii="Courier New" w:eastAsia="Times New Roman" w:hAnsi="Courier New" w:cs="Courier New"/>
@@ -6167,7 +5938,6 @@
         </w:rPr>
         <w:t xml:space="preserve"> </w:t>
       </w:r>
-      <w:proofErr w:type="gramStart"/>
       <w:r>
         <w:rPr>
           <w:rFonts w:ascii="Courier New" w:eastAsia="Times New Roman" w:hAnsi="Courier New" w:cs="Courier New"/>
@@ -6190,7 +5960,6 @@
         </w:rPr>
         <w:t>TEXTO</w:t>
       </w:r>
-      <w:proofErr w:type="gramEnd"/>
       <w:r>
         <w:rPr>
           <w:rFonts w:ascii="Courier New" w:eastAsia="Times New Roman" w:hAnsi="Courier New" w:cs="Courier New"/>
@@ -6244,31 +6013,7 @@
           <w:shd w:val="clear" w:color="auto" w:fill="FFF0F0"/>
           <w:lang w:eastAsia="es-CO"/>
         </w:rPr>
-        <w:t>"</w:t>
-      </w:r>
-      <w:proofErr w:type="spellStart"/>
-      <w:r>
-        <w:rPr>
-          <w:rFonts w:ascii="Courier New" w:eastAsia="Times New Roman" w:hAnsi="Courier New" w:cs="Courier New"/>
-          <w:color w:val="333333"/>
-          <w:sz w:val="20"/>
-          <w:szCs w:val="20"/>
-          <w:shd w:val="clear" w:color="auto" w:fill="FFF0F0"/>
-          <w:lang w:eastAsia="es-CO"/>
-        </w:rPr>
-        <w:t>maximo</w:t>
-      </w:r>
-      <w:proofErr w:type="spellEnd"/>
-      <w:r>
-        <w:rPr>
-          <w:rFonts w:ascii="Courier New" w:eastAsia="Times New Roman" w:hAnsi="Courier New" w:cs="Courier New"/>
-          <w:color w:val="333333"/>
-          <w:sz w:val="20"/>
-          <w:szCs w:val="20"/>
-          <w:shd w:val="clear" w:color="auto" w:fill="FFF0F0"/>
-          <w:lang w:eastAsia="es-CO"/>
-        </w:rPr>
-        <w:t xml:space="preserve"> 31 caracteres"</w:t>
+        <w:t>"maximo 31 caracteres"</w:t>
       </w:r>
       <w:r>
         <w:rPr>
@@ -6330,7 +6075,6 @@
         </w:rPr>
         <w:t xml:space="preserve"> </w:t>
       </w:r>
-      <w:proofErr w:type="gramStart"/>
       <w:r>
         <w:rPr>
           <w:rFonts w:ascii="Courier New" w:eastAsia="Times New Roman" w:hAnsi="Courier New" w:cs="Courier New"/>
@@ -6353,7 +6097,6 @@
         </w:rPr>
         <w:t>SEGUNDO</w:t>
       </w:r>
-      <w:proofErr w:type="gramEnd"/>
       <w:r>
         <w:rPr>
           <w:rFonts w:ascii="Courier New" w:eastAsia="Times New Roman" w:hAnsi="Courier New" w:cs="Courier New"/>
@@ -7233,7 +6976,6 @@
         </w:rPr>
         <w:t xml:space="preserve"> </w:t>
       </w:r>
-      <w:proofErr w:type="spellStart"/>
       <w:r>
         <w:rPr>
           <w:rFonts w:ascii="Courier New" w:eastAsia="Times New Roman" w:hAnsi="Courier New" w:cs="Courier New"/>
@@ -7244,7 +6986,6 @@
         </w:rPr>
         <w:t>Tipos_datos</w:t>
       </w:r>
-      <w:proofErr w:type="spellEnd"/>
       <w:r>
         <w:rPr>
           <w:rFonts w:ascii="Courier New" w:eastAsia="Times New Roman" w:hAnsi="Courier New" w:cs="Courier New"/>
@@ -7272,77 +7013,7 @@
         <w:rPr>
           <w:lang w:eastAsia="es-CO"/>
         </w:rPr>
-        <w:t xml:space="preserve">efine las constantes en la </w:t>
-      </w:r>
-      <w:proofErr w:type="spellStart"/>
-      <w:r>
-        <w:rPr>
-          <w:lang w:eastAsia="es-CO"/>
-        </w:rPr>
-        <w:t>section</w:t>
-      </w:r>
-      <w:proofErr w:type="spellEnd"/>
-      <w:r>
-        <w:rPr>
-          <w:lang w:eastAsia="es-CO"/>
-        </w:rPr>
-        <w:t xml:space="preserve"> de </w:t>
-      </w:r>
-      <w:proofErr w:type="spellStart"/>
-      <w:r>
-        <w:rPr>
-          <w:lang w:eastAsia="es-CO"/>
-        </w:rPr>
-        <w:t>Working</w:t>
-      </w:r>
-      <w:proofErr w:type="spellEnd"/>
-      <w:r>
-        <w:rPr>
-          <w:lang w:eastAsia="es-CO"/>
-        </w:rPr>
-        <w:t xml:space="preserve"> </w:t>
-      </w:r>
-      <w:proofErr w:type="spellStart"/>
-      <w:r>
-        <w:rPr>
-          <w:lang w:eastAsia="es-CO"/>
-        </w:rPr>
-        <w:t>storage</w:t>
-      </w:r>
-      <w:proofErr w:type="spellEnd"/>
-      <w:r>
-        <w:rPr>
-          <w:lang w:eastAsia="es-CO"/>
-        </w:rPr>
-        <w:t xml:space="preserve">, no se </w:t>
-      </w:r>
-      <w:proofErr w:type="spellStart"/>
-      <w:r>
-        <w:rPr>
-          <w:lang w:eastAsia="es-CO"/>
-        </w:rPr>
-        <w:t>puedne</w:t>
-      </w:r>
-      <w:proofErr w:type="spellEnd"/>
-      <w:r>
-        <w:rPr>
-          <w:lang w:eastAsia="es-CO"/>
-        </w:rPr>
-        <w:t xml:space="preserve"> generar variables con </w:t>
-      </w:r>
-      <w:proofErr w:type="spellStart"/>
-      <w:r>
-        <w:rPr>
-          <w:lang w:eastAsia="es-CO"/>
-        </w:rPr>
-        <w:t>mas</w:t>
-      </w:r>
-      <w:proofErr w:type="spellEnd"/>
-      <w:r>
-        <w:rPr>
-          <w:lang w:eastAsia="es-CO"/>
-        </w:rPr>
-        <w:t xml:space="preserve"> de 31 caracteres, esto generaría un error, dependiendo la cantidad de caracteres se debe definir en la variable la cantidad a contener, para ello se puede hacer de dos maneras.</w:t>
+        <w:t>efine las constantes en la section de Working storage, no se puedne generar variables con mas de 31 caracteres, esto generaría un error, dependiendo la cantidad de caracteres se debe definir en la variable la cantidad a contener, para ello se puede hacer de dos maneras.</w:t>
       </w:r>
     </w:p>
     <w:p>
@@ -7405,7 +7076,6 @@
         </w:rPr>
         <w:t xml:space="preserve">   </w:t>
       </w:r>
-      <w:proofErr w:type="gramStart"/>
       <w:r>
         <w:rPr>
           <w:rFonts w:ascii="Courier New" w:eastAsia="Times New Roman" w:hAnsi="Courier New" w:cs="Courier New"/>
@@ -7428,7 +7098,6 @@
         </w:rPr>
         <w:t>SALUDO</w:t>
       </w:r>
-      <w:proofErr w:type="gramEnd"/>
       <w:r>
         <w:rPr>
           <w:rFonts w:ascii="Courier New" w:eastAsia="Times New Roman" w:hAnsi="Courier New" w:cs="Courier New"/>
@@ -7519,24 +7188,517 @@
         <w:rPr>
           <w:lang w:eastAsia="es-CO"/>
         </w:rPr>
-        <w:t xml:space="preserve">Para una palabra como hola se define que es un carácter y por ello entre </w:t>
-      </w:r>
-      <w:proofErr w:type="spellStart"/>
-      <w:r>
-        <w:rPr>
-          <w:lang w:eastAsia="es-CO"/>
-        </w:rPr>
-        <w:t>parensetis</w:t>
-      </w:r>
-      <w:proofErr w:type="spellEnd"/>
-      <w:r>
-        <w:rPr>
-          <w:lang w:eastAsia="es-CO"/>
-        </w:rPr>
-        <w:t xml:space="preserve"> se indica la cantidad de caracteres a implementar.</w:t>
-      </w:r>
-    </w:p>
-    <w:p>
+        <w:t>Para una palabra como hola se define que es un carácter y por ello entre parensetis se indica la cantidad de caracteres a implementar.</w:t>
+      </w:r>
+    </w:p>
+    <w:p>
+      <w:pPr>
+        <w:pStyle w:val="Prrafodelista"/>
+        <w:numPr>
+          <w:ilvl w:val="2"/>
+          <w:numId w:val="12"/>
+        </w:numPr>
+        <w:rPr>
+          <w:rFonts w:ascii="Courier New" w:eastAsia="Times New Roman" w:hAnsi="Courier New" w:cs="Courier New"/>
+          <w:color w:val="333333"/>
+          <w:sz w:val="20"/>
+          <w:szCs w:val="20"/>
+          <w:shd w:val="clear" w:color="auto" w:fill="FFF0F0"/>
+          <w:lang w:eastAsia="es-CO"/>
+        </w:rPr>
+      </w:pPr>
+      <w:r>
+        <w:rPr>
+          <w:rFonts w:ascii="Courier New" w:eastAsia="Times New Roman" w:hAnsi="Courier New" w:cs="Courier New"/>
+          <w:color w:val="996633"/>
+          <w:sz w:val="20"/>
+          <w:szCs w:val="20"/>
+          <w:lang w:eastAsia="es-CO"/>
+        </w:rPr>
+        <w:t>SALUDO</w:t>
+      </w:r>
+      <w:r>
+        <w:rPr>
+          <w:rFonts w:ascii="Courier New" w:eastAsia="Times New Roman" w:hAnsi="Courier New" w:cs="Courier New"/>
+          <w:color w:val="BBBBBB"/>
+          <w:sz w:val="20"/>
+          <w:szCs w:val="20"/>
+          <w:lang w:eastAsia="es-CO"/>
+        </w:rPr>
+        <w:t xml:space="preserve"> </w:t>
+      </w:r>
+      <w:r>
+        <w:rPr>
+          <w:rFonts w:ascii="Courier New" w:eastAsia="Times New Roman" w:hAnsi="Courier New" w:cs="Courier New"/>
+          <w:b/>
+          <w:bCs/>
+          <w:color w:val="333399"/>
+          <w:sz w:val="20"/>
+          <w:szCs w:val="20"/>
+          <w:lang w:eastAsia="es-CO"/>
+        </w:rPr>
+        <w:t>PIC X(4)</w:t>
+      </w:r>
+      <w:r>
+        <w:rPr>
+          <w:rFonts w:ascii="Courier New" w:eastAsia="Times New Roman" w:hAnsi="Courier New" w:cs="Courier New"/>
+          <w:color w:val="BBBBBB"/>
+          <w:sz w:val="20"/>
+          <w:szCs w:val="20"/>
+          <w:lang w:eastAsia="es-CO"/>
+        </w:rPr>
+        <w:t xml:space="preserve"> </w:t>
+      </w:r>
+      <w:r>
+        <w:rPr>
+          <w:rFonts w:ascii="Courier New" w:eastAsia="Times New Roman" w:hAnsi="Courier New" w:cs="Courier New"/>
+          <w:b/>
+          <w:bCs/>
+          <w:color w:val="003388"/>
+          <w:sz w:val="20"/>
+          <w:szCs w:val="20"/>
+          <w:lang w:eastAsia="es-CO"/>
+        </w:rPr>
+        <w:t xml:space="preserve">VALUE </w:t>
+      </w:r>
+      <w:r>
+        <w:rPr>
+          <w:rFonts w:ascii="Courier New" w:eastAsia="Times New Roman" w:hAnsi="Courier New" w:cs="Courier New"/>
+          <w:color w:val="333333"/>
+          <w:sz w:val="20"/>
+          <w:szCs w:val="20"/>
+          <w:shd w:val="clear" w:color="auto" w:fill="FFF0F0"/>
+          <w:lang w:eastAsia="es-CO"/>
+        </w:rPr>
+        <w:t>"</w:t>
+      </w:r>
+    </w:p>
+    <w:p/>
+    <w:p>
+      <w:pPr>
+        <w:pStyle w:val="Ttulo1"/>
+      </w:pPr>
+      <w:r>
+        <w:t>Caracteres de edición</w:t>
+      </w:r>
+    </w:p>
+    <w:p>
+      <w:pPr>
+        <w:pStyle w:val="NormalWeb"/>
+      </w:pPr>
+      <w:r>
+        <w:t xml:space="preserve">En </w:t>
+      </w:r>
+      <w:r>
+        <w:rPr>
+          <w:rStyle w:val="whitespace-normal"/>
+        </w:rPr>
+        <w:t>COBOL</w:t>
+      </w:r>
+      <w:r>
+        <w:t xml:space="preserve">, los </w:t>
+      </w:r>
+      <w:r>
+        <w:rPr>
+          <w:rStyle w:val="Textoennegrita"/>
+        </w:rPr>
+        <w:t>caracteres de edición</w:t>
+      </w:r>
+      <w:r>
+        <w:t xml:space="preserve"> son símbolos que se usan en variables para </w:t>
+      </w:r>
+      <w:r>
+        <w:rPr>
+          <w:rStyle w:val="Textoennegrita"/>
+        </w:rPr>
+        <w:t>dar formato a los datos numéricos</w:t>
+      </w:r>
+      <w:r>
+        <w:t xml:space="preserve">, pero </w:t>
+      </w:r>
+      <w:r>
+        <w:rPr>
+          <w:rStyle w:val="Textoennegrita"/>
+        </w:rPr>
+        <w:t>no forman parte del valor numérico real</w:t>
+      </w:r>
+      <w:r>
+        <w:t>.</w:t>
+      </w:r>
+    </w:p>
+    <w:p>
+      <w:pPr>
+        <w:pStyle w:val="NormalWeb"/>
+      </w:pPr>
+      <w:r>
+        <w:t xml:space="preserve">Se utilizan principalmente para </w:t>
+      </w:r>
+      <w:r>
+        <w:rPr>
+          <w:rStyle w:val="Textoennegrita"/>
+        </w:rPr>
+        <w:t>mostrar números</w:t>
+      </w:r>
+      <w:r>
+        <w:t xml:space="preserve"> (por ejemplo en reportes o pantallas), no para hacer cálculos.</w:t>
+      </w:r>
+    </w:p>
+    <w:p>
+      <w:r>
+        <w:pict w14:anchorId="74AB7CEB">
+          <v:rect id="_x0000_i1048" style="width:0;height:1.5pt" o:hralign="center" o:hrstd="t" o:hr="t" fillcolor="#a0a0a0" stroked="f"/>
+        </w:pict>
+      </w:r>
+    </w:p>
+    <w:p>
+      <w:pPr>
+        <w:pStyle w:val="Ttulo2"/>
+      </w:pPr>
+      <w:r>
+        <w:rPr>
+          <w:rFonts w:ascii="Segoe UI Emoji" w:hAnsi="Segoe UI Emoji" w:cs="Segoe UI Emoji"/>
+        </w:rPr>
+        <w:t>🔹</w:t>
+      </w:r>
+      <w:r>
+        <w:t xml:space="preserve"> Idea clave</w:t>
+      </w:r>
+    </w:p>
+    <w:p>
+      <w:pPr>
+        <w:pStyle w:val="NormalWeb"/>
+      </w:pPr>
+      <w:r>
+        <w:t>Una variable con caracteres de edición:</w:t>
+      </w:r>
+    </w:p>
+    <w:p>
+      <w:pPr>
+        <w:pStyle w:val="NormalWeb"/>
+        <w:numPr>
+          <w:ilvl w:val="0"/>
+          <w:numId w:val="19"/>
+        </w:numPr>
+      </w:pPr>
+      <w:r>
+        <w:t xml:space="preserve">Contiene </w:t>
+      </w:r>
+      <w:r>
+        <w:rPr>
+          <w:rStyle w:val="Textoennegrita"/>
+        </w:rPr>
+        <w:t>símbolos de formato</w:t>
+      </w:r>
+      <w:r>
+        <w:t xml:space="preserve"> (no datos “puros”)</w:t>
+      </w:r>
+    </w:p>
+    <w:p>
+      <w:pPr>
+        <w:pStyle w:val="NormalWeb"/>
+        <w:numPr>
+          <w:ilvl w:val="0"/>
+          <w:numId w:val="19"/>
+        </w:numPr>
+      </w:pPr>
+      <w:r>
+        <w:t xml:space="preserve">Sirve para </w:t>
+      </w:r>
+      <w:r>
+        <w:rPr>
+          <w:rStyle w:val="Textoennegrita"/>
+        </w:rPr>
+        <w:t>presentación</w:t>
+      </w:r>
+    </w:p>
+    <w:p>
+      <w:pPr>
+        <w:pStyle w:val="NormalWeb"/>
+        <w:numPr>
+          <w:ilvl w:val="0"/>
+          <w:numId w:val="19"/>
+        </w:numPr>
+      </w:pPr>
+      <w:r>
+        <w:rPr>
+          <w:rStyle w:val="Textoennegrita"/>
+        </w:rPr>
+        <w:t>No puede usarse en operaciones aritméticas</w:t>
+      </w:r>
+    </w:p>
+    <w:p>
+      <w:r>
+        <w:lastRenderedPageBreak/>
+        <w:pict w14:anchorId="71E4369C">
+          <v:rect id="_x0000_i1049" style="width:0;height:1.5pt" o:hralign="center" o:hrstd="t" o:hr="t" fillcolor="#a0a0a0" stroked="f"/>
+        </w:pict>
+      </w:r>
+    </w:p>
+    <w:p>
+      <w:pPr>
+        <w:pStyle w:val="Ttulo2"/>
+      </w:pPr>
+      <w:r>
+        <w:rPr>
+          <w:rFonts w:ascii="Segoe UI Emoji" w:hAnsi="Segoe UI Emoji" w:cs="Segoe UI Emoji"/>
+        </w:rPr>
+        <w:t>🔹</w:t>
+      </w:r>
+      <w:r>
+        <w:t xml:space="preserve"> Ejemplo simple</w:t>
+      </w:r>
+    </w:p>
+    <w:p>
+      <w:pPr>
+        <w:tabs>
+          <w:tab w:val="left" w:pos="916"/>
+          <w:tab w:val="left" w:pos="1832"/>
+          <w:tab w:val="left" w:pos="2748"/>
+          <w:tab w:val="left" w:pos="3664"/>
+          <w:tab w:val="left" w:pos="4580"/>
+          <w:tab w:val="left" w:pos="5496"/>
+          <w:tab w:val="left" w:pos="6412"/>
+          <w:tab w:val="left" w:pos="7328"/>
+          <w:tab w:val="left" w:pos="8244"/>
+          <w:tab w:val="left" w:pos="9160"/>
+          <w:tab w:val="left" w:pos="10076"/>
+          <w:tab w:val="left" w:pos="10992"/>
+          <w:tab w:val="left" w:pos="11908"/>
+          <w:tab w:val="left" w:pos="12824"/>
+          <w:tab w:val="left" w:pos="13740"/>
+          <w:tab w:val="left" w:pos="14656"/>
+        </w:tabs>
+        <w:spacing w:after="0" w:line="244" w:lineRule="atLeast"/>
+        <w:rPr>
+          <w:rFonts w:ascii="Courier New" w:eastAsia="Times New Roman" w:hAnsi="Courier New" w:cs="Courier New"/>
+          <w:color w:val="333333"/>
+          <w:sz w:val="20"/>
+          <w:szCs w:val="20"/>
+          <w:lang w:eastAsia="es-CO"/>
+        </w:rPr>
+      </w:pPr>
+      <w:r>
+        <w:rPr>
+          <w:rFonts w:ascii="Courier New" w:eastAsia="Times New Roman" w:hAnsi="Courier New" w:cs="Courier New"/>
+          <w:color w:val="888888"/>
+          <w:sz w:val="20"/>
+          <w:szCs w:val="20"/>
+          <w:lang w:eastAsia="es-CO"/>
+        </w:rPr>
+        <w:t>01  SA</w:t>
+      </w:r>
+      <w:r>
+        <w:rPr>
+          <w:rFonts w:ascii="Courier New" w:eastAsia="Times New Roman" w:hAnsi="Courier New" w:cs="Courier New"/>
+          <w:color w:val="996633"/>
+          <w:sz w:val="20"/>
+          <w:szCs w:val="20"/>
+          <w:lang w:eastAsia="es-CO"/>
+        </w:rPr>
+        <w:t>LARIO-BRUTO</w:t>
+      </w:r>
+      <w:r>
+        <w:rPr>
+          <w:rFonts w:ascii="Courier New" w:eastAsia="Times New Roman" w:hAnsi="Courier New" w:cs="Courier New"/>
+          <w:color w:val="BBBBBB"/>
+          <w:sz w:val="20"/>
+          <w:szCs w:val="20"/>
+          <w:lang w:eastAsia="es-CO"/>
+        </w:rPr>
+        <w:t xml:space="preserve">     </w:t>
+      </w:r>
+      <w:r>
+        <w:rPr>
+          <w:rFonts w:ascii="Courier New" w:eastAsia="Times New Roman" w:hAnsi="Courier New" w:cs="Courier New"/>
+          <w:b/>
+          <w:bCs/>
+          <w:color w:val="333399"/>
+          <w:sz w:val="20"/>
+          <w:szCs w:val="20"/>
+          <w:lang w:eastAsia="es-CO"/>
+        </w:rPr>
+        <w:t>PIC 9(5)V99</w:t>
+      </w:r>
+      <w:r>
+        <w:rPr>
+          <w:rFonts w:ascii="Courier New" w:eastAsia="Times New Roman" w:hAnsi="Courier New" w:cs="Courier New"/>
+          <w:color w:val="333333"/>
+          <w:sz w:val="20"/>
+          <w:szCs w:val="20"/>
+          <w:lang w:eastAsia="es-CO"/>
+        </w:rPr>
+        <w:t>.</w:t>
+      </w:r>
+    </w:p>
+    <w:p>
+      <w:pPr>
+        <w:tabs>
+          <w:tab w:val="left" w:pos="916"/>
+          <w:tab w:val="left" w:pos="1832"/>
+          <w:tab w:val="left" w:pos="2748"/>
+          <w:tab w:val="left" w:pos="3664"/>
+          <w:tab w:val="left" w:pos="4580"/>
+          <w:tab w:val="left" w:pos="5496"/>
+          <w:tab w:val="left" w:pos="6412"/>
+          <w:tab w:val="left" w:pos="7328"/>
+          <w:tab w:val="left" w:pos="8244"/>
+          <w:tab w:val="left" w:pos="9160"/>
+          <w:tab w:val="left" w:pos="10076"/>
+          <w:tab w:val="left" w:pos="10992"/>
+          <w:tab w:val="left" w:pos="11908"/>
+          <w:tab w:val="left" w:pos="12824"/>
+          <w:tab w:val="left" w:pos="13740"/>
+          <w:tab w:val="left" w:pos="14656"/>
+        </w:tabs>
+        <w:spacing w:after="0" w:line="244" w:lineRule="atLeast"/>
+        <w:rPr>
+          <w:rFonts w:ascii="Courier New" w:eastAsia="Times New Roman" w:hAnsi="Courier New" w:cs="Courier New"/>
+          <w:color w:val="333333"/>
+          <w:sz w:val="20"/>
+          <w:szCs w:val="20"/>
+          <w:lang w:eastAsia="es-CO"/>
+        </w:rPr>
+      </w:pPr>
+      <w:r>
+        <w:rPr>
+          <w:rFonts w:ascii="Courier New" w:eastAsia="Times New Roman" w:hAnsi="Courier New" w:cs="Courier New"/>
+          <w:color w:val="888888"/>
+          <w:sz w:val="20"/>
+          <w:szCs w:val="20"/>
+          <w:lang w:eastAsia="es-CO"/>
+        </w:rPr>
+        <w:t>01  SA</w:t>
+      </w:r>
+      <w:r>
+        <w:rPr>
+          <w:rFonts w:ascii="Courier New" w:eastAsia="Times New Roman" w:hAnsi="Courier New" w:cs="Courier New"/>
+          <w:color w:val="996633"/>
+          <w:sz w:val="20"/>
+          <w:szCs w:val="20"/>
+          <w:lang w:eastAsia="es-CO"/>
+        </w:rPr>
+        <w:t>LARIO-MOSTRAR</w:t>
+      </w:r>
+      <w:r>
+        <w:rPr>
+          <w:rFonts w:ascii="Courier New" w:eastAsia="Times New Roman" w:hAnsi="Courier New" w:cs="Courier New"/>
+          <w:color w:val="BBBBBB"/>
+          <w:sz w:val="20"/>
+          <w:szCs w:val="20"/>
+          <w:lang w:eastAsia="es-CO"/>
+        </w:rPr>
+        <w:t xml:space="preserve">   </w:t>
+      </w:r>
+      <w:r>
+        <w:rPr>
+          <w:rFonts w:ascii="Courier New" w:eastAsia="Times New Roman" w:hAnsi="Courier New" w:cs="Courier New"/>
+          <w:b/>
+          <w:bCs/>
+          <w:color w:val="333399"/>
+          <w:sz w:val="20"/>
+          <w:szCs w:val="20"/>
+          <w:lang w:eastAsia="es-CO"/>
+        </w:rPr>
+        <w:t>PIC $$$,$$9.99</w:t>
+      </w:r>
+      <w:r>
+        <w:rPr>
+          <w:rFonts w:ascii="Courier New" w:eastAsia="Times New Roman" w:hAnsi="Courier New" w:cs="Courier New"/>
+          <w:color w:val="333333"/>
+          <w:sz w:val="20"/>
+          <w:szCs w:val="20"/>
+          <w:lang w:eastAsia="es-CO"/>
+        </w:rPr>
+        <w:t>.</w:t>
+      </w:r>
+    </w:p>
+    <w:p>
+      <w:pPr>
+        <w:pStyle w:val="NormalWeb"/>
+      </w:pPr>
+      <w:r>
+        <w:t>Si:</w:t>
+      </w:r>
+    </w:p>
+    <w:p>
+      <w:pPr>
+        <w:tabs>
+          <w:tab w:val="left" w:pos="916"/>
+          <w:tab w:val="left" w:pos="1832"/>
+          <w:tab w:val="left" w:pos="2748"/>
+          <w:tab w:val="left" w:pos="3664"/>
+          <w:tab w:val="left" w:pos="4580"/>
+          <w:tab w:val="left" w:pos="5496"/>
+          <w:tab w:val="left" w:pos="6412"/>
+          <w:tab w:val="left" w:pos="7328"/>
+          <w:tab w:val="left" w:pos="8244"/>
+          <w:tab w:val="left" w:pos="9160"/>
+          <w:tab w:val="left" w:pos="10076"/>
+          <w:tab w:val="left" w:pos="10992"/>
+          <w:tab w:val="left" w:pos="11908"/>
+          <w:tab w:val="left" w:pos="12824"/>
+          <w:tab w:val="left" w:pos="13740"/>
+          <w:tab w:val="left" w:pos="14656"/>
+        </w:tabs>
+        <w:spacing w:after="0" w:line="244" w:lineRule="atLeast"/>
+        <w:rPr>
+          <w:rFonts w:ascii="Courier New" w:eastAsia="Times New Roman" w:hAnsi="Courier New" w:cs="Courier New"/>
+          <w:color w:val="333333"/>
+          <w:sz w:val="20"/>
+          <w:szCs w:val="20"/>
+          <w:lang w:eastAsia="es-CO"/>
+        </w:rPr>
+      </w:pPr>
+      <w:r>
+        <w:rPr>
+          <w:rFonts w:ascii="Courier New" w:eastAsia="Times New Roman" w:hAnsi="Courier New" w:cs="Courier New"/>
+          <w:color w:val="888888"/>
+          <w:sz w:val="20"/>
+          <w:szCs w:val="20"/>
+          <w:lang w:eastAsia="es-CO"/>
+        </w:rPr>
+        <w:t>SALARI</w:t>
+      </w:r>
+      <w:r>
+        <w:rPr>
+          <w:rFonts w:ascii="Courier New" w:eastAsia="Times New Roman" w:hAnsi="Courier New" w:cs="Courier New"/>
+          <w:color w:val="996633"/>
+          <w:sz w:val="20"/>
+          <w:szCs w:val="20"/>
+          <w:lang w:eastAsia="es-CO"/>
+        </w:rPr>
+        <w:t>O-BRUTO</w:t>
+      </w:r>
+      <w:r>
+        <w:rPr>
+          <w:rFonts w:ascii="Courier New" w:eastAsia="Times New Roman" w:hAnsi="Courier New" w:cs="Courier New"/>
+          <w:color w:val="BBBBBB"/>
+          <w:sz w:val="20"/>
+          <w:szCs w:val="20"/>
+          <w:lang w:eastAsia="es-CO"/>
+        </w:rPr>
+        <w:t xml:space="preserve"> </w:t>
+      </w:r>
+      <w:r>
+        <w:rPr>
+          <w:rFonts w:ascii="Courier New" w:eastAsia="Times New Roman" w:hAnsi="Courier New" w:cs="Courier New"/>
+          <w:color w:val="333333"/>
+          <w:sz w:val="20"/>
+          <w:szCs w:val="20"/>
+          <w:lang w:eastAsia="es-CO"/>
+        </w:rPr>
+        <w:t>=</w:t>
+      </w:r>
+      <w:r>
+        <w:rPr>
+          <w:rFonts w:ascii="Courier New" w:eastAsia="Times New Roman" w:hAnsi="Courier New" w:cs="Courier New"/>
+          <w:color w:val="BBBBBB"/>
+          <w:sz w:val="20"/>
+          <w:szCs w:val="20"/>
+          <w:lang w:eastAsia="es-CO"/>
+        </w:rPr>
+        <w:t xml:space="preserve"> </w:t>
+      </w:r>
       <w:r>
         <w:rPr>
           <w:rFonts w:ascii="Courier New" w:eastAsia="Times New Roman" w:hAnsi="Courier New" w:cs="Courier New"/>
@@ -7547,9 +7709,18 @@
           <w:szCs w:val="20"/>
           <w:lang w:eastAsia="es-CO"/>
         </w:rPr>
-        <w:t xml:space="preserve">            </w:t>
-      </w:r>
-      <w:proofErr w:type="gramStart"/>
+        <w:t>1234</w:t>
+      </w:r>
+      <w:r>
+        <w:rPr>
+          <w:rFonts w:ascii="Courier New" w:eastAsia="Times New Roman" w:hAnsi="Courier New" w:cs="Courier New"/>
+          <w:color w:val="333333"/>
+          <w:sz w:val="20"/>
+          <w:szCs w:val="20"/>
+          <w:lang w:eastAsia="es-CO"/>
+        </w:rPr>
+        <w:t>.</w:t>
+      </w:r>
       <w:r>
         <w:rPr>
           <w:rFonts w:ascii="Courier New" w:eastAsia="Times New Roman" w:hAnsi="Courier New" w:cs="Courier New"/>
@@ -7560,7 +7731,55 @@
           <w:szCs w:val="20"/>
           <w:lang w:eastAsia="es-CO"/>
         </w:rPr>
-        <w:t xml:space="preserve">01  </w:t>
+        <w:t>5</w:t>
+      </w:r>
+    </w:p>
+    <w:p>
+      <w:pPr>
+        <w:pStyle w:val="NormalWeb"/>
+      </w:pPr>
+      <w:r>
+        <w:t>Entonces:</w:t>
+      </w:r>
+    </w:p>
+    <w:p>
+      <w:pPr>
+        <w:tabs>
+          <w:tab w:val="left" w:pos="916"/>
+          <w:tab w:val="left" w:pos="1832"/>
+          <w:tab w:val="left" w:pos="2748"/>
+          <w:tab w:val="left" w:pos="3664"/>
+          <w:tab w:val="left" w:pos="4580"/>
+          <w:tab w:val="left" w:pos="5496"/>
+          <w:tab w:val="left" w:pos="6412"/>
+          <w:tab w:val="left" w:pos="7328"/>
+          <w:tab w:val="left" w:pos="8244"/>
+          <w:tab w:val="left" w:pos="9160"/>
+          <w:tab w:val="left" w:pos="10076"/>
+          <w:tab w:val="left" w:pos="10992"/>
+          <w:tab w:val="left" w:pos="11908"/>
+          <w:tab w:val="left" w:pos="12824"/>
+          <w:tab w:val="left" w:pos="13740"/>
+          <w:tab w:val="left" w:pos="14656"/>
+        </w:tabs>
+        <w:spacing w:after="0" w:line="244" w:lineRule="atLeast"/>
+        <w:rPr>
+          <w:rFonts w:ascii="Courier New" w:eastAsia="Times New Roman" w:hAnsi="Courier New" w:cs="Courier New"/>
+          <w:color w:val="333333"/>
+          <w:sz w:val="20"/>
+          <w:szCs w:val="20"/>
+          <w:lang w:eastAsia="es-CO"/>
+        </w:rPr>
+      </w:pPr>
+      <w:r>
+        <w:rPr>
+          <w:rFonts w:ascii="Courier New" w:eastAsia="Times New Roman" w:hAnsi="Courier New" w:cs="Courier New"/>
+          <w:color w:val="888888"/>
+          <w:sz w:val="20"/>
+          <w:szCs w:val="20"/>
+          <w:lang w:eastAsia="es-CO"/>
+        </w:rPr>
+        <w:t>SALARI</w:t>
       </w:r>
       <w:r>
         <w:rPr>
@@ -7570,9 +7789,49 @@
           <w:szCs w:val="20"/>
           <w:lang w:eastAsia="es-CO"/>
         </w:rPr>
-        <w:t>SALUDO</w:t>
-      </w:r>
-      <w:proofErr w:type="gramEnd"/>
+        <w:t>O-MOSTRAR</w:t>
+      </w:r>
+      <w:r>
+        <w:rPr>
+          <w:rFonts w:ascii="Courier New" w:eastAsia="Times New Roman" w:hAnsi="Courier New" w:cs="Courier New"/>
+          <w:color w:val="BBBBBB"/>
+          <w:sz w:val="20"/>
+          <w:szCs w:val="20"/>
+          <w:lang w:eastAsia="es-CO"/>
+        </w:rPr>
+        <w:t xml:space="preserve"> </w:t>
+      </w:r>
+      <w:r>
+        <w:rPr>
+          <w:rFonts w:ascii="Courier New" w:eastAsia="Times New Roman" w:hAnsi="Courier New" w:cs="Courier New"/>
+          <w:color w:val="333333"/>
+          <w:sz w:val="20"/>
+          <w:szCs w:val="20"/>
+          <w:lang w:eastAsia="es-CO"/>
+        </w:rPr>
+        <w:t>=</w:t>
+      </w:r>
+      <w:r>
+        <w:rPr>
+          <w:rFonts w:ascii="Courier New" w:eastAsia="Times New Roman" w:hAnsi="Courier New" w:cs="Courier New"/>
+          <w:color w:val="BBBBBB"/>
+          <w:sz w:val="20"/>
+          <w:szCs w:val="20"/>
+          <w:lang w:eastAsia="es-CO"/>
+        </w:rPr>
+        <w:t xml:space="preserve"> </w:t>
+      </w:r>
+      <w:r>
+        <w:rPr>
+          <w:rFonts w:ascii="Courier New" w:eastAsia="Times New Roman" w:hAnsi="Courier New" w:cs="Courier New"/>
+          <w:color w:val="FF0000"/>
+          <w:sz w:val="20"/>
+          <w:szCs w:val="20"/>
+          <w:shd w:val="clear" w:color="auto" w:fill="FFAAAA"/>
+          <w:lang w:eastAsia="es-CO"/>
+        </w:rPr>
+        <w:t>$</w:t>
+      </w:r>
       <w:r>
         <w:rPr>
           <w:rFonts w:ascii="Courier New" w:eastAsia="Times New Roman" w:hAnsi="Courier New" w:cs="Courier New"/>
@@ -7588,59 +7847,915 @@
           <w:rFonts w:ascii="Courier New" w:eastAsia="Times New Roman" w:hAnsi="Courier New" w:cs="Courier New"/>
           <w:b/>
           <w:bCs/>
-          <w:color w:val="333399"/>
-          <w:sz w:val="20"/>
-          <w:szCs w:val="20"/>
-          <w:lang w:eastAsia="es-CO"/>
-        </w:rPr>
-        <w:t>PIC X</w:t>
+          <w:color w:val="0000DD"/>
+          <w:sz w:val="20"/>
+          <w:szCs w:val="20"/>
+          <w:lang w:eastAsia="es-CO"/>
+        </w:rPr>
+        <w:t>1</w:t>
+      </w:r>
+      <w:r>
+        <w:rPr>
+          <w:rFonts w:ascii="Courier New" w:eastAsia="Times New Roman" w:hAnsi="Courier New" w:cs="Courier New"/>
+          <w:color w:val="333333"/>
+          <w:sz w:val="20"/>
+          <w:szCs w:val="20"/>
+          <w:lang w:eastAsia="es-CO"/>
+        </w:rPr>
+        <w:t>,</w:t>
       </w:r>
       <w:r>
         <w:rPr>
           <w:rFonts w:ascii="Courier New" w:eastAsia="Times New Roman" w:hAnsi="Courier New" w:cs="Courier New"/>
           <w:b/>
           <w:bCs/>
-          <w:color w:val="333399"/>
-          <w:sz w:val="20"/>
-          <w:szCs w:val="20"/>
-          <w:lang w:eastAsia="es-CO"/>
-        </w:rPr>
-        <w:t>(4)</w:t>
-      </w:r>
-      <w:r>
-        <w:rPr>
-          <w:rFonts w:ascii="Courier New" w:eastAsia="Times New Roman" w:hAnsi="Courier New" w:cs="Courier New"/>
-          <w:color w:val="BBBBBB"/>
-          <w:sz w:val="20"/>
-          <w:szCs w:val="20"/>
-          <w:lang w:eastAsia="es-CO"/>
-        </w:rPr>
-        <w:t xml:space="preserve"> </w:t>
+          <w:color w:val="0000DD"/>
+          <w:sz w:val="20"/>
+          <w:szCs w:val="20"/>
+          <w:lang w:eastAsia="es-CO"/>
+        </w:rPr>
+        <w:t>234</w:t>
+      </w:r>
+      <w:r>
+        <w:rPr>
+          <w:rFonts w:ascii="Courier New" w:eastAsia="Times New Roman" w:hAnsi="Courier New" w:cs="Courier New"/>
+          <w:color w:val="333333"/>
+          <w:sz w:val="20"/>
+          <w:szCs w:val="20"/>
+          <w:lang w:eastAsia="es-CO"/>
+        </w:rPr>
+        <w:t>.</w:t>
       </w:r>
       <w:r>
         <w:rPr>
           <w:rFonts w:ascii="Courier New" w:eastAsia="Times New Roman" w:hAnsi="Courier New" w:cs="Courier New"/>
           <w:b/>
           <w:bCs/>
-          <w:color w:val="003388"/>
-          <w:sz w:val="20"/>
-          <w:szCs w:val="20"/>
-          <w:lang w:eastAsia="es-CO"/>
-        </w:rPr>
-        <w:t xml:space="preserve">VALUE </w:t>
-      </w:r>
-      <w:r>
+          <w:color w:val="0000DD"/>
+          <w:sz w:val="20"/>
+          <w:szCs w:val="20"/>
+          <w:lang w:eastAsia="es-CO"/>
+        </w:rPr>
+        <w:t>50</w:t>
+      </w:r>
+    </w:p>
+    <w:p>
+      <w:pPr>
+        <w:pStyle w:val="HTMLconformatoprevio"/>
+      </w:pPr>
+    </w:p>
+    <w:p>
+      <w:pPr>
+        <w:pStyle w:val="NormalWeb"/>
+      </w:pPr>
+      <w:r>
+        <w:rPr>
+          <w:rFonts w:ascii="Segoe UI Emoji" w:hAnsi="Segoe UI Emoji" w:cs="Segoe UI Emoji"/>
+        </w:rPr>
+        <w:t>👉</w:t>
+      </w:r>
+      <w:r>
+        <w:t xml:space="preserve"> </w:t>
+      </w:r>
+      <w:r>
+        <w:rPr>
+          <w:rStyle w:val="CdigoHTML"/>
+        </w:rPr>
+        <w:t>SALARIO-MOSTRAR</w:t>
+      </w:r>
+      <w:r>
+        <w:t xml:space="preserve"> tiene caracteres de edición (</w:t>
+      </w:r>
+      <w:r>
+        <w:rPr>
+          <w:rStyle w:val="CdigoHTML"/>
+        </w:rPr>
+        <w:t>$</w:t>
+      </w:r>
+      <w:r>
+        <w:t xml:space="preserve">, </w:t>
+      </w:r>
+      <w:r>
+        <w:rPr>
+          <w:rStyle w:val="CdigoHTML"/>
+        </w:rPr>
+        <w:t>,</w:t>
+      </w:r>
+      <w:r>
+        <w:t xml:space="preserve">, </w:t>
+      </w:r>
+      <w:r>
+        <w:rPr>
+          <w:rStyle w:val="CdigoHTML"/>
+        </w:rPr>
+        <w:t>.</w:t>
+      </w:r>
+      <w:r>
+        <w:t xml:space="preserve">), por eso </w:t>
+      </w:r>
+      <w:r>
+        <w:rPr>
+          <w:rStyle w:val="Textoennegrita"/>
+        </w:rPr>
+        <w:t>no sirve para sumar o restar</w:t>
+      </w:r>
+      <w:r>
+        <w:t>.</w:t>
+      </w:r>
+    </w:p>
+    <w:p>
+      <w:r>
+        <w:pict w14:anchorId="5B0FE699">
+          <v:rect id="_x0000_i1050" style="width:0;height:1.5pt" o:hralign="center" o:hrstd="t" o:hr="t" fillcolor="#a0a0a0" stroked="f"/>
+        </w:pict>
+      </w:r>
+    </w:p>
+    <w:p>
+      <w:pPr>
+        <w:pStyle w:val="Ttulo2"/>
+      </w:pPr>
+      <w:r>
+        <w:rPr>
+          <w:rFonts w:ascii="Segoe UI Emoji" w:hAnsi="Segoe UI Emoji" w:cs="Segoe UI Emoji"/>
+        </w:rPr>
+        <w:t>🔹</w:t>
+      </w:r>
+      <w:r>
+        <w:t xml:space="preserve"> Caracteres de edición más comunes</w:t>
+      </w:r>
+    </w:p>
+    <w:p>
+      <w:pPr>
+        <w:pStyle w:val="Ttulo3"/>
+      </w:pPr>
+      <w:r>
+        <w:t>1. Símbolos monetarios</w:t>
+      </w:r>
+    </w:p>
+    <w:p>
+      <w:pPr>
+        <w:pStyle w:val="NormalWeb"/>
+        <w:numPr>
+          <w:ilvl w:val="0"/>
+          <w:numId w:val="20"/>
+        </w:numPr>
+      </w:pPr>
+      <w:r>
+        <w:rPr>
+          <w:rStyle w:val="CdigoHTML"/>
+        </w:rPr>
+        <w:t>$</w:t>
+      </w:r>
+      <w:r>
+        <w:t xml:space="preserve"> → muestra moneda</w:t>
+      </w:r>
+      <w:r>
+        <w:br/>
+        <w:t xml:space="preserve">Ejemplo: </w:t>
+      </w:r>
+      <w:r>
+        <w:rPr>
+          <w:rStyle w:val="CdigoHTML"/>
+        </w:rPr>
+        <w:t>$$$9.99</w:t>
+      </w:r>
+    </w:p>
+    <w:p>
+      <w:r>
+        <w:pict w14:anchorId="0C0E5307">
+          <v:rect id="_x0000_i1051" style="width:0;height:1.5pt" o:hralign="center" o:hrstd="t" o:hr="t" fillcolor="#a0a0a0" stroked="f"/>
+        </w:pict>
+      </w:r>
+    </w:p>
+    <w:p>
+      <w:pPr>
+        <w:pStyle w:val="Ttulo3"/>
+      </w:pPr>
+      <w:r>
+        <w:t>2. Separadores</w:t>
+      </w:r>
+    </w:p>
+    <w:p>
+      <w:pPr>
+        <w:pStyle w:val="NormalWeb"/>
+        <w:numPr>
+          <w:ilvl w:val="0"/>
+          <w:numId w:val="21"/>
+        </w:numPr>
+      </w:pPr>
+      <w:r>
+        <w:rPr>
+          <w:rStyle w:val="CdigoHTML"/>
+        </w:rPr>
+        <w:t>,</w:t>
+      </w:r>
+      <w:r>
+        <w:t xml:space="preserve"> → separador de miles</w:t>
+      </w:r>
+    </w:p>
+    <w:p>
+      <w:pPr>
+        <w:pStyle w:val="NormalWeb"/>
+        <w:numPr>
+          <w:ilvl w:val="0"/>
+          <w:numId w:val="21"/>
+        </w:numPr>
+      </w:pPr>
+      <w:r>
+        <w:rPr>
+          <w:rStyle w:val="CdigoHTML"/>
+        </w:rPr>
+        <w:t>.</w:t>
+      </w:r>
+      <w:r>
+        <w:t xml:space="preserve"> → decimal</w:t>
+      </w:r>
+    </w:p>
+    <w:p>
+      <w:pPr>
+        <w:pStyle w:val="NormalWeb"/>
+      </w:pPr>
+      <w:r>
+        <w:t>Ejemplo:</w:t>
+      </w:r>
+    </w:p>
+    <w:p>
+      <w:pPr>
+        <w:tabs>
+          <w:tab w:val="left" w:pos="916"/>
+          <w:tab w:val="left" w:pos="1832"/>
+          <w:tab w:val="left" w:pos="2748"/>
+          <w:tab w:val="left" w:pos="3664"/>
+          <w:tab w:val="left" w:pos="4580"/>
+          <w:tab w:val="left" w:pos="5496"/>
+          <w:tab w:val="left" w:pos="6412"/>
+          <w:tab w:val="left" w:pos="7328"/>
+          <w:tab w:val="left" w:pos="8244"/>
+          <w:tab w:val="left" w:pos="9160"/>
+          <w:tab w:val="left" w:pos="10076"/>
+          <w:tab w:val="left" w:pos="10992"/>
+          <w:tab w:val="left" w:pos="11908"/>
+          <w:tab w:val="left" w:pos="12824"/>
+          <w:tab w:val="left" w:pos="13740"/>
+          <w:tab w:val="left" w:pos="14656"/>
+        </w:tabs>
+        <w:spacing w:after="0" w:line="244" w:lineRule="atLeast"/>
         <w:rPr>
           <w:rFonts w:ascii="Courier New" w:eastAsia="Times New Roman" w:hAnsi="Courier New" w:cs="Courier New"/>
           <w:color w:val="333333"/>
           <w:sz w:val="20"/>
           <w:szCs w:val="20"/>
-          <w:shd w:val="clear" w:color="auto" w:fill="FFF0F0"/>
-          <w:lang w:eastAsia="es-CO"/>
-        </w:rPr>
-        <w:t>"</w:t>
-      </w:r>
-    </w:p>
+          <w:lang w:eastAsia="es-CO"/>
+        </w:rPr>
+      </w:pPr>
+      <w:r>
+        <w:rPr>
+          <w:rFonts w:ascii="Courier New" w:eastAsia="Times New Roman" w:hAnsi="Courier New" w:cs="Courier New"/>
+          <w:color w:val="888888"/>
+          <w:sz w:val="20"/>
+          <w:szCs w:val="20"/>
+          <w:lang w:eastAsia="es-CO"/>
+        </w:rPr>
+        <w:t>PIC 9,</w:t>
+      </w:r>
+      <w:r>
+        <w:rPr>
+          <w:rFonts w:ascii="Courier New" w:eastAsia="Times New Roman" w:hAnsi="Courier New" w:cs="Courier New"/>
+          <w:b/>
+          <w:bCs/>
+          <w:color w:val="0000DD"/>
+          <w:sz w:val="20"/>
+          <w:szCs w:val="20"/>
+          <w:lang w:eastAsia="es-CO"/>
+        </w:rPr>
+        <w:t>999</w:t>
+      </w:r>
+      <w:r>
+        <w:rPr>
+          <w:rFonts w:ascii="Courier New" w:eastAsia="Times New Roman" w:hAnsi="Courier New" w:cs="Courier New"/>
+          <w:color w:val="333333"/>
+          <w:sz w:val="20"/>
+          <w:szCs w:val="20"/>
+          <w:lang w:eastAsia="es-CO"/>
+        </w:rPr>
+        <w:t>.</w:t>
+      </w:r>
+      <w:r>
+        <w:rPr>
+          <w:rFonts w:ascii="Courier New" w:eastAsia="Times New Roman" w:hAnsi="Courier New" w:cs="Courier New"/>
+          <w:b/>
+          <w:bCs/>
+          <w:color w:val="0000DD"/>
+          <w:sz w:val="20"/>
+          <w:szCs w:val="20"/>
+          <w:lang w:eastAsia="es-CO"/>
+        </w:rPr>
+        <w:t>99</w:t>
+      </w:r>
+    </w:p>
+    <w:p>
+      <w:r>
+        <w:pict w14:anchorId="1C93E60C">
+          <v:rect id="_x0000_i1052" style="width:0;height:1.5pt" o:hralign="center" o:hrstd="t" o:hr="t" fillcolor="#a0a0a0" stroked="f"/>
+        </w:pict>
+      </w:r>
+    </w:p>
+    <w:p>
+      <w:pPr>
+        <w:pStyle w:val="Ttulo3"/>
+      </w:pPr>
+      <w:r>
+        <w:t>3. Supresión de ceros</w:t>
+      </w:r>
+    </w:p>
+    <w:p>
+      <w:pPr>
+        <w:pStyle w:val="NormalWeb"/>
+        <w:numPr>
+          <w:ilvl w:val="0"/>
+          <w:numId w:val="22"/>
+        </w:numPr>
+      </w:pPr>
+      <w:r>
+        <w:rPr>
+          <w:rStyle w:val="CdigoHTML"/>
+        </w:rPr>
+        <w:t>Z</w:t>
+      </w:r>
+      <w:r>
+        <w:t xml:space="preserve"> → reemplaza ceros por espacios</w:t>
+      </w:r>
+    </w:p>
+    <w:p>
+      <w:pPr>
+        <w:pStyle w:val="NormalWeb"/>
+        <w:numPr>
+          <w:ilvl w:val="0"/>
+          <w:numId w:val="22"/>
+        </w:numPr>
+      </w:pPr>
+      <w:r>
+        <w:rPr>
+          <w:rStyle w:val="CdigoHTML"/>
+        </w:rPr>
+        <w:t>*</w:t>
+      </w:r>
+      <w:r>
+        <w:t xml:space="preserve"> → reemplaza ceros por asteriscos</w:t>
+      </w:r>
+    </w:p>
+    <w:p>
+      <w:pPr>
+        <w:pStyle w:val="NormalWeb"/>
+      </w:pPr>
+      <w:r>
+        <w:t>Ejemplo</w:t>
+      </w:r>
+    </w:p>
+    <w:p>
+      <w:pPr>
+        <w:pStyle w:val="NormalWeb"/>
+        <w:rPr>
+          <w:rFonts w:ascii="Courier New" w:hAnsi="Courier New" w:cs="Courier New"/>
+          <w:color w:val="333333"/>
+          <w:sz w:val="20"/>
+          <w:szCs w:val="20"/>
+        </w:rPr>
+      </w:pPr>
+      <w:r>
+        <w:rPr>
+          <w:rFonts w:ascii="Courier New" w:hAnsi="Courier New" w:cs="Courier New"/>
+          <w:color w:val="888888"/>
+          <w:sz w:val="20"/>
+          <w:szCs w:val="20"/>
+        </w:rPr>
+        <w:t>PIC ZZ</w:t>
+      </w:r>
+      <w:r>
+        <w:rPr>
+          <w:rFonts w:ascii="Courier New" w:hAnsi="Courier New" w:cs="Courier New"/>
+          <w:color w:val="996633"/>
+          <w:sz w:val="20"/>
+          <w:szCs w:val="20"/>
+        </w:rPr>
+        <w:t>Z9</w:t>
+      </w:r>
+    </w:p>
+    <w:p>
+      <w:pPr>
+        <w:pStyle w:val="NormalWeb"/>
+      </w:pPr>
+      <w:r>
+        <w:lastRenderedPageBreak/>
+        <w:t>Valor:</w:t>
+      </w:r>
+    </w:p>
+    <w:p>
+      <w:pPr>
+        <w:tabs>
+          <w:tab w:val="left" w:pos="916"/>
+          <w:tab w:val="left" w:pos="1832"/>
+          <w:tab w:val="left" w:pos="2748"/>
+          <w:tab w:val="left" w:pos="3664"/>
+          <w:tab w:val="left" w:pos="4580"/>
+          <w:tab w:val="left" w:pos="5496"/>
+          <w:tab w:val="left" w:pos="6412"/>
+          <w:tab w:val="left" w:pos="7328"/>
+          <w:tab w:val="left" w:pos="8244"/>
+          <w:tab w:val="left" w:pos="9160"/>
+          <w:tab w:val="left" w:pos="10076"/>
+          <w:tab w:val="left" w:pos="10992"/>
+          <w:tab w:val="left" w:pos="11908"/>
+          <w:tab w:val="left" w:pos="12824"/>
+          <w:tab w:val="left" w:pos="13740"/>
+          <w:tab w:val="left" w:pos="14656"/>
+        </w:tabs>
+        <w:spacing w:after="0" w:line="244" w:lineRule="atLeast"/>
+        <w:rPr>
+          <w:rFonts w:ascii="Courier New" w:eastAsia="Times New Roman" w:hAnsi="Courier New" w:cs="Courier New"/>
+          <w:color w:val="333333"/>
+          <w:sz w:val="20"/>
+          <w:szCs w:val="20"/>
+          <w:lang w:eastAsia="es-CO"/>
+        </w:rPr>
+      </w:pPr>
+      <w:r>
+        <w:rPr>
+          <w:rFonts w:ascii="Courier New" w:eastAsia="Times New Roman" w:hAnsi="Courier New" w:cs="Courier New"/>
+          <w:color w:val="888888"/>
+          <w:sz w:val="20"/>
+          <w:szCs w:val="20"/>
+          <w:lang w:eastAsia="es-CO"/>
+        </w:rPr>
+        <w:t>0005 →</w:t>
+      </w:r>
+      <w:r>
+        <w:rPr>
+          <w:rFonts w:ascii="Courier New" w:eastAsia="Times New Roman" w:hAnsi="Courier New" w:cs="Courier New"/>
+          <w:color w:val="BBBBBB"/>
+          <w:sz w:val="20"/>
+          <w:szCs w:val="20"/>
+          <w:lang w:eastAsia="es-CO"/>
+        </w:rPr>
+        <w:t xml:space="preserve">    </w:t>
+      </w:r>
+      <w:r>
+        <w:rPr>
+          <w:rFonts w:ascii="Courier New" w:eastAsia="Times New Roman" w:hAnsi="Courier New" w:cs="Courier New"/>
+          <w:b/>
+          <w:bCs/>
+          <w:color w:val="0000DD"/>
+          <w:sz w:val="20"/>
+          <w:szCs w:val="20"/>
+          <w:lang w:eastAsia="es-CO"/>
+        </w:rPr>
+        <w:t>5</w:t>
+      </w:r>
+    </w:p>
+    <w:p>
+      <w:r>
+        <w:pict w14:anchorId="70ED1E2B">
+          <v:rect id="_x0000_i1053" style="width:0;height:1.5pt" o:hralign="center" o:hrstd="t" o:hr="t" fillcolor="#a0a0a0" stroked="f"/>
+        </w:pict>
+      </w:r>
+    </w:p>
+    <w:p>
+      <w:pPr>
+        <w:pStyle w:val="Ttulo3"/>
+      </w:pPr>
+      <w:r>
+        <w:t>4. Signo</w:t>
+      </w:r>
+    </w:p>
+    <w:p>
+      <w:pPr>
+        <w:pStyle w:val="NormalWeb"/>
+        <w:numPr>
+          <w:ilvl w:val="0"/>
+          <w:numId w:val="23"/>
+        </w:numPr>
+      </w:pPr>
+      <w:r>
+        <w:rPr>
+          <w:rStyle w:val="CdigoHTML"/>
+        </w:rPr>
+        <w:t>+</w:t>
+      </w:r>
+      <w:r>
+        <w:t xml:space="preserve"> → muestra signo siempre</w:t>
+      </w:r>
+    </w:p>
+    <w:p>
+      <w:pPr>
+        <w:pStyle w:val="NormalWeb"/>
+        <w:numPr>
+          <w:ilvl w:val="0"/>
+          <w:numId w:val="23"/>
+        </w:numPr>
+      </w:pPr>
+      <w:r>
+        <w:rPr>
+          <w:rStyle w:val="CdigoHTML"/>
+        </w:rPr>
+        <w:t>-</w:t>
+      </w:r>
+      <w:r>
+        <w:t xml:space="preserve"> → muestra solo negativo</w:t>
+      </w:r>
+    </w:p>
+    <w:p>
+      <w:pPr>
+        <w:pStyle w:val="NormalWeb"/>
+      </w:pPr>
+      <w:r>
+        <w:t>Ejemplo:</w:t>
+      </w:r>
+    </w:p>
+    <w:p>
+      <w:pPr>
+        <w:tabs>
+          <w:tab w:val="left" w:pos="916"/>
+          <w:tab w:val="left" w:pos="1832"/>
+          <w:tab w:val="left" w:pos="2748"/>
+          <w:tab w:val="left" w:pos="3664"/>
+          <w:tab w:val="left" w:pos="4580"/>
+          <w:tab w:val="left" w:pos="5496"/>
+          <w:tab w:val="left" w:pos="6412"/>
+          <w:tab w:val="left" w:pos="7328"/>
+          <w:tab w:val="left" w:pos="8244"/>
+          <w:tab w:val="left" w:pos="9160"/>
+          <w:tab w:val="left" w:pos="10076"/>
+          <w:tab w:val="left" w:pos="10992"/>
+          <w:tab w:val="left" w:pos="11908"/>
+          <w:tab w:val="left" w:pos="12824"/>
+          <w:tab w:val="left" w:pos="13740"/>
+          <w:tab w:val="left" w:pos="14656"/>
+        </w:tabs>
+        <w:spacing w:after="0" w:line="244" w:lineRule="atLeast"/>
+        <w:rPr>
+          <w:rFonts w:ascii="Courier New" w:eastAsia="Times New Roman" w:hAnsi="Courier New" w:cs="Courier New"/>
+          <w:color w:val="333333"/>
+          <w:sz w:val="20"/>
+          <w:szCs w:val="20"/>
+          <w:lang w:eastAsia="es-CO"/>
+        </w:rPr>
+      </w:pPr>
+      <w:r>
+        <w:rPr>
+          <w:rFonts w:ascii="Courier New" w:eastAsia="Times New Roman" w:hAnsi="Courier New" w:cs="Courier New"/>
+          <w:color w:val="888888"/>
+          <w:sz w:val="20"/>
+          <w:szCs w:val="20"/>
+          <w:lang w:eastAsia="es-CO"/>
+        </w:rPr>
+        <w:t>PIC +9</w:t>
+      </w:r>
+      <w:r>
+        <w:rPr>
+          <w:rFonts w:ascii="Courier New" w:eastAsia="Times New Roman" w:hAnsi="Courier New" w:cs="Courier New"/>
+          <w:b/>
+          <w:bCs/>
+          <w:color w:val="0000DD"/>
+          <w:sz w:val="20"/>
+          <w:szCs w:val="20"/>
+          <w:lang w:eastAsia="es-CO"/>
+        </w:rPr>
+        <w:t>99</w:t>
+      </w:r>
+    </w:p>
+    <w:p>
+      <w:r>
+        <w:pict w14:anchorId="53AB4038">
+          <v:rect id="_x0000_i1054" style="width:0;height:1.5pt" o:hralign="center" o:hrstd="t" o:hr="t" fillcolor="#a0a0a0" stroked="f"/>
+        </w:pict>
+      </w:r>
+    </w:p>
+    <w:p>
+      <w:pPr>
+        <w:pStyle w:val="Ttulo3"/>
+      </w:pPr>
+      <w:r>
+        <w:t>5. Punto decimal implícito</w:t>
+      </w:r>
+    </w:p>
+    <w:p>
+      <w:pPr>
+        <w:pStyle w:val="NormalWeb"/>
+        <w:numPr>
+          <w:ilvl w:val="0"/>
+          <w:numId w:val="24"/>
+        </w:numPr>
+      </w:pPr>
+      <w:r>
+        <w:rPr>
+          <w:rStyle w:val="CdigoHTML"/>
+        </w:rPr>
+        <w:t>.</w:t>
+      </w:r>
+      <w:r>
+        <w:t xml:space="preserve"> o </w:t>
+      </w:r>
+      <w:r>
+        <w:rPr>
+          <w:rStyle w:val="CdigoHTML"/>
+        </w:rPr>
+        <w:t>V</w:t>
+      </w:r>
+      <w:r>
+        <w:t xml:space="preserve"> (según contexto)</w:t>
+      </w:r>
+    </w:p>
+    <w:p>
+      <w:r>
+        <w:pict w14:anchorId="6BCB940F">
+          <v:rect id="_x0000_i1055" style="width:0;height:1.5pt" o:hralign="center" o:hrstd="t" o:hr="t" fillcolor="#a0a0a0" stroked="f"/>
+        </w:pict>
+      </w:r>
+    </w:p>
+    <w:p>
+      <w:pPr>
+        <w:pStyle w:val="Ttulo2"/>
+      </w:pPr>
+      <w:r>
+        <w:rPr>
+          <w:rFonts w:ascii="Segoe UI Emoji" w:hAnsi="Segoe UI Emoji" w:cs="Segoe UI Emoji"/>
+        </w:rPr>
+        <w:t>🔹</w:t>
+      </w:r>
+      <w:r>
+        <w:t xml:space="preserve"> Diferencia importante</w:t>
+      </w:r>
+    </w:p>
+    <w:tbl>
+      <w:tblPr>
+        <w:tblW w:w="0" w:type="auto"/>
+        <w:tblCellSpacing w:w="15" w:type="dxa"/>
+        <w:tblCellMar>
+          <w:top w:w="15" w:type="dxa"/>
+          <w:left w:w="15" w:type="dxa"/>
+          <w:bottom w:w="15" w:type="dxa"/>
+          <w:right w:w="15" w:type="dxa"/>
+        </w:tblCellMar>
+        <w:tblLook w:val="04A0" w:firstRow="1" w:lastRow="0" w:firstColumn="1" w:lastColumn="0" w:noHBand="0" w:noVBand="1"/>
+      </w:tblPr>
+      <w:tblGrid>
+        <w:gridCol w:w="1756"/>
+        <w:gridCol w:w="2737"/>
+      </w:tblGrid>
+      <w:tr>
+        <w:trPr>
+          <w:tblHeader/>
+          <w:tblCellSpacing w:w="15" w:type="dxa"/>
+        </w:trPr>
+        <w:tc>
+          <w:tcPr>
+            <w:tcW w:w="0" w:type="auto"/>
+            <w:vAlign w:val="center"/>
+            <w:hideMark/>
+          </w:tcPr>
+          <w:p>
+            <w:pPr>
+              <w:jc w:val="center"/>
+              <w:rPr>
+                <w:b/>
+                <w:bCs/>
+              </w:rPr>
+            </w:pPr>
+            <w:r>
+              <w:rPr>
+                <w:b/>
+                <w:bCs/>
+              </w:rPr>
+              <w:t>Tipo de variable</w:t>
+            </w:r>
+          </w:p>
+        </w:tc>
+        <w:tc>
+          <w:tcPr>
+            <w:tcW w:w="0" w:type="auto"/>
+            <w:vAlign w:val="center"/>
+            <w:hideMark/>
+          </w:tcPr>
+          <w:p>
+            <w:pPr>
+              <w:jc w:val="center"/>
+              <w:rPr>
+                <w:b/>
+                <w:bCs/>
+              </w:rPr>
+            </w:pPr>
+            <w:r>
+              <w:rPr>
+                <w:b/>
+                <w:bCs/>
+              </w:rPr>
+              <w:t>Uso</w:t>
+            </w:r>
+          </w:p>
+        </w:tc>
+      </w:tr>
+      <w:tr>
+        <w:trPr>
+          <w:tblCellSpacing w:w="15" w:type="dxa"/>
+        </w:trPr>
+        <w:tc>
+          <w:tcPr>
+            <w:tcW w:w="0" w:type="auto"/>
+            <w:vAlign w:val="center"/>
+            <w:hideMark/>
+          </w:tcPr>
+          <w:p>
+            <w:r>
+              <w:rPr>
+                <w:rStyle w:val="CdigoHTML"/>
+                <w:rFonts w:eastAsiaTheme="minorHAnsi"/>
+              </w:rPr>
+              <w:t>PIC 9(5)V99</w:t>
+            </w:r>
+          </w:p>
+        </w:tc>
+        <w:tc>
+          <w:tcPr>
+            <w:tcW w:w="0" w:type="auto"/>
+            <w:vAlign w:val="center"/>
+            <w:hideMark/>
+          </w:tcPr>
+          <w:p>
+            <w:r>
+              <w:rPr>
+                <w:rStyle w:val="Textoennegrita"/>
+              </w:rPr>
+              <w:t>Numérica real (para cálculos)</w:t>
+            </w:r>
+          </w:p>
+        </w:tc>
+      </w:tr>
+      <w:tr>
+        <w:trPr>
+          <w:tblCellSpacing w:w="15" w:type="dxa"/>
+        </w:trPr>
+        <w:tc>
+          <w:tcPr>
+            <w:tcW w:w="0" w:type="auto"/>
+            <w:vAlign w:val="center"/>
+            <w:hideMark/>
+          </w:tcPr>
+          <w:p>
+            <w:r>
+              <w:rPr>
+                <w:rStyle w:val="CdigoHTML"/>
+                <w:rFonts w:eastAsiaTheme="minorHAnsi"/>
+              </w:rPr>
+              <w:t>PIC $$$,$$9.99</w:t>
+            </w:r>
+          </w:p>
+        </w:tc>
+        <w:tc>
+          <w:tcPr>
+            <w:tcW w:w="0" w:type="auto"/>
+            <w:vAlign w:val="center"/>
+            <w:hideMark/>
+          </w:tcPr>
+          <w:p>
+            <w:r>
+              <w:rPr>
+                <w:rStyle w:val="Textoennegrita"/>
+              </w:rPr>
+              <w:t>Editada (solo para mostrar)</w:t>
+            </w:r>
+          </w:p>
+        </w:tc>
+      </w:tr>
+    </w:tbl>
+    <w:p>
+      <w:r>
+        <w:pict w14:anchorId="7BFBFCFB">
+          <v:rect id="_x0000_i1056" style="width:0;height:1.5pt" o:hralign="center" o:hrstd="t" o:hr="t" fillcolor="#a0a0a0" stroked="f"/>
+        </w:pict>
+      </w:r>
+    </w:p>
+    <w:p>
+      <w:pPr>
+        <w:pStyle w:val="Ttulo2"/>
+      </w:pPr>
+      <w:r>
+        <w:rPr>
+          <w:rFonts w:ascii="Segoe UI Emoji" w:hAnsi="Segoe UI Emoji" w:cs="Segoe UI Emoji"/>
+        </w:rPr>
+        <w:t>🔹</w:t>
+      </w:r>
+      <w:r>
+        <w:t xml:space="preserve"> Regla fundamental</w:t>
+      </w:r>
+    </w:p>
+    <w:p>
+      <w:pPr>
+        <w:pStyle w:val="NormalWeb"/>
+      </w:pPr>
+      <w:r>
+        <w:rPr>
+          <w:rFonts w:ascii="Segoe UI Emoji" w:hAnsi="Segoe UI Emoji" w:cs="Segoe UI Emoji"/>
+        </w:rPr>
+        <w:t>👉</w:t>
+      </w:r>
+      <w:r>
+        <w:t xml:space="preserve"> Las variables con caracteres de edición:</w:t>
+      </w:r>
+    </w:p>
+    <w:p>
+      <w:pPr>
+        <w:pStyle w:val="NormalWeb"/>
+        <w:numPr>
+          <w:ilvl w:val="0"/>
+          <w:numId w:val="25"/>
+        </w:numPr>
+      </w:pPr>
+      <w:r>
+        <w:t xml:space="preserve">No se usan en </w:t>
+      </w:r>
+      <w:r>
+        <w:rPr>
+          <w:rStyle w:val="CdigoHTML"/>
+        </w:rPr>
+        <w:t>ADD</w:t>
+      </w:r>
+      <w:r>
+        <w:t xml:space="preserve">, </w:t>
+      </w:r>
+      <w:r>
+        <w:rPr>
+          <w:rStyle w:val="CdigoHTML"/>
+        </w:rPr>
+        <w:t>SUBTRACT</w:t>
+      </w:r>
+      <w:r>
+        <w:t xml:space="preserve">, </w:t>
+      </w:r>
+      <w:r>
+        <w:rPr>
+          <w:rStyle w:val="CdigoHTML"/>
+        </w:rPr>
+        <w:t>MULTIPLY</w:t>
+      </w:r>
+      <w:r>
+        <w:t>, etc.</w:t>
+      </w:r>
+    </w:p>
+    <w:p>
+      <w:pPr>
+        <w:pStyle w:val="NormalWeb"/>
+        <w:numPr>
+          <w:ilvl w:val="0"/>
+          <w:numId w:val="25"/>
+        </w:numPr>
+      </w:pPr>
+      <w:r>
+        <w:t xml:space="preserve">Se llenan normalmente con </w:t>
+      </w:r>
+      <w:r>
+        <w:rPr>
+          <w:rStyle w:val="CdigoHTML"/>
+        </w:rPr>
+        <w:t>MOVE</w:t>
+      </w:r>
+      <w:r>
+        <w:t xml:space="preserve"> desde una variable numérica</w:t>
+      </w:r>
+    </w:p>
+    <w:p>
+      <w:r>
+        <w:pict w14:anchorId="0D251B01">
+          <v:rect id="_x0000_i1057" style="width:0;height:1.5pt" o:hralign="center" o:hrstd="t" o:hr="t" fillcolor="#a0a0a0" stroked="f"/>
+        </w:pict>
+      </w:r>
+    </w:p>
+    <w:p>
+      <w:pPr>
+        <w:pStyle w:val="Ttulo2"/>
+      </w:pPr>
+      <w:r>
+        <w:rPr>
+          <w:rFonts w:ascii="Segoe UI Emoji" w:hAnsi="Segoe UI Emoji" w:cs="Segoe UI Emoji"/>
+        </w:rPr>
+        <w:t>🔹</w:t>
+      </w:r>
+      <w:r>
+        <w:t xml:space="preserve"> Flujo típico</w:t>
+      </w:r>
+    </w:p>
+    <w:p>
+      <w:pPr>
+        <w:pStyle w:val="HTMLconformatoprevio"/>
+      </w:pPr>
+      <w:r>
+        <w:t>MOVE SALARIO-BRUTO TO SALARIO-MOSTRAR</w:t>
+      </w:r>
+      <w:r>
+        <w:br/>
+        <w:t>DISPLAY SALARIO-MOSTRAR</w:t>
+      </w:r>
+    </w:p>
+    <w:p/>
     <w:sectPr>
       <w:pgSz w:w="12240" w:h="15840"/>
       <w:pgMar w:top="1417" w:right="1701" w:bottom="1417" w:left="1701" w:header="708" w:footer="708" w:gutter="0"/>
@@ -7654,6 +8769,304 @@
 <file path=word/numbering.xml><?xml version="1.0" encoding="utf-8"?>
 <w:numbering xmlns:wpc="http://schemas.microsoft.com/office/word/2010/wordprocessingCanvas" xmlns:cx="http://schemas.microsoft.com/office/drawing/2014/chartex" xmlns:cx1="http://schemas.microsoft.com/office/drawing/2015/9/8/chartex" xmlns:cx2="http://schemas.microsoft.com/office/drawing/2015/10/21/chartex" xmlns:cx3="http://schemas.microsoft.com/office/drawing/2016/5/9/chartex" xmlns:cx4="http://schemas.microsoft.com/office/drawing/2016/5/10/chartex" xmlns:cx5="http://schemas.microsoft.com/office/drawing/2016/5/11/chartex" xmlns:cx6="http://schemas.microsoft.com/office/drawing/2016/5/12/chartex" xmlns:cx7="http://schemas.microsoft.com/office/drawing/2016/5/13/chartex" xmlns:cx8="http://schemas.microsoft.com/office/drawing/2016/5/14/chartex" xmlns:mc="http://schemas.openxmlformats.org/markup-compatibility/2006" xmlns:aink="http://schemas.microsoft.com/office/drawing/2016/ink" xmlns:am3d="http://schemas.microsoft.com/office/drawing/2017/model3d" xmlns:o="urn:schemas-microsoft-com:office:office" xmlns:r="http://schemas.openxmlformats.org/officeDocument/2006/relationships" xmlns:m="http://schemas.openxmlformats.org/officeDocument/2006/math" xmlns:v="urn:schemas-microsoft-com:vml" xmlns:wp14="http://schemas.microsoft.com/office/word/2010/wordprocessingDrawing" xmlns:wp="http://schemas.openxmlformats.org/drawingml/2006/wordprocessingDrawing" xmlns:w10="urn:schemas-microsoft-com:office:word" xmlns:w="http://schemas.openxmlformats.org/wordprocessingml/2006/main" xmlns:w14="http://schemas.microsoft.com/office/word/2010/wordml" xmlns:w15="http://schemas.microsoft.com/office/word/2012/wordml" xmlns:w16cex="http://schemas.microsoft.com/office/word/2018/wordml/cex" xmlns:w16cid="http://schemas.microsoft.com/office/word/2016/wordml/cid" xmlns:w16="http://schemas.microsoft.com/office/word/2018/wordml" xmlns:w16se="http://schemas.microsoft.com/office/word/2015/wordml/symex" xmlns:wpg="http://schemas.microsoft.com/office/word/2010/wordprocessingGroup" xmlns:wpi="http://schemas.microsoft.com/office/word/2010/wordprocessingInk" xmlns:wne="http://schemas.microsoft.com/office/word/2006/wordml" xmlns:wps="http://schemas.microsoft.com/office/word/2010/wordprocessingShape" mc:Ignorable="w14 w15 w16se w16cid w16 w16cex wp14">
   <w:abstractNum w:abstractNumId="0" w15:restartNumberingAfterBreak="0">
+    <w:nsid w:val="02D670F6"/>
+    <w:multiLevelType w:val="multilevel"/>
+    <w:tmpl w:val="C91A9E7A"/>
+    <w:lvl w:ilvl="0">
+      <w:start w:val="1"/>
+      <w:numFmt w:val="bullet"/>
+      <w:lvlText w:val=""/>
+      <w:lvlJc w:val="left"/>
+      <w:pPr>
+        <w:tabs>
+          <w:tab w:val="num" w:pos="720"/>
+        </w:tabs>
+        <w:ind w:left="720" w:hanging="360"/>
+      </w:pPr>
+      <w:rPr>
+        <w:rFonts w:ascii="Symbol" w:hAnsi="Symbol" w:hint="default"/>
+        <w:sz w:val="20"/>
+      </w:rPr>
+    </w:lvl>
+    <w:lvl w:ilvl="1" w:tentative="1">
+      <w:start w:val="1"/>
+      <w:numFmt w:val="bullet"/>
+      <w:lvlText w:val="o"/>
+      <w:lvlJc w:val="left"/>
+      <w:pPr>
+        <w:tabs>
+          <w:tab w:val="num" w:pos="1440"/>
+        </w:tabs>
+        <w:ind w:left="1440" w:hanging="360"/>
+      </w:pPr>
+      <w:rPr>
+        <w:rFonts w:ascii="Courier New" w:hAnsi="Courier New" w:hint="default"/>
+        <w:sz w:val="20"/>
+      </w:rPr>
+    </w:lvl>
+    <w:lvl w:ilvl="2" w:tentative="1">
+      <w:start w:val="1"/>
+      <w:numFmt w:val="bullet"/>
+      <w:lvlText w:val=""/>
+      <w:lvlJc w:val="left"/>
+      <w:pPr>
+        <w:tabs>
+          <w:tab w:val="num" w:pos="2160"/>
+        </w:tabs>
+        <w:ind w:left="2160" w:hanging="360"/>
+      </w:pPr>
+      <w:rPr>
+        <w:rFonts w:ascii="Wingdings" w:hAnsi="Wingdings" w:hint="default"/>
+        <w:sz w:val="20"/>
+      </w:rPr>
+    </w:lvl>
+    <w:lvl w:ilvl="3" w:tentative="1">
+      <w:start w:val="1"/>
+      <w:numFmt w:val="bullet"/>
+      <w:lvlText w:val=""/>
+      <w:lvlJc w:val="left"/>
+      <w:pPr>
+        <w:tabs>
+          <w:tab w:val="num" w:pos="2880"/>
+        </w:tabs>
+        <w:ind w:left="2880" w:hanging="360"/>
+      </w:pPr>
+      <w:rPr>
+        <w:rFonts w:ascii="Wingdings" w:hAnsi="Wingdings" w:hint="default"/>
+        <w:sz w:val="20"/>
+      </w:rPr>
+    </w:lvl>
+    <w:lvl w:ilvl="4" w:tentative="1">
+      <w:start w:val="1"/>
+      <w:numFmt w:val="bullet"/>
+      <w:lvlText w:val=""/>
+      <w:lvlJc w:val="left"/>
+      <w:pPr>
+        <w:tabs>
+          <w:tab w:val="num" w:pos="3600"/>
+        </w:tabs>
+        <w:ind w:left="3600" w:hanging="360"/>
+      </w:pPr>
+      <w:rPr>
+        <w:rFonts w:ascii="Wingdings" w:hAnsi="Wingdings" w:hint="default"/>
+        <w:sz w:val="20"/>
+      </w:rPr>
+    </w:lvl>
+    <w:lvl w:ilvl="5" w:tentative="1">
+      <w:start w:val="1"/>
+      <w:numFmt w:val="bullet"/>
+      <w:lvlText w:val=""/>
+      <w:lvlJc w:val="left"/>
+      <w:pPr>
+        <w:tabs>
+          <w:tab w:val="num" w:pos="4320"/>
+        </w:tabs>
+        <w:ind w:left="4320" w:hanging="360"/>
+      </w:pPr>
+      <w:rPr>
+        <w:rFonts w:ascii="Wingdings" w:hAnsi="Wingdings" w:hint="default"/>
+        <w:sz w:val="20"/>
+      </w:rPr>
+    </w:lvl>
+    <w:lvl w:ilvl="6" w:tentative="1">
+      <w:start w:val="1"/>
+      <w:numFmt w:val="bullet"/>
+      <w:lvlText w:val=""/>
+      <w:lvlJc w:val="left"/>
+      <w:pPr>
+        <w:tabs>
+          <w:tab w:val="num" w:pos="5040"/>
+        </w:tabs>
+        <w:ind w:left="5040" w:hanging="360"/>
+      </w:pPr>
+      <w:rPr>
+        <w:rFonts w:ascii="Wingdings" w:hAnsi="Wingdings" w:hint="default"/>
+        <w:sz w:val="20"/>
+      </w:rPr>
+    </w:lvl>
+    <w:lvl w:ilvl="7" w:tentative="1">
+      <w:start w:val="1"/>
+      <w:numFmt w:val="bullet"/>
+      <w:lvlText w:val=""/>
+      <w:lvlJc w:val="left"/>
+      <w:pPr>
+        <w:tabs>
+          <w:tab w:val="num" w:pos="5760"/>
+        </w:tabs>
+        <w:ind w:left="5760" w:hanging="360"/>
+      </w:pPr>
+      <w:rPr>
+        <w:rFonts w:ascii="Wingdings" w:hAnsi="Wingdings" w:hint="default"/>
+        <w:sz w:val="20"/>
+      </w:rPr>
+    </w:lvl>
+    <w:lvl w:ilvl="8" w:tentative="1">
+      <w:start w:val="1"/>
+      <w:numFmt w:val="bullet"/>
+      <w:lvlText w:val=""/>
+      <w:lvlJc w:val="left"/>
+      <w:pPr>
+        <w:tabs>
+          <w:tab w:val="num" w:pos="6480"/>
+        </w:tabs>
+        <w:ind w:left="6480" w:hanging="360"/>
+      </w:pPr>
+      <w:rPr>
+        <w:rFonts w:ascii="Wingdings" w:hAnsi="Wingdings" w:hint="default"/>
+        <w:sz w:val="20"/>
+      </w:rPr>
+    </w:lvl>
+  </w:abstractNum>
+  <w:abstractNum w:abstractNumId="1" w15:restartNumberingAfterBreak="0">
+    <w:nsid w:val="04FD0258"/>
+    <w:multiLevelType w:val="multilevel"/>
+    <w:tmpl w:val="0E78980C"/>
+    <w:lvl w:ilvl="0">
+      <w:start w:val="1"/>
+      <w:numFmt w:val="bullet"/>
+      <w:lvlText w:val=""/>
+      <w:lvlJc w:val="left"/>
+      <w:pPr>
+        <w:tabs>
+          <w:tab w:val="num" w:pos="720"/>
+        </w:tabs>
+        <w:ind w:left="720" w:hanging="360"/>
+      </w:pPr>
+      <w:rPr>
+        <w:rFonts w:ascii="Symbol" w:hAnsi="Symbol" w:hint="default"/>
+        <w:sz w:val="20"/>
+      </w:rPr>
+    </w:lvl>
+    <w:lvl w:ilvl="1" w:tentative="1">
+      <w:start w:val="1"/>
+      <w:numFmt w:val="bullet"/>
+      <w:lvlText w:val="o"/>
+      <w:lvlJc w:val="left"/>
+      <w:pPr>
+        <w:tabs>
+          <w:tab w:val="num" w:pos="1440"/>
+        </w:tabs>
+        <w:ind w:left="1440" w:hanging="360"/>
+      </w:pPr>
+      <w:rPr>
+        <w:rFonts w:ascii="Courier New" w:hAnsi="Courier New" w:hint="default"/>
+        <w:sz w:val="20"/>
+      </w:rPr>
+    </w:lvl>
+    <w:lvl w:ilvl="2" w:tentative="1">
+      <w:start w:val="1"/>
+      <w:numFmt w:val="bullet"/>
+      <w:lvlText w:val=""/>
+      <w:lvlJc w:val="left"/>
+      <w:pPr>
+        <w:tabs>
+          <w:tab w:val="num" w:pos="2160"/>
+        </w:tabs>
+        <w:ind w:left="2160" w:hanging="360"/>
+      </w:pPr>
+      <w:rPr>
+        <w:rFonts w:ascii="Wingdings" w:hAnsi="Wingdings" w:hint="default"/>
+        <w:sz w:val="20"/>
+      </w:rPr>
+    </w:lvl>
+    <w:lvl w:ilvl="3" w:tentative="1">
+      <w:start w:val="1"/>
+      <w:numFmt w:val="bullet"/>
+      <w:lvlText w:val=""/>
+      <w:lvlJc w:val="left"/>
+      <w:pPr>
+        <w:tabs>
+          <w:tab w:val="num" w:pos="2880"/>
+        </w:tabs>
+        <w:ind w:left="2880" w:hanging="360"/>
+      </w:pPr>
+      <w:rPr>
+        <w:rFonts w:ascii="Wingdings" w:hAnsi="Wingdings" w:hint="default"/>
+        <w:sz w:val="20"/>
+      </w:rPr>
+    </w:lvl>
+    <w:lvl w:ilvl="4" w:tentative="1">
+      <w:start w:val="1"/>
+      <w:numFmt w:val="bullet"/>
+      <w:lvlText w:val=""/>
+      <w:lvlJc w:val="left"/>
+      <w:pPr>
+        <w:tabs>
+          <w:tab w:val="num" w:pos="3600"/>
+        </w:tabs>
+        <w:ind w:left="3600" w:hanging="360"/>
+      </w:pPr>
+      <w:rPr>
+        <w:rFonts w:ascii="Wingdings" w:hAnsi="Wingdings" w:hint="default"/>
+        <w:sz w:val="20"/>
+      </w:rPr>
+    </w:lvl>
+    <w:lvl w:ilvl="5" w:tentative="1">
+      <w:start w:val="1"/>
+      <w:numFmt w:val="bullet"/>
+      <w:lvlText w:val=""/>
+      <w:lvlJc w:val="left"/>
+      <w:pPr>
+        <w:tabs>
+          <w:tab w:val="num" w:pos="4320"/>
+        </w:tabs>
+        <w:ind w:left="4320" w:hanging="360"/>
+      </w:pPr>
+      <w:rPr>
+        <w:rFonts w:ascii="Wingdings" w:hAnsi="Wingdings" w:hint="default"/>
+        <w:sz w:val="20"/>
+      </w:rPr>
+    </w:lvl>
+    <w:lvl w:ilvl="6" w:tentative="1">
+      <w:start w:val="1"/>
+      <w:numFmt w:val="bullet"/>
+      <w:lvlText w:val=""/>
+      <w:lvlJc w:val="left"/>
+      <w:pPr>
+        <w:tabs>
+          <w:tab w:val="num" w:pos="5040"/>
+        </w:tabs>
+        <w:ind w:left="5040" w:hanging="360"/>
+      </w:pPr>
+      <w:rPr>
+        <w:rFonts w:ascii="Wingdings" w:hAnsi="Wingdings" w:hint="default"/>
+        <w:sz w:val="20"/>
+      </w:rPr>
+    </w:lvl>
+    <w:lvl w:ilvl="7" w:tentative="1">
+      <w:start w:val="1"/>
+      <w:numFmt w:val="bullet"/>
+      <w:lvlText w:val=""/>
+      <w:lvlJc w:val="left"/>
+      <w:pPr>
+        <w:tabs>
+          <w:tab w:val="num" w:pos="5760"/>
+        </w:tabs>
+        <w:ind w:left="5760" w:hanging="360"/>
+      </w:pPr>
+      <w:rPr>
+        <w:rFonts w:ascii="Wingdings" w:hAnsi="Wingdings" w:hint="default"/>
+        <w:sz w:val="20"/>
+      </w:rPr>
+    </w:lvl>
+    <w:lvl w:ilvl="8" w:tentative="1">
+      <w:start w:val="1"/>
+      <w:numFmt w:val="bullet"/>
+      <w:lvlText w:val=""/>
+      <w:lvlJc w:val="left"/>
+      <w:pPr>
+        <w:tabs>
+          <w:tab w:val="num" w:pos="6480"/>
+        </w:tabs>
+        <w:ind w:left="6480" w:hanging="360"/>
+      </w:pPr>
+      <w:rPr>
+        <w:rFonts w:ascii="Wingdings" w:hAnsi="Wingdings" w:hint="default"/>
+        <w:sz w:val="20"/>
+      </w:rPr>
+    </w:lvl>
+  </w:abstractNum>
+  <w:abstractNum w:abstractNumId="2" w15:restartNumberingAfterBreak="0">
     <w:nsid w:val="0939019D"/>
     <w:multiLevelType w:val="multilevel"/>
     <w:tmpl w:val="2C0C30E2"/>
@@ -7802,7 +9215,156 @@
       </w:rPr>
     </w:lvl>
   </w:abstractNum>
-  <w:abstractNum w:abstractNumId="1" w15:restartNumberingAfterBreak="0">
+  <w:abstractNum w:abstractNumId="3" w15:restartNumberingAfterBreak="0">
+    <w:nsid w:val="136A103C"/>
+    <w:multiLevelType w:val="multilevel"/>
+    <w:tmpl w:val="EC3C490E"/>
+    <w:lvl w:ilvl="0">
+      <w:start w:val="1"/>
+      <w:numFmt w:val="bullet"/>
+      <w:lvlText w:val=""/>
+      <w:lvlJc w:val="left"/>
+      <w:pPr>
+        <w:tabs>
+          <w:tab w:val="num" w:pos="720"/>
+        </w:tabs>
+        <w:ind w:left="720" w:hanging="360"/>
+      </w:pPr>
+      <w:rPr>
+        <w:rFonts w:ascii="Symbol" w:hAnsi="Symbol" w:hint="default"/>
+        <w:sz w:val="20"/>
+      </w:rPr>
+    </w:lvl>
+    <w:lvl w:ilvl="1" w:tentative="1">
+      <w:start w:val="1"/>
+      <w:numFmt w:val="bullet"/>
+      <w:lvlText w:val="o"/>
+      <w:lvlJc w:val="left"/>
+      <w:pPr>
+        <w:tabs>
+          <w:tab w:val="num" w:pos="1440"/>
+        </w:tabs>
+        <w:ind w:left="1440" w:hanging="360"/>
+      </w:pPr>
+      <w:rPr>
+        <w:rFonts w:ascii="Courier New" w:hAnsi="Courier New" w:hint="default"/>
+        <w:sz w:val="20"/>
+      </w:rPr>
+    </w:lvl>
+    <w:lvl w:ilvl="2" w:tentative="1">
+      <w:start w:val="1"/>
+      <w:numFmt w:val="bullet"/>
+      <w:lvlText w:val=""/>
+      <w:lvlJc w:val="left"/>
+      <w:pPr>
+        <w:tabs>
+          <w:tab w:val="num" w:pos="2160"/>
+        </w:tabs>
+        <w:ind w:left="2160" w:hanging="360"/>
+      </w:pPr>
+      <w:rPr>
+        <w:rFonts w:ascii="Wingdings" w:hAnsi="Wingdings" w:hint="default"/>
+        <w:sz w:val="20"/>
+      </w:rPr>
+    </w:lvl>
+    <w:lvl w:ilvl="3" w:tentative="1">
+      <w:start w:val="1"/>
+      <w:numFmt w:val="bullet"/>
+      <w:lvlText w:val=""/>
+      <w:lvlJc w:val="left"/>
+      <w:pPr>
+        <w:tabs>
+          <w:tab w:val="num" w:pos="2880"/>
+        </w:tabs>
+        <w:ind w:left="2880" w:hanging="360"/>
+      </w:pPr>
+      <w:rPr>
+        <w:rFonts w:ascii="Wingdings" w:hAnsi="Wingdings" w:hint="default"/>
+        <w:sz w:val="20"/>
+      </w:rPr>
+    </w:lvl>
+    <w:lvl w:ilvl="4" w:tentative="1">
+      <w:start w:val="1"/>
+      <w:numFmt w:val="bullet"/>
+      <w:lvlText w:val=""/>
+      <w:lvlJc w:val="left"/>
+      <w:pPr>
+        <w:tabs>
+          <w:tab w:val="num" w:pos="3600"/>
+        </w:tabs>
+        <w:ind w:left="3600" w:hanging="360"/>
+      </w:pPr>
+      <w:rPr>
+        <w:rFonts w:ascii="Wingdings" w:hAnsi="Wingdings" w:hint="default"/>
+        <w:sz w:val="20"/>
+      </w:rPr>
+    </w:lvl>
+    <w:lvl w:ilvl="5" w:tentative="1">
+      <w:start w:val="1"/>
+      <w:numFmt w:val="bullet"/>
+      <w:lvlText w:val=""/>
+      <w:lvlJc w:val="left"/>
+      <w:pPr>
+        <w:tabs>
+          <w:tab w:val="num" w:pos="4320"/>
+        </w:tabs>
+        <w:ind w:left="4320" w:hanging="360"/>
+      </w:pPr>
+      <w:rPr>
+        <w:rFonts w:ascii="Wingdings" w:hAnsi="Wingdings" w:hint="default"/>
+        <w:sz w:val="20"/>
+      </w:rPr>
+    </w:lvl>
+    <w:lvl w:ilvl="6" w:tentative="1">
+      <w:start w:val="1"/>
+      <w:numFmt w:val="bullet"/>
+      <w:lvlText w:val=""/>
+      <w:lvlJc w:val="left"/>
+      <w:pPr>
+        <w:tabs>
+          <w:tab w:val="num" w:pos="5040"/>
+        </w:tabs>
+        <w:ind w:left="5040" w:hanging="360"/>
+      </w:pPr>
+      <w:rPr>
+        <w:rFonts w:ascii="Wingdings" w:hAnsi="Wingdings" w:hint="default"/>
+        <w:sz w:val="20"/>
+      </w:rPr>
+    </w:lvl>
+    <w:lvl w:ilvl="7" w:tentative="1">
+      <w:start w:val="1"/>
+      <w:numFmt w:val="bullet"/>
+      <w:lvlText w:val=""/>
+      <w:lvlJc w:val="left"/>
+      <w:pPr>
+        <w:tabs>
+          <w:tab w:val="num" w:pos="5760"/>
+        </w:tabs>
+        <w:ind w:left="5760" w:hanging="360"/>
+      </w:pPr>
+      <w:rPr>
+        <w:rFonts w:ascii="Wingdings" w:hAnsi="Wingdings" w:hint="default"/>
+        <w:sz w:val="20"/>
+      </w:rPr>
+    </w:lvl>
+    <w:lvl w:ilvl="8" w:tentative="1">
+      <w:start w:val="1"/>
+      <w:numFmt w:val="bullet"/>
+      <w:lvlText w:val=""/>
+      <w:lvlJc w:val="left"/>
+      <w:pPr>
+        <w:tabs>
+          <w:tab w:val="num" w:pos="6480"/>
+        </w:tabs>
+        <w:ind w:left="6480" w:hanging="360"/>
+      </w:pPr>
+      <w:rPr>
+        <w:rFonts w:ascii="Wingdings" w:hAnsi="Wingdings" w:hint="default"/>
+        <w:sz w:val="20"/>
+      </w:rPr>
+    </w:lvl>
+  </w:abstractNum>
+  <w:abstractNum w:abstractNumId="4" w15:restartNumberingAfterBreak="0">
     <w:nsid w:val="188D0984"/>
     <w:multiLevelType w:val="multilevel"/>
     <w:tmpl w:val="8A240768"/>
@@ -7951,7 +9513,7 @@
       </w:rPr>
     </w:lvl>
   </w:abstractNum>
-  <w:abstractNum w:abstractNumId="2" w15:restartNumberingAfterBreak="0">
+  <w:abstractNum w:abstractNumId="5" w15:restartNumberingAfterBreak="0">
     <w:nsid w:val="1D5339DB"/>
     <w:multiLevelType w:val="multilevel"/>
     <w:tmpl w:val="8B0CE198"/>
@@ -8100,7 +9662,7 @@
       </w:rPr>
     </w:lvl>
   </w:abstractNum>
-  <w:abstractNum w:abstractNumId="3" w15:restartNumberingAfterBreak="0">
+  <w:abstractNum w:abstractNumId="6" w15:restartNumberingAfterBreak="0">
     <w:nsid w:val="1EE60DDA"/>
     <w:multiLevelType w:val="multilevel"/>
     <w:tmpl w:val="4ADEB948"/>
@@ -8249,7 +9811,7 @@
       </w:rPr>
     </w:lvl>
   </w:abstractNum>
-  <w:abstractNum w:abstractNumId="4" w15:restartNumberingAfterBreak="0">
+  <w:abstractNum w:abstractNumId="7" w15:restartNumberingAfterBreak="0">
     <w:nsid w:val="24F4709F"/>
     <w:multiLevelType w:val="multilevel"/>
     <w:tmpl w:val="8D102BDE"/>
@@ -8398,7 +9960,7 @@
       </w:rPr>
     </w:lvl>
   </w:abstractNum>
-  <w:abstractNum w:abstractNumId="5" w15:restartNumberingAfterBreak="0">
+  <w:abstractNum w:abstractNumId="8" w15:restartNumberingAfterBreak="0">
     <w:nsid w:val="30F145F4"/>
     <w:multiLevelType w:val="multilevel"/>
     <w:tmpl w:val="D0D62F6E"/>
@@ -8547,7 +10109,156 @@
       </w:rPr>
     </w:lvl>
   </w:abstractNum>
-  <w:abstractNum w:abstractNumId="6" w15:restartNumberingAfterBreak="0">
+  <w:abstractNum w:abstractNumId="9" w15:restartNumberingAfterBreak="0">
+    <w:nsid w:val="34E870A4"/>
+    <w:multiLevelType w:val="multilevel"/>
+    <w:tmpl w:val="139C857E"/>
+    <w:lvl w:ilvl="0">
+      <w:start w:val="1"/>
+      <w:numFmt w:val="bullet"/>
+      <w:lvlText w:val=""/>
+      <w:lvlJc w:val="left"/>
+      <w:pPr>
+        <w:tabs>
+          <w:tab w:val="num" w:pos="720"/>
+        </w:tabs>
+        <w:ind w:left="720" w:hanging="360"/>
+      </w:pPr>
+      <w:rPr>
+        <w:rFonts w:ascii="Symbol" w:hAnsi="Symbol" w:hint="default"/>
+        <w:sz w:val="20"/>
+      </w:rPr>
+    </w:lvl>
+    <w:lvl w:ilvl="1" w:tentative="1">
+      <w:start w:val="1"/>
+      <w:numFmt w:val="bullet"/>
+      <w:lvlText w:val="o"/>
+      <w:lvlJc w:val="left"/>
+      <w:pPr>
+        <w:tabs>
+          <w:tab w:val="num" w:pos="1440"/>
+        </w:tabs>
+        <w:ind w:left="1440" w:hanging="360"/>
+      </w:pPr>
+      <w:rPr>
+        <w:rFonts w:ascii="Courier New" w:hAnsi="Courier New" w:hint="default"/>
+        <w:sz w:val="20"/>
+      </w:rPr>
+    </w:lvl>
+    <w:lvl w:ilvl="2" w:tentative="1">
+      <w:start w:val="1"/>
+      <w:numFmt w:val="bullet"/>
+      <w:lvlText w:val=""/>
+      <w:lvlJc w:val="left"/>
+      <w:pPr>
+        <w:tabs>
+          <w:tab w:val="num" w:pos="2160"/>
+        </w:tabs>
+        <w:ind w:left="2160" w:hanging="360"/>
+      </w:pPr>
+      <w:rPr>
+        <w:rFonts w:ascii="Wingdings" w:hAnsi="Wingdings" w:hint="default"/>
+        <w:sz w:val="20"/>
+      </w:rPr>
+    </w:lvl>
+    <w:lvl w:ilvl="3" w:tentative="1">
+      <w:start w:val="1"/>
+      <w:numFmt w:val="bullet"/>
+      <w:lvlText w:val=""/>
+      <w:lvlJc w:val="left"/>
+      <w:pPr>
+        <w:tabs>
+          <w:tab w:val="num" w:pos="2880"/>
+        </w:tabs>
+        <w:ind w:left="2880" w:hanging="360"/>
+      </w:pPr>
+      <w:rPr>
+        <w:rFonts w:ascii="Wingdings" w:hAnsi="Wingdings" w:hint="default"/>
+        <w:sz w:val="20"/>
+      </w:rPr>
+    </w:lvl>
+    <w:lvl w:ilvl="4" w:tentative="1">
+      <w:start w:val="1"/>
+      <w:numFmt w:val="bullet"/>
+      <w:lvlText w:val=""/>
+      <w:lvlJc w:val="left"/>
+      <w:pPr>
+        <w:tabs>
+          <w:tab w:val="num" w:pos="3600"/>
+        </w:tabs>
+        <w:ind w:left="3600" w:hanging="360"/>
+      </w:pPr>
+      <w:rPr>
+        <w:rFonts w:ascii="Wingdings" w:hAnsi="Wingdings" w:hint="default"/>
+        <w:sz w:val="20"/>
+      </w:rPr>
+    </w:lvl>
+    <w:lvl w:ilvl="5" w:tentative="1">
+      <w:start w:val="1"/>
+      <w:numFmt w:val="bullet"/>
+      <w:lvlText w:val=""/>
+      <w:lvlJc w:val="left"/>
+      <w:pPr>
+        <w:tabs>
+          <w:tab w:val="num" w:pos="4320"/>
+        </w:tabs>
+        <w:ind w:left="4320" w:hanging="360"/>
+      </w:pPr>
+      <w:rPr>
+        <w:rFonts w:ascii="Wingdings" w:hAnsi="Wingdings" w:hint="default"/>
+        <w:sz w:val="20"/>
+      </w:rPr>
+    </w:lvl>
+    <w:lvl w:ilvl="6" w:tentative="1">
+      <w:start w:val="1"/>
+      <w:numFmt w:val="bullet"/>
+      <w:lvlText w:val=""/>
+      <w:lvlJc w:val="left"/>
+      <w:pPr>
+        <w:tabs>
+          <w:tab w:val="num" w:pos="5040"/>
+        </w:tabs>
+        <w:ind w:left="5040" w:hanging="360"/>
+      </w:pPr>
+      <w:rPr>
+        <w:rFonts w:ascii="Wingdings" w:hAnsi="Wingdings" w:hint="default"/>
+        <w:sz w:val="20"/>
+      </w:rPr>
+    </w:lvl>
+    <w:lvl w:ilvl="7" w:tentative="1">
+      <w:start w:val="1"/>
+      <w:numFmt w:val="bullet"/>
+      <w:lvlText w:val=""/>
+      <w:lvlJc w:val="left"/>
+      <w:pPr>
+        <w:tabs>
+          <w:tab w:val="num" w:pos="5760"/>
+        </w:tabs>
+        <w:ind w:left="5760" w:hanging="360"/>
+      </w:pPr>
+      <w:rPr>
+        <w:rFonts w:ascii="Wingdings" w:hAnsi="Wingdings" w:hint="default"/>
+        <w:sz w:val="20"/>
+      </w:rPr>
+    </w:lvl>
+    <w:lvl w:ilvl="8" w:tentative="1">
+      <w:start w:val="1"/>
+      <w:numFmt w:val="bullet"/>
+      <w:lvlText w:val=""/>
+      <w:lvlJc w:val="left"/>
+      <w:pPr>
+        <w:tabs>
+          <w:tab w:val="num" w:pos="6480"/>
+        </w:tabs>
+        <w:ind w:left="6480" w:hanging="360"/>
+      </w:pPr>
+      <w:rPr>
+        <w:rFonts w:ascii="Wingdings" w:hAnsi="Wingdings" w:hint="default"/>
+        <w:sz w:val="20"/>
+      </w:rPr>
+    </w:lvl>
+  </w:abstractNum>
+  <w:abstractNum w:abstractNumId="10" w15:restartNumberingAfterBreak="0">
     <w:nsid w:val="39192A1F"/>
     <w:multiLevelType w:val="multilevel"/>
     <w:tmpl w:val="532C20C2"/>
@@ -8696,10 +10407,159 @@
       </w:rPr>
     </w:lvl>
   </w:abstractNum>
-  <w:abstractNum w:abstractNumId="7" w15:restartNumberingAfterBreak="0">
+  <w:abstractNum w:abstractNumId="11" w15:restartNumberingAfterBreak="0">
+    <w:nsid w:val="3DD602EB"/>
+    <w:multiLevelType w:val="multilevel"/>
+    <w:tmpl w:val="4D10BA84"/>
+    <w:lvl w:ilvl="0">
+      <w:start w:val="1"/>
+      <w:numFmt w:val="bullet"/>
+      <w:lvlText w:val=""/>
+      <w:lvlJc w:val="left"/>
+      <w:pPr>
+        <w:tabs>
+          <w:tab w:val="num" w:pos="720"/>
+        </w:tabs>
+        <w:ind w:left="720" w:hanging="360"/>
+      </w:pPr>
+      <w:rPr>
+        <w:rFonts w:ascii="Symbol" w:hAnsi="Symbol" w:hint="default"/>
+        <w:sz w:val="20"/>
+      </w:rPr>
+    </w:lvl>
+    <w:lvl w:ilvl="1" w:tentative="1">
+      <w:start w:val="1"/>
+      <w:numFmt w:val="bullet"/>
+      <w:lvlText w:val="o"/>
+      <w:lvlJc w:val="left"/>
+      <w:pPr>
+        <w:tabs>
+          <w:tab w:val="num" w:pos="1440"/>
+        </w:tabs>
+        <w:ind w:left="1440" w:hanging="360"/>
+      </w:pPr>
+      <w:rPr>
+        <w:rFonts w:ascii="Courier New" w:hAnsi="Courier New" w:hint="default"/>
+        <w:sz w:val="20"/>
+      </w:rPr>
+    </w:lvl>
+    <w:lvl w:ilvl="2" w:tentative="1">
+      <w:start w:val="1"/>
+      <w:numFmt w:val="bullet"/>
+      <w:lvlText w:val=""/>
+      <w:lvlJc w:val="left"/>
+      <w:pPr>
+        <w:tabs>
+          <w:tab w:val="num" w:pos="2160"/>
+        </w:tabs>
+        <w:ind w:left="2160" w:hanging="360"/>
+      </w:pPr>
+      <w:rPr>
+        <w:rFonts w:ascii="Wingdings" w:hAnsi="Wingdings" w:hint="default"/>
+        <w:sz w:val="20"/>
+      </w:rPr>
+    </w:lvl>
+    <w:lvl w:ilvl="3" w:tentative="1">
+      <w:start w:val="1"/>
+      <w:numFmt w:val="bullet"/>
+      <w:lvlText w:val=""/>
+      <w:lvlJc w:val="left"/>
+      <w:pPr>
+        <w:tabs>
+          <w:tab w:val="num" w:pos="2880"/>
+        </w:tabs>
+        <w:ind w:left="2880" w:hanging="360"/>
+      </w:pPr>
+      <w:rPr>
+        <w:rFonts w:ascii="Wingdings" w:hAnsi="Wingdings" w:hint="default"/>
+        <w:sz w:val="20"/>
+      </w:rPr>
+    </w:lvl>
+    <w:lvl w:ilvl="4" w:tentative="1">
+      <w:start w:val="1"/>
+      <w:numFmt w:val="bullet"/>
+      <w:lvlText w:val=""/>
+      <w:lvlJc w:val="left"/>
+      <w:pPr>
+        <w:tabs>
+          <w:tab w:val="num" w:pos="3600"/>
+        </w:tabs>
+        <w:ind w:left="3600" w:hanging="360"/>
+      </w:pPr>
+      <w:rPr>
+        <w:rFonts w:ascii="Wingdings" w:hAnsi="Wingdings" w:hint="default"/>
+        <w:sz w:val="20"/>
+      </w:rPr>
+    </w:lvl>
+    <w:lvl w:ilvl="5" w:tentative="1">
+      <w:start w:val="1"/>
+      <w:numFmt w:val="bullet"/>
+      <w:lvlText w:val=""/>
+      <w:lvlJc w:val="left"/>
+      <w:pPr>
+        <w:tabs>
+          <w:tab w:val="num" w:pos="4320"/>
+        </w:tabs>
+        <w:ind w:left="4320" w:hanging="360"/>
+      </w:pPr>
+      <w:rPr>
+        <w:rFonts w:ascii="Wingdings" w:hAnsi="Wingdings" w:hint="default"/>
+        <w:sz w:val="20"/>
+      </w:rPr>
+    </w:lvl>
+    <w:lvl w:ilvl="6" w:tentative="1">
+      <w:start w:val="1"/>
+      <w:numFmt w:val="bullet"/>
+      <w:lvlText w:val=""/>
+      <w:lvlJc w:val="left"/>
+      <w:pPr>
+        <w:tabs>
+          <w:tab w:val="num" w:pos="5040"/>
+        </w:tabs>
+        <w:ind w:left="5040" w:hanging="360"/>
+      </w:pPr>
+      <w:rPr>
+        <w:rFonts w:ascii="Wingdings" w:hAnsi="Wingdings" w:hint="default"/>
+        <w:sz w:val="20"/>
+      </w:rPr>
+    </w:lvl>
+    <w:lvl w:ilvl="7" w:tentative="1">
+      <w:start w:val="1"/>
+      <w:numFmt w:val="bullet"/>
+      <w:lvlText w:val=""/>
+      <w:lvlJc w:val="left"/>
+      <w:pPr>
+        <w:tabs>
+          <w:tab w:val="num" w:pos="5760"/>
+        </w:tabs>
+        <w:ind w:left="5760" w:hanging="360"/>
+      </w:pPr>
+      <w:rPr>
+        <w:rFonts w:ascii="Wingdings" w:hAnsi="Wingdings" w:hint="default"/>
+        <w:sz w:val="20"/>
+      </w:rPr>
+    </w:lvl>
+    <w:lvl w:ilvl="8" w:tentative="1">
+      <w:start w:val="1"/>
+      <w:numFmt w:val="bullet"/>
+      <w:lvlText w:val=""/>
+      <w:lvlJc w:val="left"/>
+      <w:pPr>
+        <w:tabs>
+          <w:tab w:val="num" w:pos="6480"/>
+        </w:tabs>
+        <w:ind w:left="6480" w:hanging="360"/>
+      </w:pPr>
+      <w:rPr>
+        <w:rFonts w:ascii="Wingdings" w:hAnsi="Wingdings" w:hint="default"/>
+        <w:sz w:val="20"/>
+      </w:rPr>
+    </w:lvl>
+  </w:abstractNum>
+  <w:abstractNum w:abstractNumId="12" w15:restartNumberingAfterBreak="0">
     <w:nsid w:val="3EAC11DF"/>
     <w:multiLevelType w:val="multilevel"/>
-    <w:tmpl w:val="DF069A3A"/>
+    <w:tmpl w:val="6ED68670"/>
     <w:lvl w:ilvl="0">
       <w:start w:val="1"/>
       <w:numFmt w:val="bullet"/>
@@ -8728,20 +10588,18 @@
         <w:rFonts w:hint="default"/>
       </w:rPr>
     </w:lvl>
-    <w:lvl w:ilvl="2" w:tentative="1">
-      <w:start w:val="1"/>
-      <w:numFmt w:val="bullet"/>
-      <w:lvlText w:val=""/>
-      <w:lvlJc w:val="left"/>
-      <w:pPr>
-        <w:tabs>
-          <w:tab w:val="num" w:pos="2160"/>
-        </w:tabs>
-        <w:ind w:left="2160" w:hanging="360"/>
-      </w:pPr>
-      <w:rPr>
-        <w:rFonts w:ascii="Wingdings" w:hAnsi="Wingdings" w:hint="default"/>
-        <w:sz w:val="20"/>
+    <w:lvl w:ilvl="2">
+      <w:start w:val="1"/>
+      <w:numFmt w:val="decimalZero"/>
+      <w:lvlText w:val="%3"/>
+      <w:lvlJc w:val="left"/>
+      <w:pPr>
+        <w:ind w:left="2280" w:hanging="480"/>
+      </w:pPr>
+      <w:rPr>
+        <w:rFonts w:hint="default"/>
+        <w:b/>
+        <w:color w:val="0000DD"/>
       </w:rPr>
     </w:lvl>
     <w:lvl w:ilvl="3" w:tentative="1">
@@ -8841,7 +10699,7 @@
       </w:rPr>
     </w:lvl>
   </w:abstractNum>
-  <w:abstractNum w:abstractNumId="8" w15:restartNumberingAfterBreak="0">
+  <w:abstractNum w:abstractNumId="13" w15:restartNumberingAfterBreak="0">
     <w:nsid w:val="40694051"/>
     <w:multiLevelType w:val="multilevel"/>
     <w:tmpl w:val="53FC7284"/>
@@ -8990,7 +10848,7 @@
       </w:rPr>
     </w:lvl>
   </w:abstractNum>
-  <w:abstractNum w:abstractNumId="9" w15:restartNumberingAfterBreak="0">
+  <w:abstractNum w:abstractNumId="14" w15:restartNumberingAfterBreak="0">
     <w:nsid w:val="429626AE"/>
     <w:multiLevelType w:val="multilevel"/>
     <w:tmpl w:val="3DA2FB52"/>
@@ -9139,7 +10997,7 @@
       </w:rPr>
     </w:lvl>
   </w:abstractNum>
-  <w:abstractNum w:abstractNumId="10" w15:restartNumberingAfterBreak="0">
+  <w:abstractNum w:abstractNumId="15" w15:restartNumberingAfterBreak="0">
     <w:nsid w:val="4EB25B86"/>
     <w:multiLevelType w:val="multilevel"/>
     <w:tmpl w:val="DB7CD2E0"/>
@@ -9288,7 +11146,7 @@
       </w:rPr>
     </w:lvl>
   </w:abstractNum>
-  <w:abstractNum w:abstractNumId="11" w15:restartNumberingAfterBreak="0">
+  <w:abstractNum w:abstractNumId="16" w15:restartNumberingAfterBreak="0">
     <w:nsid w:val="517416BA"/>
     <w:multiLevelType w:val="multilevel"/>
     <w:tmpl w:val="2AD2165C"/>
@@ -9437,7 +11295,305 @@
       </w:rPr>
     </w:lvl>
   </w:abstractNum>
-  <w:abstractNum w:abstractNumId="12" w15:restartNumberingAfterBreak="0">
+  <w:abstractNum w:abstractNumId="17" w15:restartNumberingAfterBreak="0">
+    <w:nsid w:val="543B30C5"/>
+    <w:multiLevelType w:val="multilevel"/>
+    <w:tmpl w:val="89561D3E"/>
+    <w:lvl w:ilvl="0">
+      <w:start w:val="1"/>
+      <w:numFmt w:val="bullet"/>
+      <w:lvlText w:val=""/>
+      <w:lvlJc w:val="left"/>
+      <w:pPr>
+        <w:tabs>
+          <w:tab w:val="num" w:pos="720"/>
+        </w:tabs>
+        <w:ind w:left="720" w:hanging="360"/>
+      </w:pPr>
+      <w:rPr>
+        <w:rFonts w:ascii="Symbol" w:hAnsi="Symbol" w:hint="default"/>
+        <w:sz w:val="20"/>
+      </w:rPr>
+    </w:lvl>
+    <w:lvl w:ilvl="1" w:tentative="1">
+      <w:start w:val="1"/>
+      <w:numFmt w:val="bullet"/>
+      <w:lvlText w:val="o"/>
+      <w:lvlJc w:val="left"/>
+      <w:pPr>
+        <w:tabs>
+          <w:tab w:val="num" w:pos="1440"/>
+        </w:tabs>
+        <w:ind w:left="1440" w:hanging="360"/>
+      </w:pPr>
+      <w:rPr>
+        <w:rFonts w:ascii="Courier New" w:hAnsi="Courier New" w:hint="default"/>
+        <w:sz w:val="20"/>
+      </w:rPr>
+    </w:lvl>
+    <w:lvl w:ilvl="2" w:tentative="1">
+      <w:start w:val="1"/>
+      <w:numFmt w:val="bullet"/>
+      <w:lvlText w:val=""/>
+      <w:lvlJc w:val="left"/>
+      <w:pPr>
+        <w:tabs>
+          <w:tab w:val="num" w:pos="2160"/>
+        </w:tabs>
+        <w:ind w:left="2160" w:hanging="360"/>
+      </w:pPr>
+      <w:rPr>
+        <w:rFonts w:ascii="Wingdings" w:hAnsi="Wingdings" w:hint="default"/>
+        <w:sz w:val="20"/>
+      </w:rPr>
+    </w:lvl>
+    <w:lvl w:ilvl="3" w:tentative="1">
+      <w:start w:val="1"/>
+      <w:numFmt w:val="bullet"/>
+      <w:lvlText w:val=""/>
+      <w:lvlJc w:val="left"/>
+      <w:pPr>
+        <w:tabs>
+          <w:tab w:val="num" w:pos="2880"/>
+        </w:tabs>
+        <w:ind w:left="2880" w:hanging="360"/>
+      </w:pPr>
+      <w:rPr>
+        <w:rFonts w:ascii="Wingdings" w:hAnsi="Wingdings" w:hint="default"/>
+        <w:sz w:val="20"/>
+      </w:rPr>
+    </w:lvl>
+    <w:lvl w:ilvl="4" w:tentative="1">
+      <w:start w:val="1"/>
+      <w:numFmt w:val="bullet"/>
+      <w:lvlText w:val=""/>
+      <w:lvlJc w:val="left"/>
+      <w:pPr>
+        <w:tabs>
+          <w:tab w:val="num" w:pos="3600"/>
+        </w:tabs>
+        <w:ind w:left="3600" w:hanging="360"/>
+      </w:pPr>
+      <w:rPr>
+        <w:rFonts w:ascii="Wingdings" w:hAnsi="Wingdings" w:hint="default"/>
+        <w:sz w:val="20"/>
+      </w:rPr>
+    </w:lvl>
+    <w:lvl w:ilvl="5" w:tentative="1">
+      <w:start w:val="1"/>
+      <w:numFmt w:val="bullet"/>
+      <w:lvlText w:val=""/>
+      <w:lvlJc w:val="left"/>
+      <w:pPr>
+        <w:tabs>
+          <w:tab w:val="num" w:pos="4320"/>
+        </w:tabs>
+        <w:ind w:left="4320" w:hanging="360"/>
+      </w:pPr>
+      <w:rPr>
+        <w:rFonts w:ascii="Wingdings" w:hAnsi="Wingdings" w:hint="default"/>
+        <w:sz w:val="20"/>
+      </w:rPr>
+    </w:lvl>
+    <w:lvl w:ilvl="6" w:tentative="1">
+      <w:start w:val="1"/>
+      <w:numFmt w:val="bullet"/>
+      <w:lvlText w:val=""/>
+      <w:lvlJc w:val="left"/>
+      <w:pPr>
+        <w:tabs>
+          <w:tab w:val="num" w:pos="5040"/>
+        </w:tabs>
+        <w:ind w:left="5040" w:hanging="360"/>
+      </w:pPr>
+      <w:rPr>
+        <w:rFonts w:ascii="Wingdings" w:hAnsi="Wingdings" w:hint="default"/>
+        <w:sz w:val="20"/>
+      </w:rPr>
+    </w:lvl>
+    <w:lvl w:ilvl="7" w:tentative="1">
+      <w:start w:val="1"/>
+      <w:numFmt w:val="bullet"/>
+      <w:lvlText w:val=""/>
+      <w:lvlJc w:val="left"/>
+      <w:pPr>
+        <w:tabs>
+          <w:tab w:val="num" w:pos="5760"/>
+        </w:tabs>
+        <w:ind w:left="5760" w:hanging="360"/>
+      </w:pPr>
+      <w:rPr>
+        <w:rFonts w:ascii="Wingdings" w:hAnsi="Wingdings" w:hint="default"/>
+        <w:sz w:val="20"/>
+      </w:rPr>
+    </w:lvl>
+    <w:lvl w:ilvl="8" w:tentative="1">
+      <w:start w:val="1"/>
+      <w:numFmt w:val="bullet"/>
+      <w:lvlText w:val=""/>
+      <w:lvlJc w:val="left"/>
+      <w:pPr>
+        <w:tabs>
+          <w:tab w:val="num" w:pos="6480"/>
+        </w:tabs>
+        <w:ind w:left="6480" w:hanging="360"/>
+      </w:pPr>
+      <w:rPr>
+        <w:rFonts w:ascii="Wingdings" w:hAnsi="Wingdings" w:hint="default"/>
+        <w:sz w:val="20"/>
+      </w:rPr>
+    </w:lvl>
+  </w:abstractNum>
+  <w:abstractNum w:abstractNumId="18" w15:restartNumberingAfterBreak="0">
+    <w:nsid w:val="5F34179F"/>
+    <w:multiLevelType w:val="multilevel"/>
+    <w:tmpl w:val="B8FABEBA"/>
+    <w:lvl w:ilvl="0">
+      <w:start w:val="1"/>
+      <w:numFmt w:val="bullet"/>
+      <w:lvlText w:val=""/>
+      <w:lvlJc w:val="left"/>
+      <w:pPr>
+        <w:tabs>
+          <w:tab w:val="num" w:pos="720"/>
+        </w:tabs>
+        <w:ind w:left="720" w:hanging="360"/>
+      </w:pPr>
+      <w:rPr>
+        <w:rFonts w:ascii="Symbol" w:hAnsi="Symbol" w:hint="default"/>
+        <w:sz w:val="20"/>
+      </w:rPr>
+    </w:lvl>
+    <w:lvl w:ilvl="1" w:tentative="1">
+      <w:start w:val="1"/>
+      <w:numFmt w:val="bullet"/>
+      <w:lvlText w:val="o"/>
+      <w:lvlJc w:val="left"/>
+      <w:pPr>
+        <w:tabs>
+          <w:tab w:val="num" w:pos="1440"/>
+        </w:tabs>
+        <w:ind w:left="1440" w:hanging="360"/>
+      </w:pPr>
+      <w:rPr>
+        <w:rFonts w:ascii="Courier New" w:hAnsi="Courier New" w:hint="default"/>
+        <w:sz w:val="20"/>
+      </w:rPr>
+    </w:lvl>
+    <w:lvl w:ilvl="2" w:tentative="1">
+      <w:start w:val="1"/>
+      <w:numFmt w:val="bullet"/>
+      <w:lvlText w:val=""/>
+      <w:lvlJc w:val="left"/>
+      <w:pPr>
+        <w:tabs>
+          <w:tab w:val="num" w:pos="2160"/>
+        </w:tabs>
+        <w:ind w:left="2160" w:hanging="360"/>
+      </w:pPr>
+      <w:rPr>
+        <w:rFonts w:ascii="Wingdings" w:hAnsi="Wingdings" w:hint="default"/>
+        <w:sz w:val="20"/>
+      </w:rPr>
+    </w:lvl>
+    <w:lvl w:ilvl="3" w:tentative="1">
+      <w:start w:val="1"/>
+      <w:numFmt w:val="bullet"/>
+      <w:lvlText w:val=""/>
+      <w:lvlJc w:val="left"/>
+      <w:pPr>
+        <w:tabs>
+          <w:tab w:val="num" w:pos="2880"/>
+        </w:tabs>
+        <w:ind w:left="2880" w:hanging="360"/>
+      </w:pPr>
+      <w:rPr>
+        <w:rFonts w:ascii="Wingdings" w:hAnsi="Wingdings" w:hint="default"/>
+        <w:sz w:val="20"/>
+      </w:rPr>
+    </w:lvl>
+    <w:lvl w:ilvl="4" w:tentative="1">
+      <w:start w:val="1"/>
+      <w:numFmt w:val="bullet"/>
+      <w:lvlText w:val=""/>
+      <w:lvlJc w:val="left"/>
+      <w:pPr>
+        <w:tabs>
+          <w:tab w:val="num" w:pos="3600"/>
+        </w:tabs>
+        <w:ind w:left="3600" w:hanging="360"/>
+      </w:pPr>
+      <w:rPr>
+        <w:rFonts w:ascii="Wingdings" w:hAnsi="Wingdings" w:hint="default"/>
+        <w:sz w:val="20"/>
+      </w:rPr>
+    </w:lvl>
+    <w:lvl w:ilvl="5" w:tentative="1">
+      <w:start w:val="1"/>
+      <w:numFmt w:val="bullet"/>
+      <w:lvlText w:val=""/>
+      <w:lvlJc w:val="left"/>
+      <w:pPr>
+        <w:tabs>
+          <w:tab w:val="num" w:pos="4320"/>
+        </w:tabs>
+        <w:ind w:left="4320" w:hanging="360"/>
+      </w:pPr>
+      <w:rPr>
+        <w:rFonts w:ascii="Wingdings" w:hAnsi="Wingdings" w:hint="default"/>
+        <w:sz w:val="20"/>
+      </w:rPr>
+    </w:lvl>
+    <w:lvl w:ilvl="6" w:tentative="1">
+      <w:start w:val="1"/>
+      <w:numFmt w:val="bullet"/>
+      <w:lvlText w:val=""/>
+      <w:lvlJc w:val="left"/>
+      <w:pPr>
+        <w:tabs>
+          <w:tab w:val="num" w:pos="5040"/>
+        </w:tabs>
+        <w:ind w:left="5040" w:hanging="360"/>
+      </w:pPr>
+      <w:rPr>
+        <w:rFonts w:ascii="Wingdings" w:hAnsi="Wingdings" w:hint="default"/>
+        <w:sz w:val="20"/>
+      </w:rPr>
+    </w:lvl>
+    <w:lvl w:ilvl="7" w:tentative="1">
+      <w:start w:val="1"/>
+      <w:numFmt w:val="bullet"/>
+      <w:lvlText w:val=""/>
+      <w:lvlJc w:val="left"/>
+      <w:pPr>
+        <w:tabs>
+          <w:tab w:val="num" w:pos="5760"/>
+        </w:tabs>
+        <w:ind w:left="5760" w:hanging="360"/>
+      </w:pPr>
+      <w:rPr>
+        <w:rFonts w:ascii="Wingdings" w:hAnsi="Wingdings" w:hint="default"/>
+        <w:sz w:val="20"/>
+      </w:rPr>
+    </w:lvl>
+    <w:lvl w:ilvl="8" w:tentative="1">
+      <w:start w:val="1"/>
+      <w:numFmt w:val="bullet"/>
+      <w:lvlText w:val=""/>
+      <w:lvlJc w:val="left"/>
+      <w:pPr>
+        <w:tabs>
+          <w:tab w:val="num" w:pos="6480"/>
+        </w:tabs>
+        <w:ind w:left="6480" w:hanging="360"/>
+      </w:pPr>
+      <w:rPr>
+        <w:rFonts w:ascii="Wingdings" w:hAnsi="Wingdings" w:hint="default"/>
+        <w:sz w:val="20"/>
+      </w:rPr>
+    </w:lvl>
+  </w:abstractNum>
+  <w:abstractNum w:abstractNumId="19" w15:restartNumberingAfterBreak="0">
     <w:nsid w:val="663963AA"/>
     <w:multiLevelType w:val="multilevel"/>
     <w:tmpl w:val="5A3E6326"/>
@@ -9586,7 +11742,7 @@
       </w:rPr>
     </w:lvl>
   </w:abstractNum>
-  <w:abstractNum w:abstractNumId="13" w15:restartNumberingAfterBreak="0">
+  <w:abstractNum w:abstractNumId="20" w15:restartNumberingAfterBreak="0">
     <w:nsid w:val="66702AFB"/>
     <w:multiLevelType w:val="multilevel"/>
     <w:tmpl w:val="4A74C298"/>
@@ -9735,7 +11891,7 @@
       </w:rPr>
     </w:lvl>
   </w:abstractNum>
-  <w:abstractNum w:abstractNumId="14" w15:restartNumberingAfterBreak="0">
+  <w:abstractNum w:abstractNumId="21" w15:restartNumberingAfterBreak="0">
     <w:nsid w:val="74A24D06"/>
     <w:multiLevelType w:val="multilevel"/>
     <w:tmpl w:val="464430F8"/>
@@ -9884,7 +12040,7 @@
       </w:rPr>
     </w:lvl>
   </w:abstractNum>
-  <w:abstractNum w:abstractNumId="15" w15:restartNumberingAfterBreak="0">
+  <w:abstractNum w:abstractNumId="22" w15:restartNumberingAfterBreak="0">
     <w:nsid w:val="7B0B22B3"/>
     <w:multiLevelType w:val="multilevel"/>
     <w:tmpl w:val="E6C83DE2"/>
@@ -10033,7 +12189,7 @@
       </w:rPr>
     </w:lvl>
   </w:abstractNum>
-  <w:abstractNum w:abstractNumId="16" w15:restartNumberingAfterBreak="0">
+  <w:abstractNum w:abstractNumId="23" w15:restartNumberingAfterBreak="0">
     <w:nsid w:val="7B6228EF"/>
     <w:multiLevelType w:val="multilevel"/>
     <w:tmpl w:val="04D49FFA"/>
@@ -10182,7 +12338,7 @@
       </w:rPr>
     </w:lvl>
   </w:abstractNum>
-  <w:abstractNum w:abstractNumId="17" w15:restartNumberingAfterBreak="0">
+  <w:abstractNum w:abstractNumId="24" w15:restartNumberingAfterBreak="0">
     <w:nsid w:val="7F5D5E29"/>
     <w:multiLevelType w:val="multilevel"/>
     <w:tmpl w:val="0514394C"/>
@@ -10332,58 +12488,79 @@
     </w:lvl>
   </w:abstractNum>
   <w:num w:numId="1">
+    <w:abstractNumId w:val="2"/>
+  </w:num>
+  <w:num w:numId="2">
+    <w:abstractNumId w:val="15"/>
+  </w:num>
+  <w:num w:numId="3">
+    <w:abstractNumId w:val="5"/>
+  </w:num>
+  <w:num w:numId="4">
+    <w:abstractNumId w:val="19"/>
+  </w:num>
+  <w:num w:numId="5">
+    <w:abstractNumId w:val="8"/>
+  </w:num>
+  <w:num w:numId="6">
+    <w:abstractNumId w:val="21"/>
+  </w:num>
+  <w:num w:numId="7">
+    <w:abstractNumId w:val="24"/>
+  </w:num>
+  <w:num w:numId="8">
+    <w:abstractNumId w:val="4"/>
+  </w:num>
+  <w:num w:numId="9">
+    <w:abstractNumId w:val="14"/>
+  </w:num>
+  <w:num w:numId="10">
+    <w:abstractNumId w:val="10"/>
+  </w:num>
+  <w:num w:numId="11">
+    <w:abstractNumId w:val="16"/>
+  </w:num>
+  <w:num w:numId="12">
+    <w:abstractNumId w:val="12"/>
+  </w:num>
+  <w:num w:numId="13">
+    <w:abstractNumId w:val="20"/>
+  </w:num>
+  <w:num w:numId="14">
+    <w:abstractNumId w:val="7"/>
+  </w:num>
+  <w:num w:numId="15">
+    <w:abstractNumId w:val="23"/>
+  </w:num>
+  <w:num w:numId="16">
+    <w:abstractNumId w:val="13"/>
+  </w:num>
+  <w:num w:numId="17">
+    <w:abstractNumId w:val="6"/>
+  </w:num>
+  <w:num w:numId="18">
+    <w:abstractNumId w:val="22"/>
+  </w:num>
+  <w:num w:numId="19">
+    <w:abstractNumId w:val="17"/>
+  </w:num>
+  <w:num w:numId="20">
+    <w:abstractNumId w:val="11"/>
+  </w:num>
+  <w:num w:numId="21">
+    <w:abstractNumId w:val="1"/>
+  </w:num>
+  <w:num w:numId="22">
+    <w:abstractNumId w:val="9"/>
+  </w:num>
+  <w:num w:numId="23">
     <w:abstractNumId w:val="0"/>
   </w:num>
-  <w:num w:numId="2">
-    <w:abstractNumId w:val="10"/>
+  <w:num w:numId="24">
+    <w:abstractNumId w:val="18"/>
   </w:num>
-  <w:num w:numId="3">
-    <w:abstractNumId w:val="2"/>
-  </w:num>
-  <w:num w:numId="4">
-    <w:abstractNumId w:val="12"/>
-  </w:num>
-  <w:num w:numId="5">
-    <w:abstractNumId w:val="5"/>
-  </w:num>
-  <w:num w:numId="6">
-    <w:abstractNumId w:val="14"/>
-  </w:num>
-  <w:num w:numId="7">
-    <w:abstractNumId w:val="17"/>
-  </w:num>
-  <w:num w:numId="8">
-    <w:abstractNumId w:val="1"/>
-  </w:num>
-  <w:num w:numId="9">
-    <w:abstractNumId w:val="9"/>
-  </w:num>
-  <w:num w:numId="10">
-    <w:abstractNumId w:val="6"/>
-  </w:num>
-  <w:num w:numId="11">
-    <w:abstractNumId w:val="11"/>
-  </w:num>
-  <w:num w:numId="12">
-    <w:abstractNumId w:val="7"/>
-  </w:num>
-  <w:num w:numId="13">
-    <w:abstractNumId w:val="13"/>
-  </w:num>
-  <w:num w:numId="14">
-    <w:abstractNumId w:val="4"/>
-  </w:num>
-  <w:num w:numId="15">
-    <w:abstractNumId w:val="16"/>
-  </w:num>
-  <w:num w:numId="16">
-    <w:abstractNumId w:val="8"/>
-  </w:num>
-  <w:num w:numId="17">
+  <w:num w:numId="25">
     <w:abstractNumId w:val="3"/>
-  </w:num>
-  <w:num w:numId="18">
-    <w:abstractNumId w:val="15"/>
   </w:num>
 </w:numbering>
 </file>
@@ -10923,7 +13100,6 @@
     <w:name w:val="Normal (Web)"/>
     <w:basedOn w:val="Normal"/>
     <w:uiPriority w:val="99"/>
-    <w:semiHidden/>
     <w:unhideWhenUsed/>
     <w:rsid w:val="00907795"/>
     <w:pPr>

</xml_diff>

<commit_message>
add new files and examples
add new files asociated with concpets basics as definitons of spaces zeroes filler and others
</commit_message>
<xml_diff>
--- a/Teoria/03 Variables Constantes Tipos de datos/03 Variables Constantes Tipos de datos.docx
+++ b/Teoria/03 Variables Constantes Tipos de datos/03 Variables Constantes Tipos de datos.docx
@@ -1310,7 +1310,7 @@
           <w:rFonts w:ascii="Courier New" w:eastAsia="Times New Roman" w:hAnsi="Courier New" w:cs="Courier New"/>
           <w:sz w:val="20"/>
           <w:szCs w:val="20"/>
-          <w:lang w:val="en-US" w:eastAsia="es-CO"/>
+          <w:lang w:eastAsia="es-CO"/>
         </w:rPr>
         <w:t>IDENTIFICATION DIVISION.</w:t>
       </w:r>
@@ -1319,26 +1319,17 @@
           <w:rFonts w:ascii="Courier New" w:eastAsia="Times New Roman" w:hAnsi="Courier New" w:cs="Courier New"/>
           <w:sz w:val="20"/>
           <w:szCs w:val="20"/>
-          <w:lang w:val="en-US" w:eastAsia="es-CO"/>
+          <w:lang w:eastAsia="es-CO"/>
         </w:rPr>
         <w:br/>
-        <w:t xml:space="preserve">PROGRAM-ID. </w:t>
-      </w:r>
-      <w:r>
-        <w:rPr>
-          <w:rFonts w:ascii="Courier New" w:eastAsia="Times New Roman" w:hAnsi="Courier New" w:cs="Courier New"/>
-          <w:sz w:val="20"/>
-          <w:szCs w:val="20"/>
-          <w:lang w:val="en-US" w:eastAsia="es-CO"/>
-        </w:rPr>
-        <w:t>EJEMPLO.</w:t>
-      </w:r>
-      <w:r>
-        <w:rPr>
-          <w:rFonts w:ascii="Courier New" w:eastAsia="Times New Roman" w:hAnsi="Courier New" w:cs="Courier New"/>
-          <w:sz w:val="20"/>
-          <w:szCs w:val="20"/>
-          <w:lang w:val="en-US" w:eastAsia="es-CO"/>
+        <w:t>PROGRAM-ID. EJEMPLO.</w:t>
+      </w:r>
+      <w:r>
+        <w:rPr>
+          <w:rFonts w:ascii="Courier New" w:eastAsia="Times New Roman" w:hAnsi="Courier New" w:cs="Courier New"/>
+          <w:sz w:val="20"/>
+          <w:szCs w:val="20"/>
+          <w:lang w:eastAsia="es-CO"/>
         </w:rPr>
         <w:br/>
       </w:r>
@@ -1347,7 +1338,7 @@
           <w:rFonts w:ascii="Courier New" w:eastAsia="Times New Roman" w:hAnsi="Courier New" w:cs="Courier New"/>
           <w:sz w:val="20"/>
           <w:szCs w:val="20"/>
-          <w:lang w:val="en-US" w:eastAsia="es-CO"/>
+          <w:lang w:eastAsia="es-CO"/>
         </w:rPr>
         <w:br/>
         <w:t>DATA DIVISION.</w:t>
@@ -1357,7 +1348,7 @@
           <w:rFonts w:ascii="Courier New" w:eastAsia="Times New Roman" w:hAnsi="Courier New" w:cs="Courier New"/>
           <w:sz w:val="20"/>
           <w:szCs w:val="20"/>
-          <w:lang w:val="en-US" w:eastAsia="es-CO"/>
+          <w:lang w:eastAsia="es-CO"/>
         </w:rPr>
         <w:br/>
         <w:t>WORKING-STORAGE SECTION.</w:t>
@@ -1367,7 +1358,7 @@
           <w:rFonts w:ascii="Courier New" w:eastAsia="Times New Roman" w:hAnsi="Courier New" w:cs="Courier New"/>
           <w:sz w:val="20"/>
           <w:szCs w:val="20"/>
-          <w:lang w:val="en-US" w:eastAsia="es-CO"/>
+          <w:lang w:eastAsia="es-CO"/>
         </w:rPr>
         <w:br/>
       </w:r>
@@ -8756,6 +8747,1253 @@
       </w:r>
     </w:p>
     <w:p/>
+    <w:p>
+      <w:pPr>
+        <w:pStyle w:val="NormalWeb"/>
+      </w:pPr>
+    </w:p>
+    <w:p>
+      <w:pPr>
+        <w:pStyle w:val="NormalWeb"/>
+      </w:pPr>
+    </w:p>
+    <w:p>
+      <w:pPr>
+        <w:pStyle w:val="Ttulo1"/>
+      </w:pPr>
+      <w:r>
+        <w:rPr>
+          <w:rStyle w:val="CdigoHTML"/>
+          <w:rFonts w:eastAsiaTheme="majorEastAsia"/>
+        </w:rPr>
+        <w:lastRenderedPageBreak/>
+        <w:t>FILLER</w:t>
+      </w:r>
+      <w:r>
+        <w:t xml:space="preserve"> </w:t>
+      </w:r>
+    </w:p>
+    <w:p>
+      <w:pPr>
+        <w:pStyle w:val="NormalWeb"/>
+      </w:pPr>
+      <w:r>
+        <w:t xml:space="preserve">En </w:t>
+      </w:r>
+      <w:r>
+        <w:rPr>
+          <w:rStyle w:val="Textoennegrita"/>
+        </w:rPr>
+        <w:t>COBOL</w:t>
+      </w:r>
+      <w:r>
+        <w:t xml:space="preserve">, </w:t>
+      </w:r>
+      <w:r>
+        <w:rPr>
+          <w:rStyle w:val="CdigoHTML"/>
+        </w:rPr>
+        <w:t>FILLER</w:t>
+      </w:r>
+      <w:r>
+        <w:t xml:space="preserve"> es una palabra reservada que se usa para definir campos </w:t>
+      </w:r>
+      <w:r>
+        <w:rPr>
+          <w:rStyle w:val="Textoennegrita"/>
+        </w:rPr>
+        <w:t>sin nombre</w:t>
+      </w:r>
+      <w:r>
+        <w:t xml:space="preserve"> dentro de una estructura de datos (normalmente en la </w:t>
+      </w:r>
+      <w:r>
+        <w:rPr>
+          <w:rStyle w:val="CdigoHTML"/>
+        </w:rPr>
+        <w:t>DATA DIVISION</w:t>
+      </w:r>
+      <w:r>
+        <w:t>).</w:t>
+      </w:r>
+    </w:p>
+    <w:p>
+      <w:pPr>
+        <w:pStyle w:val="NormalWeb"/>
+      </w:pPr>
+      <w:r>
+        <w:t>Sirve para ocupar espacio, alinear datos o ignorar partes de un registro que no necesitas procesar.</w:t>
+      </w:r>
+    </w:p>
+    <w:p>
+      <w:r>
+        <w:pict w14:anchorId="46DF12D6">
+          <v:rect id="_x0000_i1058" style="width:0;height:1.5pt" o:hralign="center" o:hrstd="t" o:hr="t" fillcolor="#a0a0a0" stroked="f"/>
+        </w:pict>
+      </w:r>
+    </w:p>
+    <w:p>
+      <w:pPr>
+        <w:pStyle w:val="Ttulo2"/>
+      </w:pPr>
+      <w:r>
+        <w:rPr>
+          <w:rFonts w:ascii="Segoe UI Emoji" w:hAnsi="Segoe UI Emoji" w:cs="Segoe UI Emoji"/>
+        </w:rPr>
+        <w:t>🔹</w:t>
+      </w:r>
+      <w:r>
+        <w:t xml:space="preserve"> ¿Para qué se usa?</w:t>
+      </w:r>
+    </w:p>
+    <w:p>
+      <w:pPr>
+        <w:pStyle w:val="NormalWeb"/>
+        <w:numPr>
+          <w:ilvl w:val="0"/>
+          <w:numId w:val="26"/>
+        </w:numPr>
+      </w:pPr>
+      <w:r>
+        <w:t>Reservar espacio en un registro</w:t>
+      </w:r>
+    </w:p>
+    <w:p>
+      <w:pPr>
+        <w:pStyle w:val="NormalWeb"/>
+        <w:numPr>
+          <w:ilvl w:val="0"/>
+          <w:numId w:val="26"/>
+        </w:numPr>
+      </w:pPr>
+      <w:r>
+        <w:t>Ignorar campos de entrada/salida</w:t>
+      </w:r>
+    </w:p>
+    <w:p>
+      <w:pPr>
+        <w:pStyle w:val="NormalWeb"/>
+        <w:numPr>
+          <w:ilvl w:val="0"/>
+          <w:numId w:val="26"/>
+        </w:numPr>
+      </w:pPr>
+      <w:r>
+        <w:t>Alinear estructuras (por ejemplo, archivos fijos)</w:t>
+      </w:r>
+    </w:p>
+    <w:p>
+      <w:pPr>
+        <w:pStyle w:val="NormalWeb"/>
+        <w:numPr>
+          <w:ilvl w:val="0"/>
+          <w:numId w:val="26"/>
+        </w:numPr>
+      </w:pPr>
+      <w:r>
+        <w:t>Insertar separadores o constantes</w:t>
+      </w:r>
+    </w:p>
+    <w:p>
+      <w:r>
+        <w:pict w14:anchorId="76E27966">
+          <v:rect id="_x0000_i1059" style="width:0;height:1.5pt" o:hralign="center" o:hrstd="t" o:hr="t" fillcolor="#a0a0a0" stroked="f"/>
+        </w:pict>
+      </w:r>
+    </w:p>
+    <w:p>
+      <w:pPr>
+        <w:pStyle w:val="Ttulo2"/>
+      </w:pPr>
+      <w:r>
+        <w:rPr>
+          <w:rFonts w:ascii="Segoe UI Emoji" w:hAnsi="Segoe UI Emoji" w:cs="Segoe UI Emoji"/>
+        </w:rPr>
+        <w:t>🔹</w:t>
+      </w:r>
+      <w:r>
+        <w:t xml:space="preserve"> Características</w:t>
+      </w:r>
+    </w:p>
+    <w:p>
+      <w:pPr>
+        <w:pStyle w:val="NormalWeb"/>
+        <w:numPr>
+          <w:ilvl w:val="0"/>
+          <w:numId w:val="27"/>
+        </w:numPr>
+      </w:pPr>
+      <w:r>
+        <w:t>No tiene nombre → no puedes referenciarlo en el código</w:t>
+      </w:r>
+    </w:p>
+    <w:p>
+      <w:pPr>
+        <w:pStyle w:val="NormalWeb"/>
+        <w:numPr>
+          <w:ilvl w:val="0"/>
+          <w:numId w:val="27"/>
+        </w:numPr>
+      </w:pPr>
+      <w:r>
+        <w:t>Solo ocupa memoria</w:t>
+      </w:r>
+    </w:p>
+    <w:p>
+      <w:pPr>
+        <w:pStyle w:val="NormalWeb"/>
+        <w:numPr>
+          <w:ilvl w:val="0"/>
+          <w:numId w:val="27"/>
+        </w:numPr>
+      </w:pPr>
+      <w:r>
+        <w:t>Puede tener valor (</w:t>
+      </w:r>
+      <w:r>
+        <w:rPr>
+          <w:rStyle w:val="CdigoHTML"/>
+        </w:rPr>
+        <w:t>VALUE</w:t>
+      </w:r>
+      <w:r>
+        <w:t>) o no</w:t>
+      </w:r>
+    </w:p>
+    <w:p>
+      <w:r>
+        <w:pict w14:anchorId="69584034">
+          <v:rect id="_x0000_i1060" style="width:0;height:1.5pt" o:hralign="center" o:hrstd="t" o:hr="t" fillcolor="#a0a0a0" stroked="f"/>
+        </w:pict>
+      </w:r>
+    </w:p>
+    <w:p>
+      <w:pPr>
+        <w:pStyle w:val="Ttulo2"/>
+      </w:pPr>
+      <w:r>
+        <w:rPr>
+          <w:rFonts w:ascii="Segoe UI Emoji" w:hAnsi="Segoe UI Emoji" w:cs="Segoe UI Emoji"/>
+        </w:rPr>
+        <w:t>🔹</w:t>
+      </w:r>
+      <w:r>
+        <w:t xml:space="preserve"> Ejemplo simple</w:t>
+      </w:r>
+    </w:p>
+    <w:p>
+      <w:pPr>
+        <w:tabs>
+          <w:tab w:val="left" w:pos="916"/>
+          <w:tab w:val="left" w:pos="1832"/>
+          <w:tab w:val="left" w:pos="2748"/>
+          <w:tab w:val="left" w:pos="3664"/>
+          <w:tab w:val="left" w:pos="4580"/>
+          <w:tab w:val="left" w:pos="5496"/>
+          <w:tab w:val="left" w:pos="6412"/>
+          <w:tab w:val="left" w:pos="7328"/>
+          <w:tab w:val="left" w:pos="8244"/>
+          <w:tab w:val="left" w:pos="9160"/>
+          <w:tab w:val="left" w:pos="10076"/>
+          <w:tab w:val="left" w:pos="10992"/>
+          <w:tab w:val="left" w:pos="11908"/>
+          <w:tab w:val="left" w:pos="12824"/>
+          <w:tab w:val="left" w:pos="13740"/>
+          <w:tab w:val="left" w:pos="14656"/>
+        </w:tabs>
+        <w:spacing w:after="0" w:line="244" w:lineRule="atLeast"/>
+        <w:rPr>
+          <w:rFonts w:ascii="Courier New" w:eastAsia="Times New Roman" w:hAnsi="Courier New" w:cs="Courier New"/>
+          <w:color w:val="333333"/>
+          <w:sz w:val="20"/>
+          <w:szCs w:val="20"/>
+          <w:lang w:eastAsia="es-CO"/>
+        </w:rPr>
+      </w:pPr>
+      <w:r>
+        <w:rPr>
+          <w:rFonts w:ascii="Courier New" w:eastAsia="Times New Roman" w:hAnsi="Courier New" w:cs="Courier New"/>
+          <w:color w:val="888888"/>
+          <w:sz w:val="20"/>
+          <w:szCs w:val="20"/>
+          <w:lang w:eastAsia="es-CO"/>
+        </w:rPr>
+        <w:t>01 REG</w:t>
+      </w:r>
+      <w:r>
+        <w:rPr>
+          <w:rFonts w:ascii="Courier New" w:eastAsia="Times New Roman" w:hAnsi="Courier New" w:cs="Courier New"/>
+          <w:color w:val="996633"/>
+          <w:sz w:val="20"/>
+          <w:szCs w:val="20"/>
+          <w:lang w:eastAsia="es-CO"/>
+        </w:rPr>
+        <w:t>ISTRO</w:t>
+      </w:r>
+      <w:r>
+        <w:rPr>
+          <w:rFonts w:ascii="Courier New" w:eastAsia="Times New Roman" w:hAnsi="Courier New" w:cs="Courier New"/>
+          <w:color w:val="333333"/>
+          <w:sz w:val="20"/>
+          <w:szCs w:val="20"/>
+          <w:lang w:eastAsia="es-CO"/>
+        </w:rPr>
+        <w:t>.</w:t>
+      </w:r>
+    </w:p>
+    <w:p>
+      <w:pPr>
+        <w:tabs>
+          <w:tab w:val="left" w:pos="916"/>
+          <w:tab w:val="left" w:pos="1832"/>
+          <w:tab w:val="left" w:pos="2748"/>
+          <w:tab w:val="left" w:pos="3664"/>
+          <w:tab w:val="left" w:pos="4580"/>
+          <w:tab w:val="left" w:pos="5496"/>
+          <w:tab w:val="left" w:pos="6412"/>
+          <w:tab w:val="left" w:pos="7328"/>
+          <w:tab w:val="left" w:pos="8244"/>
+          <w:tab w:val="left" w:pos="9160"/>
+          <w:tab w:val="left" w:pos="10076"/>
+          <w:tab w:val="left" w:pos="10992"/>
+          <w:tab w:val="left" w:pos="11908"/>
+          <w:tab w:val="left" w:pos="12824"/>
+          <w:tab w:val="left" w:pos="13740"/>
+          <w:tab w:val="left" w:pos="14656"/>
+        </w:tabs>
+        <w:spacing w:after="0" w:line="244" w:lineRule="atLeast"/>
+        <w:rPr>
+          <w:rFonts w:ascii="Courier New" w:eastAsia="Times New Roman" w:hAnsi="Courier New" w:cs="Courier New"/>
+          <w:color w:val="333333"/>
+          <w:sz w:val="20"/>
+          <w:szCs w:val="20"/>
+          <w:lang w:eastAsia="es-CO"/>
+        </w:rPr>
+      </w:pPr>
+      <w:r>
+        <w:rPr>
+          <w:rFonts w:ascii="Courier New" w:eastAsia="Times New Roman" w:hAnsi="Courier New" w:cs="Courier New"/>
+          <w:color w:val="888888"/>
+          <w:sz w:val="20"/>
+          <w:szCs w:val="20"/>
+          <w:lang w:eastAsia="es-CO"/>
+        </w:rPr>
+        <w:t xml:space="preserve">   05 </w:t>
+      </w:r>
+      <w:r>
+        <w:rPr>
+          <w:rFonts w:ascii="Courier New" w:eastAsia="Times New Roman" w:hAnsi="Courier New" w:cs="Courier New"/>
+          <w:color w:val="996633"/>
+          <w:sz w:val="20"/>
+          <w:szCs w:val="20"/>
+          <w:lang w:eastAsia="es-CO"/>
+        </w:rPr>
+        <w:t>NOMBRE</w:t>
+      </w:r>
+      <w:r>
+        <w:rPr>
+          <w:rFonts w:ascii="Courier New" w:eastAsia="Times New Roman" w:hAnsi="Courier New" w:cs="Courier New"/>
+          <w:color w:val="BBBBBB"/>
+          <w:sz w:val="20"/>
+          <w:szCs w:val="20"/>
+          <w:lang w:eastAsia="es-CO"/>
+        </w:rPr>
+        <w:t xml:space="preserve">     </w:t>
+      </w:r>
+      <w:r>
+        <w:rPr>
+          <w:rFonts w:ascii="Courier New" w:eastAsia="Times New Roman" w:hAnsi="Courier New" w:cs="Courier New"/>
+          <w:b/>
+          <w:bCs/>
+          <w:color w:val="333399"/>
+          <w:sz w:val="20"/>
+          <w:szCs w:val="20"/>
+          <w:lang w:eastAsia="es-CO"/>
+        </w:rPr>
+        <w:t>PIC A(10)</w:t>
+      </w:r>
+      <w:r>
+        <w:rPr>
+          <w:rFonts w:ascii="Courier New" w:eastAsia="Times New Roman" w:hAnsi="Courier New" w:cs="Courier New"/>
+          <w:color w:val="333333"/>
+          <w:sz w:val="20"/>
+          <w:szCs w:val="20"/>
+          <w:lang w:eastAsia="es-CO"/>
+        </w:rPr>
+        <w:t>.</w:t>
+      </w:r>
+    </w:p>
+    <w:p>
+      <w:pPr>
+        <w:tabs>
+          <w:tab w:val="left" w:pos="916"/>
+          <w:tab w:val="left" w:pos="1832"/>
+          <w:tab w:val="left" w:pos="2748"/>
+          <w:tab w:val="left" w:pos="3664"/>
+          <w:tab w:val="left" w:pos="4580"/>
+          <w:tab w:val="left" w:pos="5496"/>
+          <w:tab w:val="left" w:pos="6412"/>
+          <w:tab w:val="left" w:pos="7328"/>
+          <w:tab w:val="left" w:pos="8244"/>
+          <w:tab w:val="left" w:pos="9160"/>
+          <w:tab w:val="left" w:pos="10076"/>
+          <w:tab w:val="left" w:pos="10992"/>
+          <w:tab w:val="left" w:pos="11908"/>
+          <w:tab w:val="left" w:pos="12824"/>
+          <w:tab w:val="left" w:pos="13740"/>
+          <w:tab w:val="left" w:pos="14656"/>
+        </w:tabs>
+        <w:spacing w:after="0" w:line="244" w:lineRule="atLeast"/>
+        <w:rPr>
+          <w:rFonts w:ascii="Courier New" w:eastAsia="Times New Roman" w:hAnsi="Courier New" w:cs="Courier New"/>
+          <w:color w:val="333333"/>
+          <w:sz w:val="20"/>
+          <w:szCs w:val="20"/>
+          <w:lang w:eastAsia="es-CO"/>
+        </w:rPr>
+      </w:pPr>
+      <w:r>
+        <w:rPr>
+          <w:rFonts w:ascii="Courier New" w:eastAsia="Times New Roman" w:hAnsi="Courier New" w:cs="Courier New"/>
+          <w:color w:val="888888"/>
+          <w:sz w:val="20"/>
+          <w:szCs w:val="20"/>
+          <w:lang w:eastAsia="es-CO"/>
+        </w:rPr>
+        <w:t xml:space="preserve">   05 </w:t>
+      </w:r>
+      <w:r>
+        <w:rPr>
+          <w:rFonts w:ascii="Courier New" w:eastAsia="Times New Roman" w:hAnsi="Courier New" w:cs="Courier New"/>
+          <w:b/>
+          <w:bCs/>
+          <w:color w:val="003388"/>
+          <w:sz w:val="20"/>
+          <w:szCs w:val="20"/>
+          <w:lang w:eastAsia="es-CO"/>
+        </w:rPr>
+        <w:t xml:space="preserve">FILLER    </w:t>
+      </w:r>
+      <w:r>
+        <w:rPr>
+          <w:rFonts w:ascii="Courier New" w:eastAsia="Times New Roman" w:hAnsi="Courier New" w:cs="Courier New"/>
+          <w:color w:val="BBBBBB"/>
+          <w:sz w:val="20"/>
+          <w:szCs w:val="20"/>
+          <w:lang w:eastAsia="es-CO"/>
+        </w:rPr>
+        <w:t xml:space="preserve"> </w:t>
+      </w:r>
+      <w:r>
+        <w:rPr>
+          <w:rFonts w:ascii="Courier New" w:eastAsia="Times New Roman" w:hAnsi="Courier New" w:cs="Courier New"/>
+          <w:b/>
+          <w:bCs/>
+          <w:color w:val="333399"/>
+          <w:sz w:val="20"/>
+          <w:szCs w:val="20"/>
+          <w:lang w:eastAsia="es-CO"/>
+        </w:rPr>
+        <w:t>PIC X(5)</w:t>
+      </w:r>
+      <w:r>
+        <w:rPr>
+          <w:rFonts w:ascii="Courier New" w:eastAsia="Times New Roman" w:hAnsi="Courier New" w:cs="Courier New"/>
+          <w:color w:val="333333"/>
+          <w:sz w:val="20"/>
+          <w:szCs w:val="20"/>
+          <w:lang w:eastAsia="es-CO"/>
+        </w:rPr>
+        <w:t>.</w:t>
+      </w:r>
+    </w:p>
+    <w:p>
+      <w:pPr>
+        <w:tabs>
+          <w:tab w:val="left" w:pos="916"/>
+          <w:tab w:val="left" w:pos="1832"/>
+          <w:tab w:val="left" w:pos="2748"/>
+          <w:tab w:val="left" w:pos="3664"/>
+          <w:tab w:val="left" w:pos="4580"/>
+          <w:tab w:val="left" w:pos="5496"/>
+          <w:tab w:val="left" w:pos="6412"/>
+          <w:tab w:val="left" w:pos="7328"/>
+          <w:tab w:val="left" w:pos="8244"/>
+          <w:tab w:val="left" w:pos="9160"/>
+          <w:tab w:val="left" w:pos="10076"/>
+          <w:tab w:val="left" w:pos="10992"/>
+          <w:tab w:val="left" w:pos="11908"/>
+          <w:tab w:val="left" w:pos="12824"/>
+          <w:tab w:val="left" w:pos="13740"/>
+          <w:tab w:val="left" w:pos="14656"/>
+        </w:tabs>
+        <w:spacing w:after="0" w:line="244" w:lineRule="atLeast"/>
+        <w:rPr>
+          <w:rFonts w:ascii="Courier New" w:eastAsia="Times New Roman" w:hAnsi="Courier New" w:cs="Courier New"/>
+          <w:color w:val="333333"/>
+          <w:sz w:val="20"/>
+          <w:szCs w:val="20"/>
+          <w:lang w:eastAsia="es-CO"/>
+        </w:rPr>
+      </w:pPr>
+      <w:r>
+        <w:rPr>
+          <w:rFonts w:ascii="Courier New" w:eastAsia="Times New Roman" w:hAnsi="Courier New" w:cs="Courier New"/>
+          <w:color w:val="888888"/>
+          <w:sz w:val="20"/>
+          <w:szCs w:val="20"/>
+          <w:lang w:eastAsia="es-CO"/>
+        </w:rPr>
+        <w:t xml:space="preserve">   05 </w:t>
+      </w:r>
+      <w:r>
+        <w:rPr>
+          <w:rFonts w:ascii="Courier New" w:eastAsia="Times New Roman" w:hAnsi="Courier New" w:cs="Courier New"/>
+          <w:color w:val="996633"/>
+          <w:sz w:val="20"/>
+          <w:szCs w:val="20"/>
+          <w:lang w:eastAsia="es-CO"/>
+        </w:rPr>
+        <w:t>EDAD</w:t>
+      </w:r>
+      <w:r>
+        <w:rPr>
+          <w:rFonts w:ascii="Courier New" w:eastAsia="Times New Roman" w:hAnsi="Courier New" w:cs="Courier New"/>
+          <w:color w:val="BBBBBB"/>
+          <w:sz w:val="20"/>
+          <w:szCs w:val="20"/>
+          <w:lang w:eastAsia="es-CO"/>
+        </w:rPr>
+        <w:t xml:space="preserve">       </w:t>
+      </w:r>
+      <w:r>
+        <w:rPr>
+          <w:rFonts w:ascii="Courier New" w:eastAsia="Times New Roman" w:hAnsi="Courier New" w:cs="Courier New"/>
+          <w:b/>
+          <w:bCs/>
+          <w:color w:val="333399"/>
+          <w:sz w:val="20"/>
+          <w:szCs w:val="20"/>
+          <w:lang w:eastAsia="es-CO"/>
+        </w:rPr>
+        <w:t>PIC 99</w:t>
+      </w:r>
+      <w:r>
+        <w:rPr>
+          <w:rFonts w:ascii="Courier New" w:eastAsia="Times New Roman" w:hAnsi="Courier New" w:cs="Courier New"/>
+          <w:color w:val="333333"/>
+          <w:sz w:val="20"/>
+          <w:szCs w:val="20"/>
+          <w:lang w:eastAsia="es-CO"/>
+        </w:rPr>
+        <w:t>.</w:t>
+      </w:r>
+    </w:p>
+    <w:p>
+      <w:pPr>
+        <w:pStyle w:val="NormalWeb"/>
+      </w:pPr>
+      <w:r>
+        <w:rPr>
+          <w:rFonts w:ascii="Segoe UI Emoji" w:hAnsi="Segoe UI Emoji" w:cs="Segoe UI Emoji"/>
+        </w:rPr>
+        <w:t>👉</w:t>
+      </w:r>
+      <w:r>
+        <w:t xml:space="preserve"> Aquí:</w:t>
+      </w:r>
+    </w:p>
+    <w:p>
+      <w:pPr>
+        <w:pStyle w:val="NormalWeb"/>
+        <w:numPr>
+          <w:ilvl w:val="0"/>
+          <w:numId w:val="28"/>
+        </w:numPr>
+      </w:pPr>
+      <w:r>
+        <w:rPr>
+          <w:rStyle w:val="CdigoHTML"/>
+        </w:rPr>
+        <w:t>FILLER</w:t>
+      </w:r>
+      <w:r>
+        <w:t xml:space="preserve"> ocupa 5 caracteres</w:t>
+      </w:r>
+    </w:p>
+    <w:p>
+      <w:pPr>
+        <w:pStyle w:val="NormalWeb"/>
+        <w:numPr>
+          <w:ilvl w:val="0"/>
+          <w:numId w:val="28"/>
+        </w:numPr>
+      </w:pPr>
+      <w:r>
+        <w:t xml:space="preserve">No puedes usarlo en instrucciones como </w:t>
+      </w:r>
+      <w:r>
+        <w:rPr>
+          <w:rStyle w:val="CdigoHTML"/>
+        </w:rPr>
+        <w:t>DISPLAY</w:t>
+      </w:r>
+      <w:r>
+        <w:t xml:space="preserve"> o </w:t>
+      </w:r>
+      <w:r>
+        <w:rPr>
+          <w:rStyle w:val="CdigoHTML"/>
+        </w:rPr>
+        <w:t>MOVE</w:t>
+      </w:r>
+    </w:p>
+    <w:p>
+      <w:pPr>
+        <w:pStyle w:val="NormalWeb"/>
+        <w:numPr>
+          <w:ilvl w:val="0"/>
+          <w:numId w:val="28"/>
+        </w:numPr>
+      </w:pPr>
+      <w:r>
+        <w:t>Solo sirve como espacio intermedio</w:t>
+      </w:r>
+    </w:p>
+    <w:p>
+      <w:r>
+        <w:pict w14:anchorId="79A3F85C">
+          <v:rect id="_x0000_i1061" style="width:0;height:1.5pt" o:hralign="center" o:hrstd="t" o:hr="t" fillcolor="#a0a0a0" stroked="f"/>
+        </w:pict>
+      </w:r>
+    </w:p>
+    <w:p>
+      <w:pPr>
+        <w:pStyle w:val="Ttulo2"/>
+      </w:pPr>
+      <w:r>
+        <w:rPr>
+          <w:rFonts w:ascii="Segoe UI Emoji" w:hAnsi="Segoe UI Emoji" w:cs="Segoe UI Emoji"/>
+        </w:rPr>
+        <w:t>🔹</w:t>
+      </w:r>
+      <w:r>
+        <w:t xml:space="preserve"> Ejemplo práctico (archivo fijo)</w:t>
+      </w:r>
+    </w:p>
+    <w:p>
+      <w:pPr>
+        <w:tabs>
+          <w:tab w:val="left" w:pos="916"/>
+          <w:tab w:val="left" w:pos="1832"/>
+          <w:tab w:val="left" w:pos="2748"/>
+          <w:tab w:val="left" w:pos="3664"/>
+          <w:tab w:val="left" w:pos="4580"/>
+          <w:tab w:val="left" w:pos="5496"/>
+          <w:tab w:val="left" w:pos="6412"/>
+          <w:tab w:val="left" w:pos="7328"/>
+          <w:tab w:val="left" w:pos="8244"/>
+          <w:tab w:val="left" w:pos="9160"/>
+          <w:tab w:val="left" w:pos="10076"/>
+          <w:tab w:val="left" w:pos="10992"/>
+          <w:tab w:val="left" w:pos="11908"/>
+          <w:tab w:val="left" w:pos="12824"/>
+          <w:tab w:val="left" w:pos="13740"/>
+          <w:tab w:val="left" w:pos="14656"/>
+        </w:tabs>
+        <w:spacing w:after="0" w:line="244" w:lineRule="atLeast"/>
+        <w:rPr>
+          <w:rFonts w:ascii="Courier New" w:eastAsia="Times New Roman" w:hAnsi="Courier New" w:cs="Courier New"/>
+          <w:color w:val="333333"/>
+          <w:sz w:val="20"/>
+          <w:szCs w:val="20"/>
+          <w:lang w:val="en-US" w:eastAsia="es-CO"/>
+        </w:rPr>
+      </w:pPr>
+      <w:r>
+        <w:rPr>
+          <w:rFonts w:ascii="Courier New" w:eastAsia="Times New Roman" w:hAnsi="Courier New" w:cs="Courier New"/>
+          <w:color w:val="888888"/>
+          <w:sz w:val="20"/>
+          <w:szCs w:val="20"/>
+          <w:lang w:val="en-US" w:eastAsia="es-CO"/>
+        </w:rPr>
+        <w:t>01 CLI</w:t>
+      </w:r>
+      <w:r>
+        <w:rPr>
+          <w:rFonts w:ascii="Courier New" w:eastAsia="Times New Roman" w:hAnsi="Courier New" w:cs="Courier New"/>
+          <w:color w:val="996633"/>
+          <w:sz w:val="20"/>
+          <w:szCs w:val="20"/>
+          <w:lang w:val="en-US" w:eastAsia="es-CO"/>
+        </w:rPr>
+        <w:t>ENTE</w:t>
+      </w:r>
+      <w:r>
+        <w:rPr>
+          <w:rFonts w:ascii="Courier New" w:eastAsia="Times New Roman" w:hAnsi="Courier New" w:cs="Courier New"/>
+          <w:color w:val="333333"/>
+          <w:sz w:val="20"/>
+          <w:szCs w:val="20"/>
+          <w:lang w:val="en-US" w:eastAsia="es-CO"/>
+        </w:rPr>
+        <w:t>.</w:t>
+      </w:r>
+    </w:p>
+    <w:p>
+      <w:pPr>
+        <w:tabs>
+          <w:tab w:val="left" w:pos="916"/>
+          <w:tab w:val="left" w:pos="1832"/>
+          <w:tab w:val="left" w:pos="2748"/>
+          <w:tab w:val="left" w:pos="3664"/>
+          <w:tab w:val="left" w:pos="4580"/>
+          <w:tab w:val="left" w:pos="5496"/>
+          <w:tab w:val="left" w:pos="6412"/>
+          <w:tab w:val="left" w:pos="7328"/>
+          <w:tab w:val="left" w:pos="8244"/>
+          <w:tab w:val="left" w:pos="9160"/>
+          <w:tab w:val="left" w:pos="10076"/>
+          <w:tab w:val="left" w:pos="10992"/>
+          <w:tab w:val="left" w:pos="11908"/>
+          <w:tab w:val="left" w:pos="12824"/>
+          <w:tab w:val="left" w:pos="13740"/>
+          <w:tab w:val="left" w:pos="14656"/>
+        </w:tabs>
+        <w:spacing w:after="0" w:line="244" w:lineRule="atLeast"/>
+        <w:rPr>
+          <w:rFonts w:ascii="Courier New" w:eastAsia="Times New Roman" w:hAnsi="Courier New" w:cs="Courier New"/>
+          <w:color w:val="333333"/>
+          <w:sz w:val="20"/>
+          <w:szCs w:val="20"/>
+          <w:lang w:val="en-US" w:eastAsia="es-CO"/>
+        </w:rPr>
+      </w:pPr>
+      <w:r>
+        <w:rPr>
+          <w:rFonts w:ascii="Courier New" w:eastAsia="Times New Roman" w:hAnsi="Courier New" w:cs="Courier New"/>
+          <w:color w:val="888888"/>
+          <w:sz w:val="20"/>
+          <w:szCs w:val="20"/>
+          <w:lang w:val="en-US" w:eastAsia="es-CO"/>
+        </w:rPr>
+        <w:t xml:space="preserve">   05 </w:t>
+      </w:r>
+      <w:r>
+        <w:rPr>
+          <w:rFonts w:ascii="Courier New" w:eastAsia="Times New Roman" w:hAnsi="Courier New" w:cs="Courier New"/>
+          <w:b/>
+          <w:bCs/>
+          <w:color w:val="003388"/>
+          <w:sz w:val="20"/>
+          <w:szCs w:val="20"/>
+          <w:lang w:val="en-US" w:eastAsia="es-CO"/>
+        </w:rPr>
+        <w:t xml:space="preserve">ID        </w:t>
+      </w:r>
+      <w:r>
+        <w:rPr>
+          <w:rFonts w:ascii="Courier New" w:eastAsia="Times New Roman" w:hAnsi="Courier New" w:cs="Courier New"/>
+          <w:color w:val="BBBBBB"/>
+          <w:sz w:val="20"/>
+          <w:szCs w:val="20"/>
+          <w:lang w:val="en-US" w:eastAsia="es-CO"/>
+        </w:rPr>
+        <w:t xml:space="preserve"> </w:t>
+      </w:r>
+      <w:r>
+        <w:rPr>
+          <w:rFonts w:ascii="Courier New" w:eastAsia="Times New Roman" w:hAnsi="Courier New" w:cs="Courier New"/>
+          <w:b/>
+          <w:bCs/>
+          <w:color w:val="333399"/>
+          <w:sz w:val="20"/>
+          <w:szCs w:val="20"/>
+          <w:lang w:val="en-US" w:eastAsia="es-CO"/>
+        </w:rPr>
+        <w:t>PIC 9(5)</w:t>
+      </w:r>
+      <w:r>
+        <w:rPr>
+          <w:rFonts w:ascii="Courier New" w:eastAsia="Times New Roman" w:hAnsi="Courier New" w:cs="Courier New"/>
+          <w:color w:val="333333"/>
+          <w:sz w:val="20"/>
+          <w:szCs w:val="20"/>
+          <w:lang w:val="en-US" w:eastAsia="es-CO"/>
+        </w:rPr>
+        <w:t>.</w:t>
+      </w:r>
+    </w:p>
+    <w:p>
+      <w:pPr>
+        <w:tabs>
+          <w:tab w:val="left" w:pos="916"/>
+          <w:tab w:val="left" w:pos="1832"/>
+          <w:tab w:val="left" w:pos="2748"/>
+          <w:tab w:val="left" w:pos="3664"/>
+          <w:tab w:val="left" w:pos="4580"/>
+          <w:tab w:val="left" w:pos="5496"/>
+          <w:tab w:val="left" w:pos="6412"/>
+          <w:tab w:val="left" w:pos="7328"/>
+          <w:tab w:val="left" w:pos="8244"/>
+          <w:tab w:val="left" w:pos="9160"/>
+          <w:tab w:val="left" w:pos="10076"/>
+          <w:tab w:val="left" w:pos="10992"/>
+          <w:tab w:val="left" w:pos="11908"/>
+          <w:tab w:val="left" w:pos="12824"/>
+          <w:tab w:val="left" w:pos="13740"/>
+          <w:tab w:val="left" w:pos="14656"/>
+        </w:tabs>
+        <w:spacing w:after="0" w:line="244" w:lineRule="atLeast"/>
+        <w:rPr>
+          <w:rFonts w:ascii="Courier New" w:eastAsia="Times New Roman" w:hAnsi="Courier New" w:cs="Courier New"/>
+          <w:color w:val="333333"/>
+          <w:sz w:val="20"/>
+          <w:szCs w:val="20"/>
+          <w:lang w:val="en-US" w:eastAsia="es-CO"/>
+        </w:rPr>
+      </w:pPr>
+      <w:r>
+        <w:rPr>
+          <w:rFonts w:ascii="Courier New" w:eastAsia="Times New Roman" w:hAnsi="Courier New" w:cs="Courier New"/>
+          <w:color w:val="888888"/>
+          <w:sz w:val="20"/>
+          <w:szCs w:val="20"/>
+          <w:lang w:val="en-US" w:eastAsia="es-CO"/>
+        </w:rPr>
+        <w:t xml:space="preserve">   05 </w:t>
+      </w:r>
+      <w:r>
+        <w:rPr>
+          <w:rFonts w:ascii="Courier New" w:eastAsia="Times New Roman" w:hAnsi="Courier New" w:cs="Courier New"/>
+          <w:b/>
+          <w:bCs/>
+          <w:color w:val="003388"/>
+          <w:sz w:val="20"/>
+          <w:szCs w:val="20"/>
+          <w:lang w:val="en-US" w:eastAsia="es-CO"/>
+        </w:rPr>
+        <w:t xml:space="preserve">FILLER    </w:t>
+      </w:r>
+      <w:r>
+        <w:rPr>
+          <w:rFonts w:ascii="Courier New" w:eastAsia="Times New Roman" w:hAnsi="Courier New" w:cs="Courier New"/>
+          <w:color w:val="BBBBBB"/>
+          <w:sz w:val="20"/>
+          <w:szCs w:val="20"/>
+          <w:lang w:val="en-US" w:eastAsia="es-CO"/>
+        </w:rPr>
+        <w:t xml:space="preserve"> </w:t>
+      </w:r>
+      <w:r>
+        <w:rPr>
+          <w:rFonts w:ascii="Courier New" w:eastAsia="Times New Roman" w:hAnsi="Courier New" w:cs="Courier New"/>
+          <w:b/>
+          <w:bCs/>
+          <w:color w:val="333399"/>
+          <w:sz w:val="20"/>
+          <w:szCs w:val="20"/>
+          <w:lang w:val="en-US" w:eastAsia="es-CO"/>
+        </w:rPr>
+        <w:t>PIC X</w:t>
+      </w:r>
+      <w:r>
+        <w:rPr>
+          <w:rFonts w:ascii="Courier New" w:eastAsia="Times New Roman" w:hAnsi="Courier New" w:cs="Courier New"/>
+          <w:color w:val="BBBBBB"/>
+          <w:sz w:val="20"/>
+          <w:szCs w:val="20"/>
+          <w:lang w:val="en-US" w:eastAsia="es-CO"/>
+        </w:rPr>
+        <w:t xml:space="preserve"> </w:t>
+      </w:r>
+      <w:r>
+        <w:rPr>
+          <w:rFonts w:ascii="Courier New" w:eastAsia="Times New Roman" w:hAnsi="Courier New" w:cs="Courier New"/>
+          <w:b/>
+          <w:bCs/>
+          <w:color w:val="003388"/>
+          <w:sz w:val="20"/>
+          <w:szCs w:val="20"/>
+          <w:lang w:val="en-US" w:eastAsia="es-CO"/>
+        </w:rPr>
+        <w:t xml:space="preserve">VALUE </w:t>
+      </w:r>
+      <w:r>
+        <w:rPr>
+          <w:rFonts w:ascii="Courier New" w:eastAsia="Times New Roman" w:hAnsi="Courier New" w:cs="Courier New"/>
+          <w:color w:val="333333"/>
+          <w:sz w:val="20"/>
+          <w:szCs w:val="20"/>
+          <w:shd w:val="clear" w:color="auto" w:fill="FFF0F0"/>
+          <w:lang w:val="en-US" w:eastAsia="es-CO"/>
+        </w:rPr>
+        <w:t>'-'</w:t>
+      </w:r>
+      <w:r>
+        <w:rPr>
+          <w:rFonts w:ascii="Courier New" w:eastAsia="Times New Roman" w:hAnsi="Courier New" w:cs="Courier New"/>
+          <w:color w:val="333333"/>
+          <w:sz w:val="20"/>
+          <w:szCs w:val="20"/>
+          <w:lang w:val="en-US" w:eastAsia="es-CO"/>
+        </w:rPr>
+        <w:t>.</w:t>
+      </w:r>
+    </w:p>
+    <w:p>
+      <w:pPr>
+        <w:tabs>
+          <w:tab w:val="left" w:pos="916"/>
+          <w:tab w:val="left" w:pos="1832"/>
+          <w:tab w:val="left" w:pos="2748"/>
+          <w:tab w:val="left" w:pos="3664"/>
+          <w:tab w:val="left" w:pos="4580"/>
+          <w:tab w:val="left" w:pos="5496"/>
+          <w:tab w:val="left" w:pos="6412"/>
+          <w:tab w:val="left" w:pos="7328"/>
+          <w:tab w:val="left" w:pos="8244"/>
+          <w:tab w:val="left" w:pos="9160"/>
+          <w:tab w:val="left" w:pos="10076"/>
+          <w:tab w:val="left" w:pos="10992"/>
+          <w:tab w:val="left" w:pos="11908"/>
+          <w:tab w:val="left" w:pos="12824"/>
+          <w:tab w:val="left" w:pos="13740"/>
+          <w:tab w:val="left" w:pos="14656"/>
+        </w:tabs>
+        <w:spacing w:after="0" w:line="244" w:lineRule="atLeast"/>
+        <w:rPr>
+          <w:rFonts w:ascii="Courier New" w:eastAsia="Times New Roman" w:hAnsi="Courier New" w:cs="Courier New"/>
+          <w:color w:val="333333"/>
+          <w:sz w:val="20"/>
+          <w:szCs w:val="20"/>
+          <w:lang w:eastAsia="es-CO"/>
+        </w:rPr>
+      </w:pPr>
+      <w:r>
+        <w:rPr>
+          <w:rFonts w:ascii="Courier New" w:eastAsia="Times New Roman" w:hAnsi="Courier New" w:cs="Courier New"/>
+          <w:color w:val="888888"/>
+          <w:sz w:val="20"/>
+          <w:szCs w:val="20"/>
+          <w:lang w:val="en-US" w:eastAsia="es-CO"/>
+        </w:rPr>
+        <w:t xml:space="preserve">   </w:t>
+      </w:r>
+      <w:r>
+        <w:rPr>
+          <w:rFonts w:ascii="Courier New" w:eastAsia="Times New Roman" w:hAnsi="Courier New" w:cs="Courier New"/>
+          <w:color w:val="888888"/>
+          <w:sz w:val="20"/>
+          <w:szCs w:val="20"/>
+          <w:lang w:eastAsia="es-CO"/>
+        </w:rPr>
+        <w:t xml:space="preserve">05 </w:t>
+      </w:r>
+      <w:r>
+        <w:rPr>
+          <w:rFonts w:ascii="Courier New" w:eastAsia="Times New Roman" w:hAnsi="Courier New" w:cs="Courier New"/>
+          <w:color w:val="996633"/>
+          <w:sz w:val="20"/>
+          <w:szCs w:val="20"/>
+          <w:lang w:eastAsia="es-CO"/>
+        </w:rPr>
+        <w:t>NOMBRE</w:t>
+      </w:r>
+      <w:r>
+        <w:rPr>
+          <w:rFonts w:ascii="Courier New" w:eastAsia="Times New Roman" w:hAnsi="Courier New" w:cs="Courier New"/>
+          <w:color w:val="BBBBBB"/>
+          <w:sz w:val="20"/>
+          <w:szCs w:val="20"/>
+          <w:lang w:eastAsia="es-CO"/>
+        </w:rPr>
+        <w:t xml:space="preserve">     </w:t>
+      </w:r>
+      <w:r>
+        <w:rPr>
+          <w:rFonts w:ascii="Courier New" w:eastAsia="Times New Roman" w:hAnsi="Courier New" w:cs="Courier New"/>
+          <w:b/>
+          <w:bCs/>
+          <w:color w:val="333399"/>
+          <w:sz w:val="20"/>
+          <w:szCs w:val="20"/>
+          <w:lang w:eastAsia="es-CO"/>
+        </w:rPr>
+        <w:t>PIC A(20)</w:t>
+      </w:r>
+      <w:r>
+        <w:rPr>
+          <w:rFonts w:ascii="Courier New" w:eastAsia="Times New Roman" w:hAnsi="Courier New" w:cs="Courier New"/>
+          <w:color w:val="333333"/>
+          <w:sz w:val="20"/>
+          <w:szCs w:val="20"/>
+          <w:lang w:eastAsia="es-CO"/>
+        </w:rPr>
+        <w:t>.</w:t>
+      </w:r>
+    </w:p>
+    <w:p>
+      <w:pPr>
+        <w:pStyle w:val="NormalWeb"/>
+      </w:pPr>
+      <w:r>
+        <w:lastRenderedPageBreak/>
+        <w:t>Si imprimes el registro, quedaría algo así:</w:t>
+      </w:r>
+    </w:p>
+    <w:p>
+      <w:pPr>
+        <w:pStyle w:val="HTMLconformatoprevio"/>
+      </w:pPr>
+      <w:r>
+        <w:t>12345-JUAN PEREZ</w:t>
+      </w:r>
+    </w:p>
+    <w:p>
+      <w:r>
+        <w:pict w14:anchorId="227BC9B9">
+          <v:rect id="_x0000_i1062" style="width:0;height:1.5pt" o:hralign="center" o:hrstd="t" o:hr="t" fillcolor="#a0a0a0" stroked="f"/>
+        </w:pict>
+      </w:r>
+    </w:p>
+    <w:p>
+      <w:pPr>
+        <w:pStyle w:val="Ttulo2"/>
+      </w:pPr>
+      <w:r>
+        <w:rPr>
+          <w:rFonts w:ascii="Segoe UI Emoji" w:hAnsi="Segoe UI Emoji" w:cs="Segoe UI Emoji"/>
+        </w:rPr>
+        <w:t>🔹</w:t>
+      </w:r>
+      <w:r>
+        <w:t xml:space="preserve"> Ejemplo con valor constante</w:t>
+      </w:r>
+    </w:p>
+    <w:p>
+      <w:pPr>
+        <w:tabs>
+          <w:tab w:val="left" w:pos="916"/>
+          <w:tab w:val="left" w:pos="1832"/>
+          <w:tab w:val="left" w:pos="2748"/>
+          <w:tab w:val="left" w:pos="3664"/>
+          <w:tab w:val="left" w:pos="4580"/>
+          <w:tab w:val="left" w:pos="5496"/>
+          <w:tab w:val="left" w:pos="6412"/>
+          <w:tab w:val="left" w:pos="7328"/>
+          <w:tab w:val="left" w:pos="8244"/>
+          <w:tab w:val="left" w:pos="9160"/>
+          <w:tab w:val="left" w:pos="10076"/>
+          <w:tab w:val="left" w:pos="10992"/>
+          <w:tab w:val="left" w:pos="11908"/>
+          <w:tab w:val="left" w:pos="12824"/>
+          <w:tab w:val="left" w:pos="13740"/>
+          <w:tab w:val="left" w:pos="14656"/>
+        </w:tabs>
+        <w:spacing w:after="0" w:line="244" w:lineRule="atLeast"/>
+        <w:rPr>
+          <w:rFonts w:ascii="Courier New" w:eastAsia="Times New Roman" w:hAnsi="Courier New" w:cs="Courier New"/>
+          <w:color w:val="333333"/>
+          <w:sz w:val="20"/>
+          <w:szCs w:val="20"/>
+          <w:lang w:eastAsia="es-CO"/>
+        </w:rPr>
+      </w:pPr>
+      <w:r>
+        <w:rPr>
+          <w:rFonts w:ascii="Courier New" w:eastAsia="Times New Roman" w:hAnsi="Courier New" w:cs="Courier New"/>
+          <w:color w:val="888888"/>
+          <w:sz w:val="20"/>
+          <w:szCs w:val="20"/>
+          <w:lang w:eastAsia="es-CO"/>
+        </w:rPr>
+        <w:t>01 TEX</w:t>
+      </w:r>
+      <w:r>
+        <w:rPr>
+          <w:rFonts w:ascii="Courier New" w:eastAsia="Times New Roman" w:hAnsi="Courier New" w:cs="Courier New"/>
+          <w:color w:val="996633"/>
+          <w:sz w:val="20"/>
+          <w:szCs w:val="20"/>
+          <w:lang w:eastAsia="es-CO"/>
+        </w:rPr>
+        <w:t>TO</w:t>
+      </w:r>
+      <w:r>
+        <w:rPr>
+          <w:rFonts w:ascii="Courier New" w:eastAsia="Times New Roman" w:hAnsi="Courier New" w:cs="Courier New"/>
+          <w:color w:val="333333"/>
+          <w:sz w:val="20"/>
+          <w:szCs w:val="20"/>
+          <w:lang w:eastAsia="es-CO"/>
+        </w:rPr>
+        <w:t>.</w:t>
+      </w:r>
+    </w:p>
+    <w:p>
+      <w:pPr>
+        <w:tabs>
+          <w:tab w:val="left" w:pos="916"/>
+          <w:tab w:val="left" w:pos="1832"/>
+          <w:tab w:val="left" w:pos="2748"/>
+          <w:tab w:val="left" w:pos="3664"/>
+          <w:tab w:val="left" w:pos="4580"/>
+          <w:tab w:val="left" w:pos="5496"/>
+          <w:tab w:val="left" w:pos="6412"/>
+          <w:tab w:val="left" w:pos="7328"/>
+          <w:tab w:val="left" w:pos="8244"/>
+          <w:tab w:val="left" w:pos="9160"/>
+          <w:tab w:val="left" w:pos="10076"/>
+          <w:tab w:val="left" w:pos="10992"/>
+          <w:tab w:val="left" w:pos="11908"/>
+          <w:tab w:val="left" w:pos="12824"/>
+          <w:tab w:val="left" w:pos="13740"/>
+          <w:tab w:val="left" w:pos="14656"/>
+        </w:tabs>
+        <w:spacing w:after="0" w:line="244" w:lineRule="atLeast"/>
+        <w:rPr>
+          <w:rFonts w:ascii="Courier New" w:eastAsia="Times New Roman" w:hAnsi="Courier New" w:cs="Courier New"/>
+          <w:color w:val="333333"/>
+          <w:sz w:val="20"/>
+          <w:szCs w:val="20"/>
+          <w:lang w:eastAsia="es-CO"/>
+        </w:rPr>
+      </w:pPr>
+      <w:r>
+        <w:rPr>
+          <w:rFonts w:ascii="Courier New" w:eastAsia="Times New Roman" w:hAnsi="Courier New" w:cs="Courier New"/>
+          <w:color w:val="888888"/>
+          <w:sz w:val="20"/>
+          <w:szCs w:val="20"/>
+          <w:lang w:eastAsia="es-CO"/>
+        </w:rPr>
+        <w:t xml:space="preserve">   05 </w:t>
+      </w:r>
+      <w:r>
+        <w:rPr>
+          <w:rFonts w:ascii="Courier New" w:eastAsia="Times New Roman" w:hAnsi="Courier New" w:cs="Courier New"/>
+          <w:b/>
+          <w:bCs/>
+          <w:color w:val="003388"/>
+          <w:sz w:val="20"/>
+          <w:szCs w:val="20"/>
+          <w:lang w:eastAsia="es-CO"/>
+        </w:rPr>
+        <w:t>FILLER</w:t>
+      </w:r>
+      <w:r>
+        <w:rPr>
+          <w:rFonts w:ascii="Courier New" w:eastAsia="Times New Roman" w:hAnsi="Courier New" w:cs="Courier New"/>
+          <w:color w:val="BBBBBB"/>
+          <w:sz w:val="20"/>
+          <w:szCs w:val="20"/>
+          <w:lang w:eastAsia="es-CO"/>
+        </w:rPr>
+        <w:t xml:space="preserve"> </w:t>
+      </w:r>
+      <w:r>
+        <w:rPr>
+          <w:rFonts w:ascii="Courier New" w:eastAsia="Times New Roman" w:hAnsi="Courier New" w:cs="Courier New"/>
+          <w:b/>
+          <w:bCs/>
+          <w:color w:val="333399"/>
+          <w:sz w:val="20"/>
+          <w:szCs w:val="20"/>
+          <w:lang w:eastAsia="es-CO"/>
+        </w:rPr>
+        <w:t>PIC X(10)</w:t>
+      </w:r>
+      <w:r>
+        <w:rPr>
+          <w:rFonts w:ascii="Courier New" w:eastAsia="Times New Roman" w:hAnsi="Courier New" w:cs="Courier New"/>
+          <w:color w:val="BBBBBB"/>
+          <w:sz w:val="20"/>
+          <w:szCs w:val="20"/>
+          <w:lang w:eastAsia="es-CO"/>
+        </w:rPr>
+        <w:t xml:space="preserve"> </w:t>
+      </w:r>
+      <w:r>
+        <w:rPr>
+          <w:rFonts w:ascii="Courier New" w:eastAsia="Times New Roman" w:hAnsi="Courier New" w:cs="Courier New"/>
+          <w:b/>
+          <w:bCs/>
+          <w:color w:val="003388"/>
+          <w:sz w:val="20"/>
+          <w:szCs w:val="20"/>
+          <w:lang w:eastAsia="es-CO"/>
+        </w:rPr>
+        <w:t xml:space="preserve">VALUE </w:t>
+      </w:r>
+      <w:r>
+        <w:rPr>
+          <w:rFonts w:ascii="Courier New" w:eastAsia="Times New Roman" w:hAnsi="Courier New" w:cs="Courier New"/>
+          <w:color w:val="333333"/>
+          <w:sz w:val="20"/>
+          <w:szCs w:val="20"/>
+          <w:shd w:val="clear" w:color="auto" w:fill="FFF0F0"/>
+          <w:lang w:eastAsia="es-CO"/>
+        </w:rPr>
+        <w:t>"HOLA MUNDO"</w:t>
+      </w:r>
+      <w:r>
+        <w:rPr>
+          <w:rFonts w:ascii="Courier New" w:eastAsia="Times New Roman" w:hAnsi="Courier New" w:cs="Courier New"/>
+          <w:color w:val="333333"/>
+          <w:sz w:val="20"/>
+          <w:szCs w:val="20"/>
+          <w:lang w:eastAsia="es-CO"/>
+        </w:rPr>
+        <w:t>.</w:t>
+      </w:r>
+    </w:p>
+    <w:p>
+      <w:r>
+        <w:pict w14:anchorId="01F6920E">
+          <v:rect id="_x0000_i1063" style="width:0;height:1.5pt" o:hralign="center" o:hrstd="t" o:hr="t" fillcolor="#a0a0a0" stroked="f"/>
+        </w:pict>
+      </w:r>
+    </w:p>
+    <w:p>
+      <w:pPr>
+        <w:pStyle w:val="Ttulo2"/>
+      </w:pPr>
+      <w:r>
+        <w:rPr>
+          <w:rFonts w:ascii="Segoe UI Emoji" w:hAnsi="Segoe UI Emoji" w:cs="Segoe UI Emoji"/>
+        </w:rPr>
+        <w:t>🔹</w:t>
+      </w:r>
+      <w:r>
+        <w:t xml:space="preserve"> Idea clave</w:t>
+      </w:r>
+    </w:p>
+    <w:p>
+      <w:pPr>
+        <w:pStyle w:val="NormalWeb"/>
+      </w:pPr>
+      <w:r>
+        <w:rPr>
+          <w:rStyle w:val="CdigoHTML"/>
+        </w:rPr>
+        <w:t>FILLER</w:t>
+      </w:r>
+      <w:r>
+        <w:t xml:space="preserve"> es básicamente un </w:t>
+      </w:r>
+      <w:r>
+        <w:rPr>
+          <w:rStyle w:val="Textoennegrita"/>
+        </w:rPr>
+        <w:t>campo “invisible”</w:t>
+      </w:r>
+      <w:r>
+        <w:t>: existe en memoria, pero no en la lógica del programa</w:t>
+      </w:r>
+    </w:p>
+    <w:p/>
     <w:sectPr>
       <w:pgSz w:w="12240" w:h="15840"/>
       <w:pgMar w:top="1417" w:right="1701" w:bottom="1417" w:left="1701" w:header="708" w:footer="708" w:gutter="0"/>
@@ -9216,6 +10454,155 @@
     </w:lvl>
   </w:abstractNum>
   <w:abstractNum w:abstractNumId="3" w15:restartNumberingAfterBreak="0">
+    <w:nsid w:val="0C9E3B59"/>
+    <w:multiLevelType w:val="multilevel"/>
+    <w:tmpl w:val="17A8F16A"/>
+    <w:lvl w:ilvl="0">
+      <w:start w:val="1"/>
+      <w:numFmt w:val="bullet"/>
+      <w:lvlText w:val=""/>
+      <w:lvlJc w:val="left"/>
+      <w:pPr>
+        <w:tabs>
+          <w:tab w:val="num" w:pos="720"/>
+        </w:tabs>
+        <w:ind w:left="720" w:hanging="360"/>
+      </w:pPr>
+      <w:rPr>
+        <w:rFonts w:ascii="Symbol" w:hAnsi="Symbol" w:hint="default"/>
+        <w:sz w:val="20"/>
+      </w:rPr>
+    </w:lvl>
+    <w:lvl w:ilvl="1" w:tentative="1">
+      <w:start w:val="1"/>
+      <w:numFmt w:val="bullet"/>
+      <w:lvlText w:val="o"/>
+      <w:lvlJc w:val="left"/>
+      <w:pPr>
+        <w:tabs>
+          <w:tab w:val="num" w:pos="1440"/>
+        </w:tabs>
+        <w:ind w:left="1440" w:hanging="360"/>
+      </w:pPr>
+      <w:rPr>
+        <w:rFonts w:ascii="Courier New" w:hAnsi="Courier New" w:hint="default"/>
+        <w:sz w:val="20"/>
+      </w:rPr>
+    </w:lvl>
+    <w:lvl w:ilvl="2" w:tentative="1">
+      <w:start w:val="1"/>
+      <w:numFmt w:val="bullet"/>
+      <w:lvlText w:val=""/>
+      <w:lvlJc w:val="left"/>
+      <w:pPr>
+        <w:tabs>
+          <w:tab w:val="num" w:pos="2160"/>
+        </w:tabs>
+        <w:ind w:left="2160" w:hanging="360"/>
+      </w:pPr>
+      <w:rPr>
+        <w:rFonts w:ascii="Wingdings" w:hAnsi="Wingdings" w:hint="default"/>
+        <w:sz w:val="20"/>
+      </w:rPr>
+    </w:lvl>
+    <w:lvl w:ilvl="3" w:tentative="1">
+      <w:start w:val="1"/>
+      <w:numFmt w:val="bullet"/>
+      <w:lvlText w:val=""/>
+      <w:lvlJc w:val="left"/>
+      <w:pPr>
+        <w:tabs>
+          <w:tab w:val="num" w:pos="2880"/>
+        </w:tabs>
+        <w:ind w:left="2880" w:hanging="360"/>
+      </w:pPr>
+      <w:rPr>
+        <w:rFonts w:ascii="Wingdings" w:hAnsi="Wingdings" w:hint="default"/>
+        <w:sz w:val="20"/>
+      </w:rPr>
+    </w:lvl>
+    <w:lvl w:ilvl="4" w:tentative="1">
+      <w:start w:val="1"/>
+      <w:numFmt w:val="bullet"/>
+      <w:lvlText w:val=""/>
+      <w:lvlJc w:val="left"/>
+      <w:pPr>
+        <w:tabs>
+          <w:tab w:val="num" w:pos="3600"/>
+        </w:tabs>
+        <w:ind w:left="3600" w:hanging="360"/>
+      </w:pPr>
+      <w:rPr>
+        <w:rFonts w:ascii="Wingdings" w:hAnsi="Wingdings" w:hint="default"/>
+        <w:sz w:val="20"/>
+      </w:rPr>
+    </w:lvl>
+    <w:lvl w:ilvl="5" w:tentative="1">
+      <w:start w:val="1"/>
+      <w:numFmt w:val="bullet"/>
+      <w:lvlText w:val=""/>
+      <w:lvlJc w:val="left"/>
+      <w:pPr>
+        <w:tabs>
+          <w:tab w:val="num" w:pos="4320"/>
+        </w:tabs>
+        <w:ind w:left="4320" w:hanging="360"/>
+      </w:pPr>
+      <w:rPr>
+        <w:rFonts w:ascii="Wingdings" w:hAnsi="Wingdings" w:hint="default"/>
+        <w:sz w:val="20"/>
+      </w:rPr>
+    </w:lvl>
+    <w:lvl w:ilvl="6" w:tentative="1">
+      <w:start w:val="1"/>
+      <w:numFmt w:val="bullet"/>
+      <w:lvlText w:val=""/>
+      <w:lvlJc w:val="left"/>
+      <w:pPr>
+        <w:tabs>
+          <w:tab w:val="num" w:pos="5040"/>
+        </w:tabs>
+        <w:ind w:left="5040" w:hanging="360"/>
+      </w:pPr>
+      <w:rPr>
+        <w:rFonts w:ascii="Wingdings" w:hAnsi="Wingdings" w:hint="default"/>
+        <w:sz w:val="20"/>
+      </w:rPr>
+    </w:lvl>
+    <w:lvl w:ilvl="7" w:tentative="1">
+      <w:start w:val="1"/>
+      <w:numFmt w:val="bullet"/>
+      <w:lvlText w:val=""/>
+      <w:lvlJc w:val="left"/>
+      <w:pPr>
+        <w:tabs>
+          <w:tab w:val="num" w:pos="5760"/>
+        </w:tabs>
+        <w:ind w:left="5760" w:hanging="360"/>
+      </w:pPr>
+      <w:rPr>
+        <w:rFonts w:ascii="Wingdings" w:hAnsi="Wingdings" w:hint="default"/>
+        <w:sz w:val="20"/>
+      </w:rPr>
+    </w:lvl>
+    <w:lvl w:ilvl="8" w:tentative="1">
+      <w:start w:val="1"/>
+      <w:numFmt w:val="bullet"/>
+      <w:lvlText w:val=""/>
+      <w:lvlJc w:val="left"/>
+      <w:pPr>
+        <w:tabs>
+          <w:tab w:val="num" w:pos="6480"/>
+        </w:tabs>
+        <w:ind w:left="6480" w:hanging="360"/>
+      </w:pPr>
+      <w:rPr>
+        <w:rFonts w:ascii="Wingdings" w:hAnsi="Wingdings" w:hint="default"/>
+        <w:sz w:val="20"/>
+      </w:rPr>
+    </w:lvl>
+  </w:abstractNum>
+  <w:abstractNum w:abstractNumId="4" w15:restartNumberingAfterBreak="0">
     <w:nsid w:val="136A103C"/>
     <w:multiLevelType w:val="multilevel"/>
     <w:tmpl w:val="EC3C490E"/>
@@ -9364,7 +10751,7 @@
       </w:rPr>
     </w:lvl>
   </w:abstractNum>
-  <w:abstractNum w:abstractNumId="4" w15:restartNumberingAfterBreak="0">
+  <w:abstractNum w:abstractNumId="5" w15:restartNumberingAfterBreak="0">
     <w:nsid w:val="188D0984"/>
     <w:multiLevelType w:val="multilevel"/>
     <w:tmpl w:val="8A240768"/>
@@ -9513,7 +10900,7 @@
       </w:rPr>
     </w:lvl>
   </w:abstractNum>
-  <w:abstractNum w:abstractNumId="5" w15:restartNumberingAfterBreak="0">
+  <w:abstractNum w:abstractNumId="6" w15:restartNumberingAfterBreak="0">
     <w:nsid w:val="1D5339DB"/>
     <w:multiLevelType w:val="multilevel"/>
     <w:tmpl w:val="8B0CE198"/>
@@ -9662,7 +11049,7 @@
       </w:rPr>
     </w:lvl>
   </w:abstractNum>
-  <w:abstractNum w:abstractNumId="6" w15:restartNumberingAfterBreak="0">
+  <w:abstractNum w:abstractNumId="7" w15:restartNumberingAfterBreak="0">
     <w:nsid w:val="1EE60DDA"/>
     <w:multiLevelType w:val="multilevel"/>
     <w:tmpl w:val="4ADEB948"/>
@@ -9811,7 +11198,7 @@
       </w:rPr>
     </w:lvl>
   </w:abstractNum>
-  <w:abstractNum w:abstractNumId="7" w15:restartNumberingAfterBreak="0">
+  <w:abstractNum w:abstractNumId="8" w15:restartNumberingAfterBreak="0">
     <w:nsid w:val="24F4709F"/>
     <w:multiLevelType w:val="multilevel"/>
     <w:tmpl w:val="8D102BDE"/>
@@ -9960,7 +11347,7 @@
       </w:rPr>
     </w:lvl>
   </w:abstractNum>
-  <w:abstractNum w:abstractNumId="8" w15:restartNumberingAfterBreak="0">
+  <w:abstractNum w:abstractNumId="9" w15:restartNumberingAfterBreak="0">
     <w:nsid w:val="30F145F4"/>
     <w:multiLevelType w:val="multilevel"/>
     <w:tmpl w:val="D0D62F6E"/>
@@ -10109,7 +11496,7 @@
       </w:rPr>
     </w:lvl>
   </w:abstractNum>
-  <w:abstractNum w:abstractNumId="9" w15:restartNumberingAfterBreak="0">
+  <w:abstractNum w:abstractNumId="10" w15:restartNumberingAfterBreak="0">
     <w:nsid w:val="34E870A4"/>
     <w:multiLevelType w:val="multilevel"/>
     <w:tmpl w:val="139C857E"/>
@@ -10258,7 +11645,7 @@
       </w:rPr>
     </w:lvl>
   </w:abstractNum>
-  <w:abstractNum w:abstractNumId="10" w15:restartNumberingAfterBreak="0">
+  <w:abstractNum w:abstractNumId="11" w15:restartNumberingAfterBreak="0">
     <w:nsid w:val="39192A1F"/>
     <w:multiLevelType w:val="multilevel"/>
     <w:tmpl w:val="532C20C2"/>
@@ -10407,7 +11794,7 @@
       </w:rPr>
     </w:lvl>
   </w:abstractNum>
-  <w:abstractNum w:abstractNumId="11" w15:restartNumberingAfterBreak="0">
+  <w:abstractNum w:abstractNumId="12" w15:restartNumberingAfterBreak="0">
     <w:nsid w:val="3DD602EB"/>
     <w:multiLevelType w:val="multilevel"/>
     <w:tmpl w:val="4D10BA84"/>
@@ -10556,7 +11943,7 @@
       </w:rPr>
     </w:lvl>
   </w:abstractNum>
-  <w:abstractNum w:abstractNumId="12" w15:restartNumberingAfterBreak="0">
+  <w:abstractNum w:abstractNumId="13" w15:restartNumberingAfterBreak="0">
     <w:nsid w:val="3EAC11DF"/>
     <w:multiLevelType w:val="multilevel"/>
     <w:tmpl w:val="6ED68670"/>
@@ -10699,7 +12086,7 @@
       </w:rPr>
     </w:lvl>
   </w:abstractNum>
-  <w:abstractNum w:abstractNumId="13" w15:restartNumberingAfterBreak="0">
+  <w:abstractNum w:abstractNumId="14" w15:restartNumberingAfterBreak="0">
     <w:nsid w:val="40694051"/>
     <w:multiLevelType w:val="multilevel"/>
     <w:tmpl w:val="53FC7284"/>
@@ -10848,7 +12235,7 @@
       </w:rPr>
     </w:lvl>
   </w:abstractNum>
-  <w:abstractNum w:abstractNumId="14" w15:restartNumberingAfterBreak="0">
+  <w:abstractNum w:abstractNumId="15" w15:restartNumberingAfterBreak="0">
     <w:nsid w:val="429626AE"/>
     <w:multiLevelType w:val="multilevel"/>
     <w:tmpl w:val="3DA2FB52"/>
@@ -10997,7 +12384,7 @@
       </w:rPr>
     </w:lvl>
   </w:abstractNum>
-  <w:abstractNum w:abstractNumId="15" w15:restartNumberingAfterBreak="0">
+  <w:abstractNum w:abstractNumId="16" w15:restartNumberingAfterBreak="0">
     <w:nsid w:val="4EB25B86"/>
     <w:multiLevelType w:val="multilevel"/>
     <w:tmpl w:val="DB7CD2E0"/>
@@ -11146,7 +12533,7 @@
       </w:rPr>
     </w:lvl>
   </w:abstractNum>
-  <w:abstractNum w:abstractNumId="16" w15:restartNumberingAfterBreak="0">
+  <w:abstractNum w:abstractNumId="17" w15:restartNumberingAfterBreak="0">
     <w:nsid w:val="517416BA"/>
     <w:multiLevelType w:val="multilevel"/>
     <w:tmpl w:val="2AD2165C"/>
@@ -11295,7 +12682,7 @@
       </w:rPr>
     </w:lvl>
   </w:abstractNum>
-  <w:abstractNum w:abstractNumId="17" w15:restartNumberingAfterBreak="0">
+  <w:abstractNum w:abstractNumId="18" w15:restartNumberingAfterBreak="0">
     <w:nsid w:val="543B30C5"/>
     <w:multiLevelType w:val="multilevel"/>
     <w:tmpl w:val="89561D3E"/>
@@ -11444,7 +12831,305 @@
       </w:rPr>
     </w:lvl>
   </w:abstractNum>
-  <w:abstractNum w:abstractNumId="18" w15:restartNumberingAfterBreak="0">
+  <w:abstractNum w:abstractNumId="19" w15:restartNumberingAfterBreak="0">
+    <w:nsid w:val="5B2E3B69"/>
+    <w:multiLevelType w:val="multilevel"/>
+    <w:tmpl w:val="EFB44F62"/>
+    <w:lvl w:ilvl="0">
+      <w:start w:val="1"/>
+      <w:numFmt w:val="bullet"/>
+      <w:lvlText w:val=""/>
+      <w:lvlJc w:val="left"/>
+      <w:pPr>
+        <w:tabs>
+          <w:tab w:val="num" w:pos="720"/>
+        </w:tabs>
+        <w:ind w:left="720" w:hanging="360"/>
+      </w:pPr>
+      <w:rPr>
+        <w:rFonts w:ascii="Symbol" w:hAnsi="Symbol" w:hint="default"/>
+        <w:sz w:val="20"/>
+      </w:rPr>
+    </w:lvl>
+    <w:lvl w:ilvl="1" w:tentative="1">
+      <w:start w:val="1"/>
+      <w:numFmt w:val="bullet"/>
+      <w:lvlText w:val="o"/>
+      <w:lvlJc w:val="left"/>
+      <w:pPr>
+        <w:tabs>
+          <w:tab w:val="num" w:pos="1440"/>
+        </w:tabs>
+        <w:ind w:left="1440" w:hanging="360"/>
+      </w:pPr>
+      <w:rPr>
+        <w:rFonts w:ascii="Courier New" w:hAnsi="Courier New" w:hint="default"/>
+        <w:sz w:val="20"/>
+      </w:rPr>
+    </w:lvl>
+    <w:lvl w:ilvl="2" w:tentative="1">
+      <w:start w:val="1"/>
+      <w:numFmt w:val="bullet"/>
+      <w:lvlText w:val=""/>
+      <w:lvlJc w:val="left"/>
+      <w:pPr>
+        <w:tabs>
+          <w:tab w:val="num" w:pos="2160"/>
+        </w:tabs>
+        <w:ind w:left="2160" w:hanging="360"/>
+      </w:pPr>
+      <w:rPr>
+        <w:rFonts w:ascii="Wingdings" w:hAnsi="Wingdings" w:hint="default"/>
+        <w:sz w:val="20"/>
+      </w:rPr>
+    </w:lvl>
+    <w:lvl w:ilvl="3" w:tentative="1">
+      <w:start w:val="1"/>
+      <w:numFmt w:val="bullet"/>
+      <w:lvlText w:val=""/>
+      <w:lvlJc w:val="left"/>
+      <w:pPr>
+        <w:tabs>
+          <w:tab w:val="num" w:pos="2880"/>
+        </w:tabs>
+        <w:ind w:left="2880" w:hanging="360"/>
+      </w:pPr>
+      <w:rPr>
+        <w:rFonts w:ascii="Wingdings" w:hAnsi="Wingdings" w:hint="default"/>
+        <w:sz w:val="20"/>
+      </w:rPr>
+    </w:lvl>
+    <w:lvl w:ilvl="4" w:tentative="1">
+      <w:start w:val="1"/>
+      <w:numFmt w:val="bullet"/>
+      <w:lvlText w:val=""/>
+      <w:lvlJc w:val="left"/>
+      <w:pPr>
+        <w:tabs>
+          <w:tab w:val="num" w:pos="3600"/>
+        </w:tabs>
+        <w:ind w:left="3600" w:hanging="360"/>
+      </w:pPr>
+      <w:rPr>
+        <w:rFonts w:ascii="Wingdings" w:hAnsi="Wingdings" w:hint="default"/>
+        <w:sz w:val="20"/>
+      </w:rPr>
+    </w:lvl>
+    <w:lvl w:ilvl="5" w:tentative="1">
+      <w:start w:val="1"/>
+      <w:numFmt w:val="bullet"/>
+      <w:lvlText w:val=""/>
+      <w:lvlJc w:val="left"/>
+      <w:pPr>
+        <w:tabs>
+          <w:tab w:val="num" w:pos="4320"/>
+        </w:tabs>
+        <w:ind w:left="4320" w:hanging="360"/>
+      </w:pPr>
+      <w:rPr>
+        <w:rFonts w:ascii="Wingdings" w:hAnsi="Wingdings" w:hint="default"/>
+        <w:sz w:val="20"/>
+      </w:rPr>
+    </w:lvl>
+    <w:lvl w:ilvl="6" w:tentative="1">
+      <w:start w:val="1"/>
+      <w:numFmt w:val="bullet"/>
+      <w:lvlText w:val=""/>
+      <w:lvlJc w:val="left"/>
+      <w:pPr>
+        <w:tabs>
+          <w:tab w:val="num" w:pos="5040"/>
+        </w:tabs>
+        <w:ind w:left="5040" w:hanging="360"/>
+      </w:pPr>
+      <w:rPr>
+        <w:rFonts w:ascii="Wingdings" w:hAnsi="Wingdings" w:hint="default"/>
+        <w:sz w:val="20"/>
+      </w:rPr>
+    </w:lvl>
+    <w:lvl w:ilvl="7" w:tentative="1">
+      <w:start w:val="1"/>
+      <w:numFmt w:val="bullet"/>
+      <w:lvlText w:val=""/>
+      <w:lvlJc w:val="left"/>
+      <w:pPr>
+        <w:tabs>
+          <w:tab w:val="num" w:pos="5760"/>
+        </w:tabs>
+        <w:ind w:left="5760" w:hanging="360"/>
+      </w:pPr>
+      <w:rPr>
+        <w:rFonts w:ascii="Wingdings" w:hAnsi="Wingdings" w:hint="default"/>
+        <w:sz w:val="20"/>
+      </w:rPr>
+    </w:lvl>
+    <w:lvl w:ilvl="8" w:tentative="1">
+      <w:start w:val="1"/>
+      <w:numFmt w:val="bullet"/>
+      <w:lvlText w:val=""/>
+      <w:lvlJc w:val="left"/>
+      <w:pPr>
+        <w:tabs>
+          <w:tab w:val="num" w:pos="6480"/>
+        </w:tabs>
+        <w:ind w:left="6480" w:hanging="360"/>
+      </w:pPr>
+      <w:rPr>
+        <w:rFonts w:ascii="Wingdings" w:hAnsi="Wingdings" w:hint="default"/>
+        <w:sz w:val="20"/>
+      </w:rPr>
+    </w:lvl>
+  </w:abstractNum>
+  <w:abstractNum w:abstractNumId="20" w15:restartNumberingAfterBreak="0">
+    <w:nsid w:val="5BE94177"/>
+    <w:multiLevelType w:val="multilevel"/>
+    <w:tmpl w:val="642684CC"/>
+    <w:lvl w:ilvl="0">
+      <w:start w:val="1"/>
+      <w:numFmt w:val="bullet"/>
+      <w:lvlText w:val=""/>
+      <w:lvlJc w:val="left"/>
+      <w:pPr>
+        <w:tabs>
+          <w:tab w:val="num" w:pos="720"/>
+        </w:tabs>
+        <w:ind w:left="720" w:hanging="360"/>
+      </w:pPr>
+      <w:rPr>
+        <w:rFonts w:ascii="Symbol" w:hAnsi="Symbol" w:hint="default"/>
+        <w:sz w:val="20"/>
+      </w:rPr>
+    </w:lvl>
+    <w:lvl w:ilvl="1" w:tentative="1">
+      <w:start w:val="1"/>
+      <w:numFmt w:val="bullet"/>
+      <w:lvlText w:val="o"/>
+      <w:lvlJc w:val="left"/>
+      <w:pPr>
+        <w:tabs>
+          <w:tab w:val="num" w:pos="1440"/>
+        </w:tabs>
+        <w:ind w:left="1440" w:hanging="360"/>
+      </w:pPr>
+      <w:rPr>
+        <w:rFonts w:ascii="Courier New" w:hAnsi="Courier New" w:hint="default"/>
+        <w:sz w:val="20"/>
+      </w:rPr>
+    </w:lvl>
+    <w:lvl w:ilvl="2" w:tentative="1">
+      <w:start w:val="1"/>
+      <w:numFmt w:val="bullet"/>
+      <w:lvlText w:val=""/>
+      <w:lvlJc w:val="left"/>
+      <w:pPr>
+        <w:tabs>
+          <w:tab w:val="num" w:pos="2160"/>
+        </w:tabs>
+        <w:ind w:left="2160" w:hanging="360"/>
+      </w:pPr>
+      <w:rPr>
+        <w:rFonts w:ascii="Wingdings" w:hAnsi="Wingdings" w:hint="default"/>
+        <w:sz w:val="20"/>
+      </w:rPr>
+    </w:lvl>
+    <w:lvl w:ilvl="3" w:tentative="1">
+      <w:start w:val="1"/>
+      <w:numFmt w:val="bullet"/>
+      <w:lvlText w:val=""/>
+      <w:lvlJc w:val="left"/>
+      <w:pPr>
+        <w:tabs>
+          <w:tab w:val="num" w:pos="2880"/>
+        </w:tabs>
+        <w:ind w:left="2880" w:hanging="360"/>
+      </w:pPr>
+      <w:rPr>
+        <w:rFonts w:ascii="Wingdings" w:hAnsi="Wingdings" w:hint="default"/>
+        <w:sz w:val="20"/>
+      </w:rPr>
+    </w:lvl>
+    <w:lvl w:ilvl="4" w:tentative="1">
+      <w:start w:val="1"/>
+      <w:numFmt w:val="bullet"/>
+      <w:lvlText w:val=""/>
+      <w:lvlJc w:val="left"/>
+      <w:pPr>
+        <w:tabs>
+          <w:tab w:val="num" w:pos="3600"/>
+        </w:tabs>
+        <w:ind w:left="3600" w:hanging="360"/>
+      </w:pPr>
+      <w:rPr>
+        <w:rFonts w:ascii="Wingdings" w:hAnsi="Wingdings" w:hint="default"/>
+        <w:sz w:val="20"/>
+      </w:rPr>
+    </w:lvl>
+    <w:lvl w:ilvl="5" w:tentative="1">
+      <w:start w:val="1"/>
+      <w:numFmt w:val="bullet"/>
+      <w:lvlText w:val=""/>
+      <w:lvlJc w:val="left"/>
+      <w:pPr>
+        <w:tabs>
+          <w:tab w:val="num" w:pos="4320"/>
+        </w:tabs>
+        <w:ind w:left="4320" w:hanging="360"/>
+      </w:pPr>
+      <w:rPr>
+        <w:rFonts w:ascii="Wingdings" w:hAnsi="Wingdings" w:hint="default"/>
+        <w:sz w:val="20"/>
+      </w:rPr>
+    </w:lvl>
+    <w:lvl w:ilvl="6" w:tentative="1">
+      <w:start w:val="1"/>
+      <w:numFmt w:val="bullet"/>
+      <w:lvlText w:val=""/>
+      <w:lvlJc w:val="left"/>
+      <w:pPr>
+        <w:tabs>
+          <w:tab w:val="num" w:pos="5040"/>
+        </w:tabs>
+        <w:ind w:left="5040" w:hanging="360"/>
+      </w:pPr>
+      <w:rPr>
+        <w:rFonts w:ascii="Wingdings" w:hAnsi="Wingdings" w:hint="default"/>
+        <w:sz w:val="20"/>
+      </w:rPr>
+    </w:lvl>
+    <w:lvl w:ilvl="7" w:tentative="1">
+      <w:start w:val="1"/>
+      <w:numFmt w:val="bullet"/>
+      <w:lvlText w:val=""/>
+      <w:lvlJc w:val="left"/>
+      <w:pPr>
+        <w:tabs>
+          <w:tab w:val="num" w:pos="5760"/>
+        </w:tabs>
+        <w:ind w:left="5760" w:hanging="360"/>
+      </w:pPr>
+      <w:rPr>
+        <w:rFonts w:ascii="Wingdings" w:hAnsi="Wingdings" w:hint="default"/>
+        <w:sz w:val="20"/>
+      </w:rPr>
+    </w:lvl>
+    <w:lvl w:ilvl="8" w:tentative="1">
+      <w:start w:val="1"/>
+      <w:numFmt w:val="bullet"/>
+      <w:lvlText w:val=""/>
+      <w:lvlJc w:val="left"/>
+      <w:pPr>
+        <w:tabs>
+          <w:tab w:val="num" w:pos="6480"/>
+        </w:tabs>
+        <w:ind w:left="6480" w:hanging="360"/>
+      </w:pPr>
+      <w:rPr>
+        <w:rFonts w:ascii="Wingdings" w:hAnsi="Wingdings" w:hint="default"/>
+        <w:sz w:val="20"/>
+      </w:rPr>
+    </w:lvl>
+  </w:abstractNum>
+  <w:abstractNum w:abstractNumId="21" w15:restartNumberingAfterBreak="0">
     <w:nsid w:val="5F34179F"/>
     <w:multiLevelType w:val="multilevel"/>
     <w:tmpl w:val="B8FABEBA"/>
@@ -11593,7 +13278,7 @@
       </w:rPr>
     </w:lvl>
   </w:abstractNum>
-  <w:abstractNum w:abstractNumId="19" w15:restartNumberingAfterBreak="0">
+  <w:abstractNum w:abstractNumId="22" w15:restartNumberingAfterBreak="0">
     <w:nsid w:val="663963AA"/>
     <w:multiLevelType w:val="multilevel"/>
     <w:tmpl w:val="5A3E6326"/>
@@ -11742,7 +13427,7 @@
       </w:rPr>
     </w:lvl>
   </w:abstractNum>
-  <w:abstractNum w:abstractNumId="20" w15:restartNumberingAfterBreak="0">
+  <w:abstractNum w:abstractNumId="23" w15:restartNumberingAfterBreak="0">
     <w:nsid w:val="66702AFB"/>
     <w:multiLevelType w:val="multilevel"/>
     <w:tmpl w:val="4A74C298"/>
@@ -11891,7 +13576,7 @@
       </w:rPr>
     </w:lvl>
   </w:abstractNum>
-  <w:abstractNum w:abstractNumId="21" w15:restartNumberingAfterBreak="0">
+  <w:abstractNum w:abstractNumId="24" w15:restartNumberingAfterBreak="0">
     <w:nsid w:val="74A24D06"/>
     <w:multiLevelType w:val="multilevel"/>
     <w:tmpl w:val="464430F8"/>
@@ -12040,7 +13725,7 @@
       </w:rPr>
     </w:lvl>
   </w:abstractNum>
-  <w:abstractNum w:abstractNumId="22" w15:restartNumberingAfterBreak="0">
+  <w:abstractNum w:abstractNumId="25" w15:restartNumberingAfterBreak="0">
     <w:nsid w:val="7B0B22B3"/>
     <w:multiLevelType w:val="multilevel"/>
     <w:tmpl w:val="E6C83DE2"/>
@@ -12189,7 +13874,7 @@
       </w:rPr>
     </w:lvl>
   </w:abstractNum>
-  <w:abstractNum w:abstractNumId="23" w15:restartNumberingAfterBreak="0">
+  <w:abstractNum w:abstractNumId="26" w15:restartNumberingAfterBreak="0">
     <w:nsid w:val="7B6228EF"/>
     <w:multiLevelType w:val="multilevel"/>
     <w:tmpl w:val="04D49FFA"/>
@@ -12338,7 +14023,7 @@
       </w:rPr>
     </w:lvl>
   </w:abstractNum>
-  <w:abstractNum w:abstractNumId="24" w15:restartNumberingAfterBreak="0">
+  <w:abstractNum w:abstractNumId="27" w15:restartNumberingAfterBreak="0">
     <w:nsid w:val="7F5D5E29"/>
     <w:multiLevelType w:val="multilevel"/>
     <w:tmpl w:val="0514394C"/>
@@ -12491,75 +14176,84 @@
     <w:abstractNumId w:val="2"/>
   </w:num>
   <w:num w:numId="2">
+    <w:abstractNumId w:val="16"/>
+  </w:num>
+  <w:num w:numId="3">
+    <w:abstractNumId w:val="6"/>
+  </w:num>
+  <w:num w:numId="4">
+    <w:abstractNumId w:val="22"/>
+  </w:num>
+  <w:num w:numId="5">
+    <w:abstractNumId w:val="9"/>
+  </w:num>
+  <w:num w:numId="6">
+    <w:abstractNumId w:val="24"/>
+  </w:num>
+  <w:num w:numId="7">
+    <w:abstractNumId w:val="27"/>
+  </w:num>
+  <w:num w:numId="8">
+    <w:abstractNumId w:val="5"/>
+  </w:num>
+  <w:num w:numId="9">
     <w:abstractNumId w:val="15"/>
   </w:num>
-  <w:num w:numId="3">
-    <w:abstractNumId w:val="5"/>
+  <w:num w:numId="10">
+    <w:abstractNumId w:val="11"/>
   </w:num>
-  <w:num w:numId="4">
-    <w:abstractNumId w:val="19"/>
+  <w:num w:numId="11">
+    <w:abstractNumId w:val="17"/>
   </w:num>
-  <w:num w:numId="5">
+  <w:num w:numId="12">
+    <w:abstractNumId w:val="13"/>
+  </w:num>
+  <w:num w:numId="13">
+    <w:abstractNumId w:val="23"/>
+  </w:num>
+  <w:num w:numId="14">
     <w:abstractNumId w:val="8"/>
   </w:num>
-  <w:num w:numId="6">
-    <w:abstractNumId w:val="21"/>
+  <w:num w:numId="15">
+    <w:abstractNumId w:val="26"/>
   </w:num>
-  <w:num w:numId="7">
-    <w:abstractNumId w:val="24"/>
-  </w:num>
-  <w:num w:numId="8">
-    <w:abstractNumId w:val="4"/>
-  </w:num>
-  <w:num w:numId="9">
+  <w:num w:numId="16">
     <w:abstractNumId w:val="14"/>
   </w:num>
-  <w:num w:numId="10">
-    <w:abstractNumId w:val="10"/>
-  </w:num>
-  <w:num w:numId="11">
-    <w:abstractNumId w:val="16"/>
-  </w:num>
-  <w:num w:numId="12">
-    <w:abstractNumId w:val="12"/>
-  </w:num>
-  <w:num w:numId="13">
-    <w:abstractNumId w:val="20"/>
-  </w:num>
-  <w:num w:numId="14">
+  <w:num w:numId="17">
     <w:abstractNumId w:val="7"/>
   </w:num>
-  <w:num w:numId="15">
-    <w:abstractNumId w:val="23"/>
-  </w:num>
-  <w:num w:numId="16">
-    <w:abstractNumId w:val="13"/>
-  </w:num>
-  <w:num w:numId="17">
-    <w:abstractNumId w:val="6"/>
-  </w:num>
   <w:num w:numId="18">
-    <w:abstractNumId w:val="22"/>
+    <w:abstractNumId w:val="25"/>
   </w:num>
   <w:num w:numId="19">
-    <w:abstractNumId w:val="17"/>
+    <w:abstractNumId w:val="18"/>
   </w:num>
   <w:num w:numId="20">
-    <w:abstractNumId w:val="11"/>
+    <w:abstractNumId w:val="12"/>
   </w:num>
   <w:num w:numId="21">
     <w:abstractNumId w:val="1"/>
   </w:num>
   <w:num w:numId="22">
-    <w:abstractNumId w:val="9"/>
+    <w:abstractNumId w:val="10"/>
   </w:num>
   <w:num w:numId="23">
     <w:abstractNumId w:val="0"/>
   </w:num>
   <w:num w:numId="24">
-    <w:abstractNumId w:val="18"/>
+    <w:abstractNumId w:val="21"/>
   </w:num>
   <w:num w:numId="25">
+    <w:abstractNumId w:val="4"/>
+  </w:num>
+  <w:num w:numId="26">
+    <w:abstractNumId w:val="19"/>
+  </w:num>
+  <w:num w:numId="27">
+    <w:abstractNumId w:val="20"/>
+  </w:num>
+  <w:num w:numId="28">
     <w:abstractNumId w:val="3"/>
   </w:num>
 </w:numbering>

</xml_diff>